<commit_message>
Umetnute LaTeX formule u poglavljima 2, 3 i 4 te uklonjeni prazni naslovi
</commit_message>
<xml_diff>
--- a/zavrsni_rad.docx
+++ b/zavrsni_rad.docx
@@ -158,7 +158,6 @@
         </w:rPr>
         <w:t>2331</w:t>
       </w:r>
-      <w:bookmarkEnd w:id="2"/>
     </w:p>
     <w:p>
       <w:pPr>
@@ -195,14 +194,14 @@
         <w:spacing w:before="538"/>
         <w:ind w:left="0"/>
       </w:pPr>
-      <w:bookmarkStart w:id="3" w:name="_Toc231977391"/>
+      <w:bookmarkStart w:id="2" w:name="_Toc231977391"/>
       <w:r>
         <w:rPr>
           <w:spacing w:val="-7"/>
         </w:rPr>
         <w:t>Tea Poplašen</w:t>
       </w:r>
-      <w:bookmarkEnd w:id="3"/>
+      <w:bookmarkEnd w:id="2"/>
     </w:p>
     <w:p>
       <w:pPr>
@@ -221,7 +220,6 @@
           <w:w w:val="90"/>
         </w:rPr>
       </w:pPr>
-      <w:bookmarkStart w:id="4" w:name="_Toc231977392"/>
       <w:r>
         <w:rPr>
           <w:w w:val="90"/>
@@ -275,8 +273,8 @@
         </w:rPr>
         <w:t>.</w:t>
       </w:r>
-      <w:bookmarkStart w:id="5" w:name="_Toc231977393"/>
-      <w:bookmarkEnd w:id="4"/>
+      <w:bookmarkStart w:id="4" w:name="_Toc231977393"/>
+      <w:bookmarkEnd w:id="3"/>
     </w:p>
     <w:p>
       <w:pPr>
@@ -292,6 +290,7 @@
           <w:szCs w:val="19"/>
           <w:lang w:val="bs"/>
         </w:rPr>
+        <w:lastRenderedPageBreak/>
         <w:t>SVEUČILIŠTE</w:t>
       </w:r>
       <w:r>
@@ -341,7 +340,7 @@
         </w:rPr>
         <w:t>ZAGREBU</w:t>
       </w:r>
-      <w:bookmarkEnd w:id="5"/>
+      <w:bookmarkEnd w:id="4"/>
     </w:p>
     <w:p>
       <w:pPr>
@@ -860,7 +859,7 @@
           <w:lang w:val="bs"/>
         </w:rPr>
       </w:pPr>
-      <w:bookmarkStart w:id="6" w:name="_Toc231977394"/>
+      <w:bookmarkStart w:id="5" w:name="_Toc231977394"/>
       <w:r>
         <w:rPr>
           <w:rFonts w:ascii="Microsoft Sans Serif" w:eastAsia="Arial" w:hAnsi="Microsoft Sans Serif" w:cs="Arial"/>
@@ -1055,7 +1054,7 @@
         </w:rPr>
         <w:t>učenja</w:t>
       </w:r>
-      <w:bookmarkEnd w:id="6"/>
+      <w:bookmarkEnd w:id="5"/>
     </w:p>
     <w:p>
       <w:pPr>
@@ -1281,9 +1280,9 @@
           <w:b w:val="0"/>
           <w:spacing w:val="-2"/>
         </w:rPr>
+        <w:lastRenderedPageBreak/>
         <w:t>Sažetak</w:t>
       </w:r>
-      <w:bookmarkEnd w:id="7"/>
       <w:proofErr w:type="spellEnd"/>
     </w:p>
     <w:p>
@@ -1308,7 +1307,7 @@
           <w:szCs w:val="28"/>
         </w:rPr>
       </w:pPr>
-      <w:bookmarkStart w:id="8" w:name="_Toc231977396"/>
+      <w:bookmarkStart w:id="6" w:name="_Toc231977396"/>
       <w:proofErr w:type="spellStart"/>
       <w:r>
         <w:rPr>
@@ -1437,7 +1436,7 @@
         </w:rPr>
         <w:t>učenja</w:t>
       </w:r>
-      <w:bookmarkEnd w:id="8"/>
+      <w:bookmarkEnd w:id="6"/>
       <w:proofErr w:type="spellEnd"/>
     </w:p>
     <w:p>
@@ -1445,14 +1444,14 @@
         <w:pStyle w:val="Naslov3"/>
         <w:spacing w:before="376"/>
       </w:pPr>
-      <w:bookmarkStart w:id="9" w:name="_Toc231977397"/>
+      <w:bookmarkStart w:id="7" w:name="_Toc231977397"/>
       <w:r>
         <w:rPr>
           <w:spacing w:val="-7"/>
         </w:rPr>
         <w:t>Tea Poplašen</w:t>
       </w:r>
-      <w:bookmarkEnd w:id="9"/>
+      <w:bookmarkEnd w:id="7"/>
     </w:p>
     <w:p>
       <w:pPr>
@@ -1652,11 +1651,11 @@
           <w:b w:val="0"/>
         </w:rPr>
       </w:pPr>
-      <w:bookmarkStart w:id="10" w:name="Abstract"/>
-      <w:bookmarkStart w:id="11" w:name="_bookmark1"/>
-      <w:bookmarkStart w:id="12" w:name="_Toc231977398"/>
-      <w:bookmarkEnd w:id="10"/>
-      <w:bookmarkEnd w:id="11"/>
+      <w:bookmarkStart w:id="8" w:name="Abstract"/>
+      <w:bookmarkStart w:id="9" w:name="_bookmark1"/>
+      <w:bookmarkStart w:id="10" w:name="_Toc231977398"/>
+      <w:bookmarkEnd w:id="8"/>
+      <w:bookmarkEnd w:id="9"/>
       <w:r>
         <w:rPr>
           <w:b w:val="0"/>
@@ -1665,7 +1664,7 @@
         <w:lastRenderedPageBreak/>
         <w:t>Abstract</w:t>
       </w:r>
-      <w:bookmarkEnd w:id="12"/>
+      <w:bookmarkEnd w:id="10"/>
     </w:p>
     <w:p>
       <w:pPr>
@@ -1683,22 +1682,22 @@
           <w:b w:val="0"/>
         </w:rPr>
       </w:pPr>
-      <w:bookmarkStart w:id="13" w:name="_Toc231977399"/>
+      <w:bookmarkStart w:id="11" w:name="_Toc231977399"/>
       <w:r>
         <w:t>Classification of Short-Term Stock Price Movements Using Machine Learning</w:t>
       </w:r>
-      <w:bookmarkEnd w:id="13"/>
+      <w:bookmarkEnd w:id="11"/>
     </w:p>
     <w:p>
       <w:pPr>
         <w:pStyle w:val="Naslov3"/>
         <w:spacing w:before="376"/>
       </w:pPr>
-      <w:bookmarkStart w:id="14" w:name="_Toc231977400"/>
+      <w:bookmarkStart w:id="12" w:name="_Toc231977400"/>
       <w:r>
         <w:t>Tea Poplašen</w:t>
       </w:r>
-      <w:bookmarkEnd w:id="14"/>
+      <w:bookmarkEnd w:id="12"/>
     </w:p>
     <w:p>
       <w:pPr>
@@ -7354,15 +7353,7 @@
           <w:sz w:val="24"/>
           <w:lang w:val="hr-HR"/>
         </w:rPr>
-        <w:t xml:space="preserve">Što se tiče tradicionalnih statističkih pristupa, ARIMA modeli dugo su bili standard u analizi vremenskih serija i financijskom predviđanju. Njihov glavni nedostatak je pretpostavka linearnosti, zbog koje se slabo snalaze s kaotičnom i </w:t>
-      </w:r>
-      <w:r>
-        <w:rPr>
-          <w:sz w:val="24"/>
-          <w:lang w:val="hr-HR"/>
-        </w:rPr>
-        <w:lastRenderedPageBreak/>
-        <w:t>nelinearnom prirodom dioničkog tržišta. GARCH modeli s druge strane dobro opisuju promjenjivost volatilnosti kroz vrijeme, ali nisu dizajnirani za predviđanje smjera kretanja cijena, što ih čini ograničeno korisnima u ovom kontekstu.</w:t>
+        <w:t>Što se tiče tradicionalnih statističkih pristupa, ARIMA modeli dugo su bili standard u analizi vremenskih serija i financijskom predviđanju. Njihov glavni nedostatak je pretpostavka linearnosti, zbog koje se slabo snalaze s kaotičnom i nelinearnom prirodom dioničkog tržišta. GARCH modeli s druge strane dobro opisuju promjenjivost volatilnosti kroz vrijeme, ali nisu dizajnirani za predviđanje smjera kretanja cijena, što ih čini ograničeno korisnima u ovom kontekstu.</w:t>
       </w:r>
     </w:p>
     <w:p>
@@ -9665,9 +9656,32 @@
         <w:pStyle w:val="Naslov2"/>
         <w:jc w:val="left"/>
       </w:pPr>
-      <w:bookmarkStart w:id="15" w:name="_Toc231977403"/>
-      <w:r>
-        <w:t xml:space="preserve">2.1. Teorijska podloga tržišta kapitala </w:t>
+      <w:r>
+        <w:t xml:space="preserve">2.1. Teorijska </w:t>
+      </w:r>
+      <w:proofErr w:type="spellStart"/>
+      <w:r>
+        <w:t>podloga</w:t>
+      </w:r>
+      <w:proofErr w:type="spellEnd"/>
+      <w:r>
+        <w:t xml:space="preserve"> </w:t>
+      </w:r>
+      <w:proofErr w:type="spellStart"/>
+      <w:r>
+        <w:t>tržišta</w:t>
+      </w:r>
+      <w:proofErr w:type="spellEnd"/>
+      <w:r>
+        <w:t xml:space="preserve"> </w:t>
+      </w:r>
+      <w:proofErr w:type="spellStart"/>
+      <w:r>
+        <w:t>kapitala</w:t>
+      </w:r>
+      <w:proofErr w:type="spellEnd"/>
+      <w:r>
+        <w:t xml:space="preserve"> </w:t>
       </w:r>
       <w:proofErr w:type="spellStart"/>
       <w:r>
@@ -9697,7 +9711,7 @@
       <w:r>
         <w:t>tržišta</w:t>
       </w:r>
-      <w:bookmarkEnd w:id="15"/>
+      <w:bookmarkEnd w:id="13"/>
       <w:proofErr w:type="spellEnd"/>
     </w:p>
     <w:p>
@@ -9786,7 +9800,39 @@
           <w:sz w:val="24"/>
           <w:szCs w:val="24"/>
         </w:rPr>
-        <w:t xml:space="preserve"> kretanja cijena dionica predstavlja temelj za razvoj bilo kojeg prediktivnog modela. Jedan od najutjecajnijih teorijskih okvira u modernoj financijskoj ekonomiji je Hipoteza efikasnog tržišta (Efficient Market Hypothesis - EMH), koju je 1970. godine formalizirao Eugene Fama [2]. Prema ovoj hipotezi, financijsko tržište je informacijski efikasno ako trenutne cijene financijskih instrumenata u potpunosti odražavaju sve dostupne informacije. Iz toga proizlazi ključna implikacija: investitori ne mogu konzistentno ostvarivati natprosječne prinose (alfa) koji bi nadmašili tržišni prosjek prilagođen riziku, jer se svaka nova informacija trenutno i bez </w:t>
+        <w:t xml:space="preserve"> kretanja cijena dionica predstavlja temelj za razvoj bilo kojeg prediktivnog modela. Jedan od najutjecajnijih teorijskih okvira u modernoj financijskoj ekonomiji je Hipoteza efikasnog tržišta (Efficient Market Hypothesis - EMH), koju je 1970. godine formalizirao Eugene Fama [2]. Prema ovoj hipotezi, financijsko tržište je informacijski efikasno ako trenutne cijene financijskih instrumenata u potpunosti odražavaju sve dostupne informacije. Iz toga proizlazi ključna implikacija: investitori ne mogu konzistentno ostvarivati natprosječne prinose (alfa) koji bi nadmašili tržišni prosjek prilagođen riziku, jer se svaka nova informacija </w:t>
+      </w:r>
+      <w:proofErr w:type="spellStart"/>
+      <w:r>
+        <w:rPr>
+          <w:sz w:val="24"/>
+          <w:szCs w:val="24"/>
+        </w:rPr>
+        <w:t>trenutno</w:t>
+      </w:r>
+      <w:proofErr w:type="spellEnd"/>
+      <w:r>
+        <w:rPr>
+          <w:sz w:val="24"/>
+          <w:szCs w:val="24"/>
+        </w:rPr>
+        <w:t xml:space="preserve"> </w:t>
+      </w:r>
+      <w:proofErr w:type="spellStart"/>
+      <w:r>
+        <w:rPr>
+          <w:sz w:val="24"/>
+          <w:szCs w:val="24"/>
+        </w:rPr>
+        <w:t>i</w:t>
+      </w:r>
+      <w:proofErr w:type="spellEnd"/>
+      <w:r>
+        <w:rPr>
+          <w:sz w:val="24"/>
+          <w:szCs w:val="24"/>
+        </w:rPr>
+        <w:t xml:space="preserve"> bez </w:t>
       </w:r>
       <w:proofErr w:type="spellStart"/>
       <w:r>
@@ -9907,7 +9953,39 @@
           <w:sz w:val="24"/>
           <w:szCs w:val="24"/>
         </w:rPr>
-        <w:t xml:space="preserve"> efikasnosti tržišta, ovisno o </w:t>
+        <w:t xml:space="preserve"> efikasnosti </w:t>
+      </w:r>
+      <w:proofErr w:type="spellStart"/>
+      <w:r>
+        <w:rPr>
+          <w:sz w:val="24"/>
+          <w:szCs w:val="24"/>
+        </w:rPr>
+        <w:t>tržišta</w:t>
+      </w:r>
+      <w:proofErr w:type="spellEnd"/>
+      <w:r>
+        <w:rPr>
+          <w:sz w:val="24"/>
+          <w:szCs w:val="24"/>
+        </w:rPr>
+        <w:t xml:space="preserve">, </w:t>
+      </w:r>
+      <w:proofErr w:type="spellStart"/>
+      <w:r>
+        <w:rPr>
+          <w:sz w:val="24"/>
+          <w:szCs w:val="24"/>
+        </w:rPr>
+        <w:t>ovisno</w:t>
+      </w:r>
+      <w:proofErr w:type="spellEnd"/>
+      <w:r>
+        <w:rPr>
+          <w:sz w:val="24"/>
+          <w:szCs w:val="24"/>
+        </w:rPr>
+        <w:t xml:space="preserve"> o </w:t>
       </w:r>
       <w:proofErr w:type="spellStart"/>
       <w:r>
@@ -9987,7 +10065,23 @@
           <w:sz w:val="24"/>
           <w:szCs w:val="24"/>
         </w:rPr>
-        <w:t xml:space="preserve"> u cijene:</w:t>
+        <w:t xml:space="preserve"> u </w:t>
+      </w:r>
+      <w:proofErr w:type="spellStart"/>
+      <w:r>
+        <w:rPr>
+          <w:sz w:val="24"/>
+          <w:szCs w:val="24"/>
+        </w:rPr>
+        <w:t>cijene</w:t>
+      </w:r>
+      <w:proofErr w:type="spellEnd"/>
+      <w:r>
+        <w:rPr>
+          <w:sz w:val="24"/>
+          <w:szCs w:val="24"/>
+        </w:rPr>
+        <w:t>:</w:t>
       </w:r>
     </w:p>
     <w:p>
@@ -10046,7 +10140,43 @@
           <w:sz w:val="24"/>
           <w:szCs w:val="24"/>
         </w:rPr>
-        <w:t xml:space="preserve"> da trenutne cijene dionica u potpunosti odražavaju sve povijesne informacije o cijenama i volumenima trgovanja. U tom je okruženju </w:t>
+        <w:t xml:space="preserve"> da </w:t>
+      </w:r>
+      <w:proofErr w:type="spellStart"/>
+      <w:r>
+        <w:rPr>
+          <w:rFonts w:ascii="Times New Roman" w:hAnsi="Times New Roman" w:cs="Times New Roman"/>
+          <w:sz w:val="24"/>
+          <w:szCs w:val="24"/>
+        </w:rPr>
+        <w:t>trenutne</w:t>
+      </w:r>
+      <w:proofErr w:type="spellEnd"/>
+      <w:r>
+        <w:rPr>
+          <w:rFonts w:ascii="Times New Roman" w:hAnsi="Times New Roman" w:cs="Times New Roman"/>
+          <w:sz w:val="24"/>
+          <w:szCs w:val="24"/>
+        </w:rPr>
+        <w:t xml:space="preserve"> cijene dionica u potpunosti odražavaju sve povijesne informacije o cijenama i volumenima trgovanja. U tom je </w:t>
+      </w:r>
+      <w:proofErr w:type="spellStart"/>
+      <w:r>
+        <w:rPr>
+          <w:rFonts w:ascii="Times New Roman" w:hAnsi="Times New Roman" w:cs="Times New Roman"/>
+          <w:sz w:val="24"/>
+          <w:szCs w:val="24"/>
+        </w:rPr>
+        <w:t>okruženju</w:t>
+      </w:r>
+      <w:proofErr w:type="spellEnd"/>
+      <w:r>
+        <w:rPr>
+          <w:rFonts w:ascii="Times New Roman" w:hAnsi="Times New Roman" w:cs="Times New Roman"/>
+          <w:sz w:val="24"/>
+          <w:szCs w:val="24"/>
+        </w:rPr>
+        <w:t xml:space="preserve"> </w:t>
       </w:r>
       <w:proofErr w:type="spellStart"/>
       <w:r>
@@ -10151,7 +10281,97 @@
           <w:sz w:val="24"/>
           <w:szCs w:val="24"/>
         </w:rPr>
-        <w:t xml:space="preserve"> forma efikasnosti: Pretpostavlja da trenutne cijene, osim povijesnih podataka, u potpunosti odražavaju i sve javno dostupne informacije (poput financijskih izvješća, najava </w:t>
+        <w:t xml:space="preserve"> forma </w:t>
+      </w:r>
+      <w:proofErr w:type="spellStart"/>
+      <w:r>
+        <w:rPr>
+          <w:rFonts w:ascii="Times New Roman" w:hAnsi="Times New Roman" w:cs="Times New Roman"/>
+          <w:sz w:val="24"/>
+          <w:szCs w:val="24"/>
+        </w:rPr>
+        <w:t>efikasnosti</w:t>
+      </w:r>
+      <w:proofErr w:type="spellEnd"/>
+      <w:r>
+        <w:rPr>
+          <w:rFonts w:ascii="Times New Roman" w:hAnsi="Times New Roman" w:cs="Times New Roman"/>
+          <w:sz w:val="24"/>
+          <w:szCs w:val="24"/>
+        </w:rPr>
+        <w:t xml:space="preserve">: </w:t>
+      </w:r>
+      <w:proofErr w:type="spellStart"/>
+      <w:r>
+        <w:rPr>
+          <w:rFonts w:ascii="Times New Roman" w:hAnsi="Times New Roman" w:cs="Times New Roman"/>
+          <w:sz w:val="24"/>
+          <w:szCs w:val="24"/>
+        </w:rPr>
+        <w:t>Pretpostavlja</w:t>
+      </w:r>
+      <w:proofErr w:type="spellEnd"/>
+      <w:r>
+        <w:rPr>
+          <w:rFonts w:ascii="Times New Roman" w:hAnsi="Times New Roman" w:cs="Times New Roman"/>
+          <w:sz w:val="24"/>
+          <w:szCs w:val="24"/>
+        </w:rPr>
+        <w:t xml:space="preserve"> da trenutne cijene, osim povijesnih podataka, u potpunosti odražavaju i sve javno dostupne informacije (poput </w:t>
+      </w:r>
+      <w:proofErr w:type="spellStart"/>
+      <w:r>
+        <w:rPr>
+          <w:rFonts w:ascii="Times New Roman" w:hAnsi="Times New Roman" w:cs="Times New Roman"/>
+          <w:sz w:val="24"/>
+          <w:szCs w:val="24"/>
+        </w:rPr>
+        <w:t>financijskih</w:t>
+      </w:r>
+      <w:proofErr w:type="spellEnd"/>
+      <w:r>
+        <w:rPr>
+          <w:rFonts w:ascii="Times New Roman" w:hAnsi="Times New Roman" w:cs="Times New Roman"/>
+          <w:sz w:val="24"/>
+          <w:szCs w:val="24"/>
+        </w:rPr>
+        <w:t xml:space="preserve"> </w:t>
+      </w:r>
+      <w:proofErr w:type="spellStart"/>
+      <w:r>
+        <w:rPr>
+          <w:rFonts w:ascii="Times New Roman" w:hAnsi="Times New Roman" w:cs="Times New Roman"/>
+          <w:sz w:val="24"/>
+          <w:szCs w:val="24"/>
+        </w:rPr>
+        <w:t>izvješća</w:t>
+      </w:r>
+      <w:proofErr w:type="spellEnd"/>
+      <w:r>
+        <w:rPr>
+          <w:rFonts w:ascii="Times New Roman" w:hAnsi="Times New Roman" w:cs="Times New Roman"/>
+          <w:sz w:val="24"/>
+          <w:szCs w:val="24"/>
+        </w:rPr>
+        <w:t xml:space="preserve">, </w:t>
+      </w:r>
+      <w:proofErr w:type="spellStart"/>
+      <w:r>
+        <w:rPr>
+          <w:rFonts w:ascii="Times New Roman" w:hAnsi="Times New Roman" w:cs="Times New Roman"/>
+          <w:sz w:val="24"/>
+          <w:szCs w:val="24"/>
+        </w:rPr>
+        <w:t>najava</w:t>
+      </w:r>
+      <w:proofErr w:type="spellEnd"/>
+      <w:r>
+        <w:rPr>
+          <w:rFonts w:ascii="Times New Roman" w:hAnsi="Times New Roman" w:cs="Times New Roman"/>
+          <w:sz w:val="24"/>
+          <w:szCs w:val="24"/>
+        </w:rPr>
+        <w:t xml:space="preserve"> </w:t>
       </w:r>
       <w:proofErr w:type="spellStart"/>
       <w:r>
@@ -10321,7 +10541,6 @@
         <w:jc w:val="left"/>
       </w:pPr>
       <w:r>
-        <w:lastRenderedPageBreak/>
         <w:t xml:space="preserve">2.2. Metode </w:t>
       </w:r>
       <w:proofErr w:type="spellStart"/>
@@ -10344,7 +10563,6 @@
       <w:r>
         <w:t>klasifikaciju</w:t>
       </w:r>
-      <w:bookmarkEnd w:id="16"/>
       <w:proofErr w:type="spellEnd"/>
     </w:p>
     <w:p>
@@ -10355,19 +10573,18 @@
           <w:rFonts w:ascii="Arial Black" w:hAnsi="Arial Black"/>
         </w:rPr>
       </w:pPr>
-      <w:bookmarkStart w:id="17" w:name="_Toc231977405"/>
       <w:r>
         <w:rPr>
           <w:rFonts w:ascii="Arial Black" w:hAnsi="Arial Black"/>
         </w:rPr>
-        <w:t xml:space="preserve">2.2.1. </w:t>
+        <w:t>2.2.1. L</w:t>
       </w:r>
       <w:proofErr w:type="spellStart"/>
       <w:r>
         <w:rPr>
           <w:rFonts w:ascii="Arial Black" w:hAnsi="Arial Black"/>
         </w:rPr>
-        <w:t>Logistička</w:t>
+        <w:t>ogistička</w:t>
       </w:r>
       <w:proofErr w:type="spellEnd"/>
       <w:r>
@@ -10383,110 +10600,58 @@
         </w:rPr>
         <w:t>regresija</w:t>
       </w:r>
-      <w:bookmarkEnd w:id="17"/>
-      <w:proofErr w:type="spellEnd"/>
-    </w:p>
-    <w:p>
-      <w:pPr>
-        <w:jc w:val="both"/>
-        <w:rPr>
-          <w:sz w:val="24"/>
-          <w:szCs w:val="24"/>
-        </w:rPr>
-      </w:pPr>
-      <w:r>
-        <w:rPr>
-          <w:sz w:val="24"/>
-          <w:szCs w:val="24"/>
-        </w:rPr>
-        <w:t>Logistička regresija je klasični statistički model koji se koristi za rješavanje problema klasifikacije [7]. U ovom radu koristi se za binarnu klasifikaciju gdje je cilj predvidjeti pripada li kretanje dionice klasi 1 (rast cijene) ili klasi 0 (pad cijene). Model započinje linearnom kombinacijom ulaznih značajki (tehničkih indikatora) x_1, x_2, ..., x_n i pripadajućih težina w_1, w_2, ..., w_n:</w:t>
-      </w:r>
-      <w:r>
-        <w:rPr>
-          <w:sz w:val="24"/>
-          <w:szCs w:val="24"/>
-        </w:rPr>
+      <w:bookmarkEnd w:id="14"/>
+      <w:proofErr w:type="spellEnd"/>
+    </w:p>
+    <w:p>
+      <w:pPr/>
+      <w:r>
+        <w:t>Logistička regresija je klasični statistički model koji se široko koristi u problemima klasifikacije [7]. U ovom radu koristi se za binarnu klasifikaciju gdje je cilj predvidjeti pripada li kretanje dionice klasi $1$ (rast cijene) ili klasi $0$ (pad cijene).</w:t>
         <w:br/>
-        <w:t>z = w_0 + w_1 x_1 + w_2 x_2 + ... + w_n x_n = w^T x</w:t>
-      </w:r>
-      <w:r>
-        <w:rPr>
-          <w:sz w:val="24"/>
-          <w:szCs w:val="24"/>
-        </w:rPr>
+        <w:t>Model započinje linearnom kombinacijom ulaznih značajki (tehničkih i makroekonomskih indikatora) $\mathbf{x} = [x_1, x_2, \dots, x_n]^T$ i pripadajućih težina (parametara modela) $\mathbf{w} = [w_1, w_2, \dots, w_n]^T$, što se može zapisati kao:</w:t>
+      </w:r>
+    </w:p>
+    <w:p>
+      <w:pPr/>
+      <w:r>
+        <w:t>$$z = w_0 + w_1 x_1 + w_2 x_2 + \dots + w_n x_n = \mathbf{w}^T \mathbf{x} + w_0$$</w:t>
+      </w:r>
+    </w:p>
+    <w:p>
+      <w:pPr/>
+      <w:r>
+        <w:t>gdje je $w_0$ slobodni član (bias) koji omogućuje pomicanje granice odlučivanja neovisno o vrijednostima značajki. Kako bi se linearni izlaz $z$, koji može poprimiti bilo koju realnu vrijednost na intervalu $(-\infty, +\infty)$, preslikao u vjerojatnost $\hat{y} \in [0, 1]$ da dionica pripada klasi $1$, primjenjuje se nelinearna sigmoidna (logistička) funkcija $\sigma(z)$:</w:t>
+      </w:r>
+    </w:p>
+    <w:p>
+      <w:pPr/>
+      <w:r>
+        <w:t>$$\sigma(z) = \frac{1}{1 + e^{-z}}$$</w:t>
+      </w:r>
+    </w:p>
+    <w:p>
+      <w:pPr/>
+      <w:r>
+        <w:t>Sigmoidna funkcija ima karakterističan oblik slova "S" i asimptotski teži prema $0$ za izrazito negativne vrijednosti $z$, odnosno prema $1$ za izrazito pozitivne vrijednosti. Vrijednost $\sigma(0) = 0.5$ predstavlja standardni prag klasifikacije. Tijekom treniranja modela, optimalne težine $\mathbf{w}$ i slobodni član $w_0$ pronalaze se minimiziranjem funkcije gubitka binarne unakrsne entropije (Binary Cross-Entropy Loss) na trening skupu:</w:t>
+      </w:r>
+    </w:p>
+    <w:p>
+      <w:pPr/>
+      <w:r>
+        <w:t>$$\mathcal{L}(\mathbf{w}, w_0) = -\frac{1}{N} \sum_{i=1}^{N} \left[ y_i \log(\hat{y}_i) + (1 - y_i) \log(1 - \hat{y}_i) \right]$$</w:t>
+      </w:r>
+    </w:p>
+    <w:p>
+      <w:pPr/>
+      <w:r>
+        <w:t>gdje je $N$ ukupni broj uzoraka u trening skupu, $y_i \in \{0, 1\}$ stvarna klasifikacijska oznaka za $i$-ti dan, a $\hat{y}_i = \sigma(\mathbf{w}^T \mathbf{x}_i + w_0)$ vjerojatnost rasta predviđena od strane modela. Minimizacija se provodi numeričkim algoritmima optimizacije, a u ovom radu dodana je i $L_2$ regularizacija (Ridge regularizacija) kako bi se penalizirale prevelike težine i spriječila prenaučenost na šumovitim podacima vremenskih serija dionica.</w:t>
         <w:br/>
-        <w:t>gdje je w_0 slobodni član (bias). Kako bi se linearni izlaz z pretvorio u vjerojatnost, primjenjuje se sigmoidna (logistička) funkcija:</w:t>
-      </w:r>
-      <w:r>
-        <w:rPr>
-          <w:sz w:val="24"/>
-          <w:szCs w:val="24"/>
-        </w:rPr>
-        <w:br/>
-        <w:t>sigma(z) = 1 / (1 + e^-z)</w:t>
-      </w:r>
-    </w:p>
-    <w:p>
-      <w:pPr>
-        <w:jc w:val="both"/>
-        <w:rPr>
-          <w:sz w:val="24"/>
-          <w:szCs w:val="24"/>
-        </w:rPr>
-      </w:pPr>
-      <w:r>
-        <w:rPr>
-          <w:sz w:val="24"/>
-          <w:szCs w:val="24"/>
-        </w:rPr>
-        <w:t>Tijekom treniranja, optimalne težine w pronalaze se minimiziranjem funkcije gubitka binarne unakrsne entropije:</w:t>
-      </w:r>
-      <w:r>
-        <w:rPr>
-          <w:sz w:val="24"/>
-          <w:szCs w:val="24"/>
-        </w:rPr>
-        <w:br/>
-        <w:t>L(w) = -1/N * sum_{i=1}^N [ y_i log(hat_y_i) + (1 - y_i) log(1 - hat_y_i) ]</w:t>
-      </w:r>
-      <w:r>
-        <w:rPr>
-          <w:sz w:val="24"/>
-          <w:szCs w:val="24"/>
-        </w:rPr>
-        <w:br/>
-        <w:t>gdje je N broj uzoraka, y_i stvarna klasa (0 ili 1), a hat_y_i predviđena vjerojatnost.</w:t>
-      </w:r>
-    </w:p>
-    <w:p>
-      <w:pPr>
-        <w:jc w:val="both"/>
-        <w:rPr>
-          <w:sz w:val="24"/>
-          <w:szCs w:val="24"/>
-        </w:rPr>
-      </w:pPr>
-      <w:r>
-        <w:rPr>
-          <w:sz w:val="24"/>
-          <w:szCs w:val="24"/>
-        </w:rPr>
-        <w:t>Logistička regresija služi kao bazni model (baseline) jer je izrazito brza za treniranje, stabilna i interpretabilna – predznaci i iznosi koeficijenata w izravno ukazuju na smjer i snagu utjecaja pojedinog tehničkog indikatora. Međutim, model je osjetljiv na skalu ulaznih podataka, zbog čega je standardizacija značajki (korištenjem klase ManualStandardScaler) nužna.</w:t>
-      </w:r>
-    </w:p>
-    <w:p>
-      <w:pPr>
-        <w:jc w:val="both"/>
-        <w:rPr>
-          <w:sz w:val="24"/>
-          <w:szCs w:val="24"/>
-        </w:rPr>
-      </w:pPr>
-      <w:r>
-        <w:rPr>
-          <w:sz w:val="24"/>
-          <w:szCs w:val="24"/>
-        </w:rPr>
+        <w:t>Logistička regresija služi kao izvrstan bazni model (baseline) jer je izrazito brza za treniranje, stabilna i visoko interpretabilna. Predznaci i iznosi koeficijenata $\mathbf{w}$ izravno ukazuju na smjer i snagu utjecaja pojedinog tehničkog indikatora na predviđanje rasta.</w:t>
+      </w:r>
+    </w:p>
+    <w:p>
+      <w:pPr/>
+      <w:r>
         <w:t>[PREPORUKA ZA SLIKU 2.2: Ovdje umetnuti grafikon sigmoidne funkcije sigma(z) = 1 / (1 + e^-z). Grafikon treba prikazivati osi od -6 do 6 na x-osi, te od 0 do 1 na y-osi, jasno ilustrirajući karakterističnu S-krivulju i njezinu asimptotsku prirodu s prijelomom na točki (0, 0.5).]</w:t>
       </w:r>
     </w:p>
@@ -10504,7 +10669,6 @@
         </w:rPr>
         <w:t>2.2.2. Slučajne šume (Random Forest)</w:t>
       </w:r>
-      <w:bookmarkEnd w:id="18"/>
     </w:p>
     <w:p>
       <w:pPr>
@@ -10514,12 +10678,94 @@
           <w:szCs w:val="24"/>
         </w:rPr>
       </w:pPr>
-      <w:r>
-        <w:rPr>
-          <w:sz w:val="24"/>
-          <w:szCs w:val="24"/>
-        </w:rPr>
-        <w:t>Slučajne šume su ansambl algoritam koji se temelji na kombiniranju velikog broja pojedinačnih stabala odluke [5]. Pojedinačno stablo odluke klasificira podatke rekurzivnim dijeljenjem prostora značajki. Za procjenu kvalitete podjele koristi se Gini nečistoća:</w:t>
+    </w:p>
+    <w:p>
+      <w:pPr>
+        <w:jc w:val="both"/>
+        <w:rPr>
+          <w:sz w:val="24"/>
+          <w:szCs w:val="24"/>
+        </w:rPr>
+      </w:pPr>
+      <w:proofErr w:type="spellStart"/>
+      <w:r>
+        <w:rPr>
+          <w:sz w:val="24"/>
+          <w:szCs w:val="24"/>
+        </w:rPr>
+        <w:t>Slučajne</w:t>
+      </w:r>
+      <w:proofErr w:type="spellEnd"/>
+      <w:r>
+        <w:rPr>
+          <w:sz w:val="24"/>
+          <w:szCs w:val="24"/>
+        </w:rPr>
+        <w:t xml:space="preserve"> </w:t>
+      </w:r>
+      <w:proofErr w:type="spellStart"/>
+      <w:r>
+        <w:rPr>
+          <w:sz w:val="24"/>
+          <w:szCs w:val="24"/>
+        </w:rPr>
+        <w:t>šume</w:t>
+      </w:r>
+      <w:proofErr w:type="spellEnd"/>
+      <w:r>
+        <w:rPr>
+          <w:sz w:val="24"/>
+          <w:szCs w:val="24"/>
+        </w:rPr>
+        <w:t xml:space="preserve"> </w:t>
+      </w:r>
+      <w:proofErr w:type="spellStart"/>
+      <w:r>
+        <w:rPr>
+          <w:sz w:val="24"/>
+          <w:szCs w:val="24"/>
+        </w:rPr>
+        <w:t>su</w:t>
+      </w:r>
+      <w:proofErr w:type="spellEnd"/>
+      <w:r>
+        <w:rPr>
+          <w:sz w:val="24"/>
+          <w:szCs w:val="24"/>
+        </w:rPr>
+        <w:t xml:space="preserve"> </w:t>
+      </w:r>
+      <w:proofErr w:type="spellStart"/>
+      <w:r>
+        <w:rPr>
+          <w:sz w:val="24"/>
+          <w:szCs w:val="24"/>
+        </w:rPr>
+        <w:t>ansambl</w:t>
+      </w:r>
+      <w:proofErr w:type="spellEnd"/>
+      <w:r>
+        <w:rPr>
+          <w:sz w:val="24"/>
+          <w:szCs w:val="24"/>
+        </w:rPr>
+        <w:t xml:space="preserve"> </w:t>
+      </w:r>
+      <w:proofErr w:type="spellStart"/>
+      <w:r>
+        <w:rPr>
+          <w:sz w:val="24"/>
+          <w:szCs w:val="24"/>
+        </w:rPr>
+        <w:t>algoritam</w:t>
+      </w:r>
+      <w:proofErr w:type="spellEnd"/>
+      <w:r>
+        <w:rPr>
+          <w:sz w:val="24"/>
+          <w:szCs w:val="24"/>
+        </w:rPr>
+        <w:t xml:space="preserve"> koji se temelji na kombiniranju velikog broja pojedinačnih stabala odluke [5]. Pojedinačno stablo odluke klasificira podatke rekurzivnim dijeljenjem prostora značajki. Za procjenu kvalitete podjele koristi se Gini nečistoća:</w:t>
       </w:r>
       <w:r>
         <w:rPr>
@@ -10598,10 +10844,8 @@
         <w:rPr>
           <w:rFonts w:ascii="Arial Black" w:hAnsi="Arial Black"/>
         </w:rPr>
-        <w:lastRenderedPageBreak/>
         <w:t>2.2.3. XGBoost (Extreme Gradient Boosting)</w:t>
       </w:r>
-      <w:bookmarkEnd w:id="19"/>
     </w:p>
     <w:p/>
     <w:p>
@@ -10705,7 +10949,55 @@
           <w:sz w:val="24"/>
           <w:szCs w:val="24"/>
         </w:rPr>
-        <w:t xml:space="preserve">U financijskim predviđanjima, XGBoost se pokazao kao jedan od najuspješnijih algoritama na tabličnim podacima zbog ugrađenih mehanizama za regularizaciju koja sprječava da model nauči šumove umjesto stvarnih trendova. Ključni hiperparametri su stopa učenja (learning_rate) i </w:t>
+        <w:t xml:space="preserve">U financijskim predviđanjima, XGBoost se pokazao kao jedan od najuspješnijih algoritama na tabličnim podacima zbog ugrađenih mehanizama za regularizaciju koja sprječava da model nauči šumove umjesto stvarnih trendova. Ključni hiperparametri su stopa </w:t>
+      </w:r>
+      <w:proofErr w:type="spellStart"/>
+      <w:r>
+        <w:rPr>
+          <w:sz w:val="24"/>
+          <w:szCs w:val="24"/>
+        </w:rPr>
+        <w:t>učenja</w:t>
+      </w:r>
+      <w:proofErr w:type="spellEnd"/>
+      <w:r>
+        <w:rPr>
+          <w:sz w:val="24"/>
+          <w:szCs w:val="24"/>
+        </w:rPr>
+        <w:t xml:space="preserve"> (</w:t>
+      </w:r>
+      <w:proofErr w:type="spellStart"/>
+      <w:r>
+        <w:rPr>
+          <w:sz w:val="24"/>
+          <w:szCs w:val="24"/>
+        </w:rPr>
+        <w:t>learning_rate</w:t>
+      </w:r>
+      <w:proofErr w:type="spellEnd"/>
+      <w:r>
+        <w:rPr>
+          <w:sz w:val="24"/>
+          <w:szCs w:val="24"/>
+        </w:rPr>
+        <w:t xml:space="preserve">) </w:t>
+      </w:r>
+      <w:proofErr w:type="spellStart"/>
+      <w:r>
+        <w:rPr>
+          <w:sz w:val="24"/>
+          <w:szCs w:val="24"/>
+        </w:rPr>
+        <w:t>i</w:t>
+      </w:r>
+      <w:proofErr w:type="spellEnd"/>
+      <w:r>
+        <w:rPr>
+          <w:sz w:val="24"/>
+          <w:szCs w:val="24"/>
+        </w:rPr>
+        <w:t xml:space="preserve"> </w:t>
       </w:r>
       <w:proofErr w:type="spellStart"/>
       <w:r>
@@ -10789,14 +11081,15 @@
           <w:rFonts w:ascii="Arial Black" w:hAnsi="Arial Black"/>
         </w:rPr>
       </w:pPr>
-      <w:bookmarkStart w:id="20" w:name="_Toc231977408"/>
+      <w:bookmarkStart w:id="15" w:name="_Toc231977408"/>
       <w:r>
         <w:rPr>
           <w:rFonts w:ascii="Arial Black" w:hAnsi="Arial Black"/>
         </w:rPr>
+        <w:lastRenderedPageBreak/>
         <w:t>2.2.4. Duboko učenje i rekurentne neuronske mreže (RNN)</w:t>
       </w:r>
-      <w:bookmarkEnd w:id="20"/>
+      <w:bookmarkEnd w:id="15"/>
     </w:p>
     <w:p>
       <w:pPr>
@@ -10863,263 +11156,78 @@
           <w:rFonts w:ascii="Arial Black" w:hAnsi="Arial Black"/>
         </w:rPr>
       </w:pPr>
-      <w:bookmarkStart w:id="21" w:name="_Toc231977409"/>
+      <w:bookmarkStart w:id="16" w:name="_Toc231977409"/>
       <w:r>
         <w:rPr>
           <w:rFonts w:ascii="Arial Black" w:hAnsi="Arial Black"/>
         </w:rPr>
         <w:t>2.2.5. Mreže s dugom kratkoročnom memorijom (LSTM)</w:t>
       </w:r>
-      <w:bookmarkEnd w:id="21"/>
-    </w:p>
-    <w:p>
-      <w:pPr>
-        <w:jc w:val="both"/>
-        <w:rPr>
-          <w:sz w:val="24"/>
-          <w:szCs w:val="24"/>
-        </w:rPr>
-      </w:pPr>
-      <w:r>
-        <w:rPr>
-          <w:sz w:val="24"/>
-          <w:szCs w:val="24"/>
-        </w:rPr>
-        <w:t>LSTM mreže predstavljaju specijaliziranu arhitekturu rekurentnih neuronskih mreža dizajniranu za rješavanje problema nestajućeg gradijenta [8]. LSTM to postiže uvođenjem stanja ćelije (cell state, C_t) koje prolazi kroz cijelu sekvencu uz minimalne linearne interakcije, te tri vrste vrata (gates):</w:t>
-      </w:r>
-      <w:r>
-        <w:rPr>
-          <w:sz w:val="24"/>
-          <w:szCs w:val="24"/>
-        </w:rPr>
+      <w:bookmarkEnd w:id="16"/>
+    </w:p>
+    <w:p>
+      <w:pPr/>
+      <w:r>
+        <w:t>LSTM (Long Short-Term Memory) neuronske mreže predstavljaju specijaliziranu arhitekturu rekurentnih neuronskih mreža (RNN) posebno dizajniranu za rješavanje problema nestajućeg i eksplodirajućeg gradijenta pri učenju dugoročnih ovisnosti u sekvencijalnim podacima [8]. Standardni RNN modeli pate od eksponencijalnog slabljenja gradijenta kroz vrijeme, što ih onemogućuje u pamćenju uzoraka iz duljih vremenskih serija. LSTM to rješava uvođenjem stanja ćelije (cell state, $C_t$) koje djeluje kao svojevrsna 'trkaća staza' kroz koju informacije mogu teći bez promjene, uz minimalne linearne interakcije.</w:t>
         <w:br/>
-        <w:t xml:space="preserve">1. Zaboravna vrata (Forget Gate, f_t): f_t = </w:t>
-      </w:r>
-      <w:proofErr w:type="gramStart"/>
-      <w:r>
-        <w:rPr>
-          <w:sz w:val="24"/>
-          <w:szCs w:val="24"/>
-        </w:rPr>
-        <w:t>sigma(</w:t>
-      </w:r>
-      <w:proofErr w:type="gramEnd"/>
-      <w:r>
-        <w:rPr>
-          <w:sz w:val="24"/>
-          <w:szCs w:val="24"/>
-        </w:rPr>
-        <w:t>W_f * [h_{t-1}, x_t] + b_f)</w:t>
-      </w:r>
-      <w:r>
-        <w:rPr>
-          <w:sz w:val="24"/>
-          <w:szCs w:val="24"/>
-        </w:rPr>
+        <w:t>Protok informacija unutar LSTM ćelije u svakom vremenskom koraku $t$ kontroliraju tri vrste vrata (gates) i kandidat stanja ćelije, čija se matematika temelji na sljedećim jednadžbama:</w:t>
+      </w:r>
+    </w:p>
+    <w:p>
+      <w:pPr/>
+      <w:r>
+        <w:t>1. Zaboravna vrata (Forget Gate, $f_t$): Odlučuju koje će se informacije iz prethodnog stanja ćelije $C_{t-1}$ odbaciti, a koje zadržati:</w:t>
         <w:br/>
-        <w:t xml:space="preserve">2. Ulazna vrata (Input Gate, i_t): i_t = </w:t>
-      </w:r>
-      <w:proofErr w:type="gramStart"/>
-      <w:r>
-        <w:rPr>
-          <w:sz w:val="24"/>
-          <w:szCs w:val="24"/>
-        </w:rPr>
-        <w:t>sigma(</w:t>
-      </w:r>
-      <w:proofErr w:type="gramEnd"/>
-      <w:r>
-        <w:rPr>
-          <w:sz w:val="24"/>
-          <w:szCs w:val="24"/>
-        </w:rPr>
-        <w:t>W_i * [</w:t>
-      </w:r>
-      <w:proofErr w:type="gramStart"/>
-      <w:r>
-        <w:rPr>
-          <w:sz w:val="24"/>
-          <w:szCs w:val="24"/>
-        </w:rPr>
-        <w:t>h_{</w:t>
-      </w:r>
-      <w:proofErr w:type="gramEnd"/>
-      <w:r>
-        <w:rPr>
-          <w:sz w:val="24"/>
-          <w:szCs w:val="24"/>
-        </w:rPr>
-        <w:t>t-</w:t>
-      </w:r>
-      <w:proofErr w:type="gramStart"/>
-      <w:r>
-        <w:rPr>
-          <w:sz w:val="24"/>
-          <w:szCs w:val="24"/>
-        </w:rPr>
-        <w:t>1},</w:t>
-      </w:r>
-      <w:proofErr w:type="gramEnd"/>
-      <w:r>
-        <w:rPr>
-          <w:sz w:val="24"/>
-          <w:szCs w:val="24"/>
-        </w:rPr>
-        <w:t xml:space="preserve"> x_t] + b_i)</w:t>
-      </w:r>
-      <w:r>
-        <w:rPr>
-          <w:sz w:val="24"/>
-          <w:szCs w:val="24"/>
-        </w:rPr>
+        <w:t>$$f_t = \sigma(W_f \cdot [h_{t-1}, x_t] + b_f)$$</w:t>
+      </w:r>
+    </w:p>
+    <w:p>
+      <w:pPr/>
+      <w:r>
+        <w:t>2. Ulazna vrata (Input Gate, $i_t$): Određuju koje će se nove informacije iz trenutnog ulaza $x_t$ i prethodnog skrivenog stanja $h_{t-1}$ pohraniti u stanje ćelije:</w:t>
         <w:br/>
-        <w:t xml:space="preserve">3. Kandidat stanja ćelije (tilde_C_t): tilde_C_t = </w:t>
-      </w:r>
-      <w:proofErr w:type="gramStart"/>
-      <w:r>
-        <w:rPr>
-          <w:sz w:val="24"/>
-          <w:szCs w:val="24"/>
-        </w:rPr>
-        <w:t>tanh(</w:t>
-      </w:r>
-      <w:proofErr w:type="gramEnd"/>
-      <w:r>
-        <w:rPr>
-          <w:sz w:val="24"/>
-          <w:szCs w:val="24"/>
-        </w:rPr>
-        <w:t>W_c * [h_{t-1}, x_t] + b_c)</w:t>
-      </w:r>
-      <w:r>
-        <w:rPr>
-          <w:sz w:val="24"/>
-          <w:szCs w:val="24"/>
-        </w:rPr>
+        <w:t>$$i_t = \sigma(W_i \cdot [h_{t-1}, x_t] + b_i)$$</w:t>
+      </w:r>
+    </w:p>
+    <w:p>
+      <w:pPr/>
+      <w:r>
+        <w:t>3. Kandidat stanja ćelije ($\tilde{C}_t$): Kreira vektor novih kandidatskih vrijednosti koje se mogu dodati stanju ćelije pomoću hiperbolne tangentne funkcije ($\tanh$):</w:t>
         <w:br/>
-        <w:t>4. Ažuriranje stanja ćelije (C_t): C_t = f_t * C_{t-1} + i_t * tilde_C_t</w:t>
-      </w:r>
-      <w:r>
-        <w:rPr>
-          <w:sz w:val="24"/>
-          <w:szCs w:val="24"/>
-        </w:rPr>
+        <w:t>$$\tilde{C}_t = \tanh(W_c \cdot [h_{t-1}, x_t] + b_c)$$</w:t>
+      </w:r>
+    </w:p>
+    <w:p>
+      <w:pPr/>
+      <w:r>
+        <w:t>4. Ažuriranje stanja ćelije ($C_t$): Kombinira staro stanje ćelije pomnoženo s izlazom zaboravnih vrata i novo stanje kandidata pomnoženo s izlazom ulaznih vrata kako bi se dobilo novo stanje ćelije:</w:t>
         <w:br/>
-        <w:t xml:space="preserve">5. Izlazna vrata (Output Gate, o_t): o_t = </w:t>
-      </w:r>
-      <w:proofErr w:type="gramStart"/>
-      <w:r>
-        <w:rPr>
-          <w:sz w:val="24"/>
-          <w:szCs w:val="24"/>
-        </w:rPr>
-        <w:t>sigma(</w:t>
-      </w:r>
-      <w:proofErr w:type="gramEnd"/>
-      <w:r>
-        <w:rPr>
-          <w:sz w:val="24"/>
-          <w:szCs w:val="24"/>
-        </w:rPr>
-        <w:t>W_o * [</w:t>
-      </w:r>
-      <w:proofErr w:type="gramStart"/>
-      <w:r>
-        <w:rPr>
-          <w:sz w:val="24"/>
-          <w:szCs w:val="24"/>
-        </w:rPr>
-        <w:t>h_{</w:t>
-      </w:r>
-      <w:proofErr w:type="gramEnd"/>
-      <w:r>
-        <w:rPr>
-          <w:sz w:val="24"/>
-          <w:szCs w:val="24"/>
-        </w:rPr>
-        <w:t>t-</w:t>
-      </w:r>
-      <w:proofErr w:type="gramStart"/>
-      <w:r>
-        <w:rPr>
-          <w:sz w:val="24"/>
-          <w:szCs w:val="24"/>
-        </w:rPr>
-        <w:t>1},</w:t>
-      </w:r>
-      <w:proofErr w:type="gramEnd"/>
-      <w:r>
-        <w:rPr>
-          <w:sz w:val="24"/>
-          <w:szCs w:val="24"/>
-        </w:rPr>
-        <w:t xml:space="preserve"> x_t] + b_o</w:t>
-      </w:r>
-      <w:proofErr w:type="gramStart"/>
-      <w:r>
-        <w:rPr>
-          <w:sz w:val="24"/>
-          <w:szCs w:val="24"/>
-        </w:rPr>
-        <w:t>),  h</w:t>
-      </w:r>
-      <w:proofErr w:type="gramEnd"/>
-      <w:r>
-        <w:rPr>
-          <w:sz w:val="24"/>
-          <w:szCs w:val="24"/>
-        </w:rPr>
-        <w:t>_t = o_t * tanh(C_t)</w:t>
-      </w:r>
-    </w:p>
-    <w:p>
-      <w:pPr>
-        <w:jc w:val="both"/>
-        <w:rPr>
-          <w:sz w:val="24"/>
-          <w:szCs w:val="24"/>
-        </w:rPr>
-      </w:pPr>
-      <w:r>
-        <w:rPr>
-          <w:sz w:val="24"/>
-          <w:szCs w:val="24"/>
-        </w:rPr>
-        <w:t>U ovom radu, LSTM mreža prima trodimenzionalne tenzore dimenzija [batch_size, 10, 25], pri čemu je prozor povijesti postavljen na lookback = 10 dana, a broj značajki je 25. LSTM na ovaj način uspijeva obraditi dinamiku kretanja cijena kroz 10 uzastopnih dana.</w:t>
-      </w:r>
-    </w:p>
-    <w:p>
-      <w:pPr>
-        <w:jc w:val="both"/>
-        <w:rPr>
-          <w:sz w:val="24"/>
-          <w:szCs w:val="24"/>
-        </w:rPr>
-      </w:pPr>
-      <w:r>
-        <w:rPr>
-          <w:sz w:val="24"/>
-          <w:szCs w:val="24"/>
-        </w:rPr>
-        <w:t xml:space="preserve">[PREPORUKA ZA SLIKU 2.5: Detaljan dijagram unutrašnje strukture LSTM ćelije. Dijagram treba prikazivati tokove stanja ćelije C_t i skrivenog stanja h_t, s tri označena vrata: </w:t>
-      </w:r>
-      <w:r>
-        <w:rPr>
-          <w:sz w:val="24"/>
-          <w:szCs w:val="24"/>
-        </w:rPr>
-        <w:lastRenderedPageBreak/>
-        <w:t>zaboravnim vratima (označenim s f_t i operacijom množenja), ulaznim vratima (označenim s i_t i operacijom zbrajanja) i izlaznim vratima (o_t). Koristiti standardni i prepoznatljivi tehnički dijagram LSTM ćelije.]</w:t>
-      </w:r>
-    </w:p>
-    <w:p>
-      <w:pPr>
-        <w:jc w:val="both"/>
-        <w:rPr>
-          <w:sz w:val="24"/>
-          <w:szCs w:val="24"/>
-        </w:rPr>
-      </w:pPr>
+        <w:t>$$C_t = f_t \cdot C_{t-1} + i_t \cdot \tilde{C}_t$$</w:t>
+      </w:r>
+    </w:p>
+    <w:p>
+      <w:pPr/>
+      <w:r>
+        <w:t>5. Izlazna vrata (Output Gate, $o_t$) i skriveno stanje ($h_t$): Odlučuju što će se točno poslati na izlaz kao skriveno stanje $h_t$ u tekućem koraku:</w:t>
+        <w:br/>
+        <w:t>$$o_t = \sigma(W_o \cdot [h_{t-1}, x_t] + b_o)$$</w:t>
+        <w:br/>
+        <w:t>$$h_t = o_t \cdot \tanh(C_t)$$</w:t>
+      </w:r>
+    </w:p>
+    <w:p>
+      <w:pPr/>
+      <w:r>
+        <w:t>gdje su $W_f, W_i, W_c, W_o$ matrice težina, $b_f, b_i, b_c, b_o$ vektori odstupanja (bias), $x_t$ ulazni vektor u koraku $t$, $h_{t-1}$ skriveno stanje iz prethodnog koraka, $\sigma$ sigmoidna funkcija, a $\cdot$ označava matrično množenje.</w:t>
+        <w:br/>
+        <w:t>U ovom radu, LSTM mreža prima trodimenzionalne tenzore dimenzija $[batch\_size, 10, 25]$, pri čemu je prozor povijesti postavljen na $lookback = 10$ prethodnih trgovačkih dana, a broj ulaznih značajki iznosi $25$. LSTM na ovaj način uspijeva obraditi dinamiku kretanja cijena kroz 10 uzastopnih dana, stvarajući znatno kompleksniji prediktivni signal od klasičnih statičkih modela.</w:t>
+      </w:r>
+    </w:p>
+    <w:p>
+      <w:pPr/>
+      <w:r>
+        <w:t>[PREPORUKA ZA SLIKU 2.5: Detaljan dijagram unutrašnje strukture LSTM ćelije. Dijagram treba prikazivati tokove stanja ćelije C_t i skrivenog stanja h_t, s tri označena vrata: zaboravnim vratima (označenim s f_t i operacijom množenja), ulaznim vratima (označenim s i_t i operacijom zbrajanja) i izlaznim vratima (o_t). Koristiti standardni i prepoznatljivi tehnički dijagram LSTM ćelije.]</w:t>
+      </w:r>
     </w:p>
     <w:p>
       <w:pPr>
@@ -11127,7 +11235,15 @@
         <w:jc w:val="left"/>
       </w:pPr>
       <w:r>
-        <w:t xml:space="preserve">2.3. Financijski </w:t>
+        <w:t xml:space="preserve">2.3. </w:t>
+      </w:r>
+      <w:proofErr w:type="spellStart"/>
+      <w:r>
+        <w:t>Financijski</w:t>
+      </w:r>
+      <w:proofErr w:type="spellEnd"/>
+      <w:r>
+        <w:t xml:space="preserve"> </w:t>
       </w:r>
       <w:proofErr w:type="spellStart"/>
       <w:r>
@@ -11157,7 +11273,6 @@
       <w:r>
         <w:t>pokazatelji</w:t>
       </w:r>
-      <w:bookmarkEnd w:id="22"/>
       <w:proofErr w:type="spellEnd"/>
     </w:p>
     <w:p>
@@ -11168,7 +11283,7 @@
           <w:rFonts w:ascii="Arial Black" w:hAnsi="Arial Black"/>
         </w:rPr>
       </w:pPr>
-      <w:bookmarkStart w:id="23" w:name="_Toc231977411"/>
+      <w:bookmarkStart w:id="17" w:name="_Toc231977411"/>
       <w:r>
         <w:rPr>
           <w:rFonts w:ascii="Arial Black" w:hAnsi="Arial Black"/>
@@ -11217,54 +11332,64 @@
         </w:rPr>
         <w:t xml:space="preserve"> momenta</w:t>
       </w:r>
-      <w:bookmarkEnd w:id="23"/>
-    </w:p>
-    <w:p>
-      <w:pPr>
-        <w:jc w:val="both"/>
-        <w:rPr>
-          <w:sz w:val="24"/>
-          <w:szCs w:val="24"/>
-        </w:rPr>
-      </w:pPr>
-      <w:r>
-        <w:rPr>
-          <w:sz w:val="24"/>
-          <w:szCs w:val="24"/>
-        </w:rPr>
-        <w:t>Ovi indikatori služe za prepoznavanje smjera kretanja tržišta i brzine kojom se ta promjena događa:</w:t>
-      </w:r>
-      <w:r>
-        <w:rPr>
-          <w:sz w:val="24"/>
-          <w:szCs w:val="24"/>
-        </w:rPr>
+      <w:bookmarkEnd w:id="17"/>
+    </w:p>
+    <w:p>
+      <w:pPr/>
+      <w:r>
+        <w:t>Ovi indikatori služe za prepoznavanje smjera kretanja tržišta i brzine (zamaha) kojom se ta promjena događa:</w:t>
         <w:br/>
-        <w:t>- Prinosi (Returns): Predstavljaju postotnu promjenu cijene dionice kroz određeni broj dana (1, 5, 10 i 20 dana). Prinosi su stacionarna vremenska serija.</w:t>
-      </w:r>
-      <w:r>
-        <w:rPr>
-          <w:sz w:val="24"/>
-          <w:szCs w:val="24"/>
-        </w:rPr>
+        <w:t>- Dnevni i povijesni povrati (Returns): Predstavljaju postotnu promjenu cijene dionice kroz određeni broj dana ($k \in \{1, 5, 10, 20\}$). Povrati su stacionarna vremenska serija, što ih čini idealnima za modele strojnog učenja. Računaju se kao:</w:t>
+      </w:r>
+    </w:p>
+    <w:p>
+      <w:pPr/>
+      <w:r>
+        <w:t>$$Return_{k, t} = \frac{Close_t - Close_{t-k}}{Close_{t-k}}$$</w:t>
+      </w:r>
+    </w:p>
+    <w:p>
+      <w:pPr/>
+      <w:r>
+        <w:t>- Jednostavni pomični prosjeci (Simple Moving Averages - SMA): Izračunavaju se kao aritmetička sredina cijena zatvaranja dionice u prošlom razdoblju od $n$ dana ($n \in \{5, 10, 20, 50\}$). Služe za zaglađivanje kratkoročnog šuma i prepoznavanje općeg trenda:</w:t>
+      </w:r>
+    </w:p>
+    <w:p>
+      <w:pPr/>
+      <w:r>
+        <w:t>$$SMA_{n, t} = \frac{1}{n} \sum_{i=0}^{n-1} Close_{t-i}$$</w:t>
+      </w:r>
+    </w:p>
+    <w:p>
+      <w:pPr/>
+      <w:r>
+        <w:t>Nadalje, u ovom radu izračunava se i udaljenost cijene od pomičnih prosjeka (npr. $close\_to\_sma\_20 = Close_t / SMA_{20, t} - 1$) kako bi model dobio informaciju o tome koliko je cijena odstupila od svog prosjeka.</w:t>
         <w:br/>
-        <w:t>- Pomični prosjeci (Simple Moving Averages - SMA): Izračunavaju se kao prosjek cijena u prošlom razdoblju (5, 10, 20 i 50 dana) te služe za prepoznavanje trenda.</w:t>
-      </w:r>
-      <w:r>
-        <w:rPr>
-          <w:sz w:val="24"/>
-          <w:szCs w:val="24"/>
-        </w:rPr>
+        <w:t>- MACD (Moving Average Convergence Divergence): Indikator momenta koji prati trend i pokazuje odnos između dvaju eksponencijalnih pomičnih prosjeka (EMA) cijene. MACD linija dobiva se oduzimanjem 26-dnevnog EMA od 12-dnevnog EMA, a Signalna linija predstavlja 9-dnevni EMA same MACD linije:</w:t>
+      </w:r>
+    </w:p>
+    <w:p>
+      <w:pPr/>
+      <w:r>
+        <w:t>$$MACD_t = EMA_{12, t}(Close) - EMA_{26, t}(Close)$$</w:t>
         <w:br/>
-        <w:t>- MACD (Moving Average Convergence Divergence): Indikator momenta koji prati trend i pokazuje odnos između dvaju eksponencijalnih pomičnih prosjeka (EMA 12 i EMA 26).</w:t>
-      </w:r>
-      <w:r>
-        <w:rPr>
-          <w:sz w:val="24"/>
-          <w:szCs w:val="24"/>
-        </w:rPr>
+        <w:t>$$Signal_t = EMA_{9, t}(MACD)$$</w:t>
+      </w:r>
+    </w:p>
+    <w:p>
+      <w:pPr/>
+      <w:r>
+        <w:t>Razlika između MACD-a i Signalne linije (MACD histogram) izravan je pokazatelj zamaha tržišta.</w:t>
         <w:br/>
-        <w:t>- RSI (Relative Strength Index): Zamahni oscilator koji mjeri brzinu i promjenjivost kretanja cijena u rasponu od 0 do 100, identificirajući prekupljenost (&gt;70) i preprodanost (&lt;30).</w:t>
+        <w:t>- RSI (Relative Strength Index): Zamahni oscilator koji mjeri brzinu i promjenjivost kretanja cijena u rasponu od 0 do 100, identificirajući prekupljenost ($&gt;70$) i preprodanost ($&lt;30$). Računa se na temelju prosječnog rasta ($U$) i prosječnog pada ($D$) u zadanom razdoblju (standardno 14 dana):</w:t>
+      </w:r>
+    </w:p>
+    <w:p>
+      <w:pPr/>
+      <w:r>
+        <w:t>$$RSI_t = 100 - \frac{100}{1 + RS_t}$$</w:t>
+        <w:br/>
+        <w:t>$$RS_t = \frac{\text{Prosječni rast}_t}{\text{Prosječni pad}_t}$$</w:t>
       </w:r>
     </w:p>
     <w:p>
@@ -11330,55 +11455,80 @@
         </w:rPr>
         <w:t>volumena</w:t>
       </w:r>
-      <w:bookmarkEnd w:id="24"/>
-      <w:proofErr w:type="spellEnd"/>
-    </w:p>
-    <w:p>
-      <w:pPr>
-        <w:jc w:val="both"/>
-        <w:rPr>
-          <w:sz w:val="24"/>
-          <w:szCs w:val="24"/>
-        </w:rPr>
-      </w:pPr>
-      <w:r>
-        <w:rPr>
-          <w:sz w:val="24"/>
-          <w:szCs w:val="24"/>
-        </w:rPr>
-        <w:t>Ovi parametri opisuju razinu rizika i aktivnost sudionika na tržištu:</w:t>
-      </w:r>
-      <w:r>
-        <w:rPr>
-          <w:sz w:val="24"/>
-          <w:szCs w:val="24"/>
-        </w:rPr>
+      <w:proofErr w:type="spellEnd"/>
+    </w:p>
+    <w:p>
+      <w:pPr/>
+      <w:r>
+        <w:t>Ovi parametri opisuju razinu rizika, raspon fluktuacije cijena i aktivnost sudionika na tržištu:</w:t>
         <w:br/>
-        <w:t>- Bollingerove trake (Bollinger Bands): Sastoje se od srednje linije (SMA 20) te gornje i donje trake koje su udaljene za dvije standardne devijacije cijene.</w:t>
-      </w:r>
-      <w:r>
-        <w:rPr>
-          <w:sz w:val="24"/>
-          <w:szCs w:val="24"/>
-        </w:rPr>
+        <w:t>- Bollingerove trake (Bollinger Bands): Sastoje se od srednje linije ($SMA_{20}$) te gornje i donje trake koje su udaljene za dvije standardne devijacije ($\sigma_{20}$) cijene zatvaranja u zadnjih 20 dana. Bollingerove trake se šire u razdobljima visoke volatilnosti, a skupljaju u mirnim razdobljima:</w:t>
+      </w:r>
+    </w:p>
+    <w:p>
+      <w:pPr/>
+      <w:r>
+        <w:t>$$\text{Srednja traka}_t = SMA_{20, t}$$</w:t>
         <w:br/>
-        <w:t>- ATR (Average True Range): Mjera volatilnosti koja pokazuje prosječan raspon kretanja cijene dionice unutar trgovačkog dana.</w:t>
-      </w:r>
-      <w:r>
-        <w:rPr>
-          <w:sz w:val="24"/>
-          <w:szCs w:val="24"/>
-        </w:rPr>
+        <w:t>$$\text{Gornja traka}_t = SMA_{20, t} + 2 \cdot \sigma_{20, t}$$</w:t>
         <w:br/>
-        <w:t>- Povijesna volatilnost: Standardna devijacija dnevnih povrata dionice u određenom prozoru (10 i 30 dana).</w:t>
-      </w:r>
-      <w:r>
-        <w:rPr>
-          <w:sz w:val="24"/>
-          <w:szCs w:val="24"/>
-        </w:rPr>
+        <w:t>$$\text{Donja traka}_t = SMA_{20, t} - 2 \cdot \sigma_{20, t}$$</w:t>
+      </w:r>
+    </w:p>
+    <w:p>
+      <w:pPr/>
+      <w:r>
+        <w:t>U radu se koristi i pozicija cijene unutar traka ($bb\_position$), koja se skalira između 0 (dodirivanje donje trake) i 1 (dodirivanje gornje trake):</w:t>
+      </w:r>
+    </w:p>
+    <w:p>
+      <w:pPr/>
+      <w:r>
+        <w:t>$$bb\_position_t = \frac{Close_t - \text{Donja traka}_t}{\text{Gornja traka}_t - \text{Donja traka}_t}$$</w:t>
+      </w:r>
+    </w:p>
+    <w:p>
+      <w:pPr/>
+      <w:r>
+        <w:t>- ATR (Average True Range): Mjera volatilnosti koja pokazuje prosječan raspon kretanja cijene dionice unutar trgovačkog dana. Prvo se računa stvarni raspon ($True\ Range - TR$) kao najveća vrijednost između tri razlike:</w:t>
+      </w:r>
+    </w:p>
+    <w:p>
+      <w:pPr/>
+      <w:r>
+        <w:t>$$TR_t = \max \left( High_t - Low_t, \, |High_t - Close_{t-1}|, \, |Low_t - Close_{t-1}| \right)$$</w:t>
+      </w:r>
+    </w:p>
+    <w:p>
+      <w:pPr/>
+      <w:r>
+        <w:t>ATR predstavlja pomični prosjek stvarnih raspona kroz zadano razdoblje (npr. 14 dana):</w:t>
+      </w:r>
+    </w:p>
+    <w:p>
+      <w:pPr/>
+      <w:r>
+        <w:t>$$ATR_{n, t} = \frac{1}{n} \sum_{i=0}^{n-1} TR_{t-i}$$</w:t>
+      </w:r>
+    </w:p>
+    <w:p>
+      <w:pPr/>
+      <w:r>
+        <w:t>- Povijesna volatilnost: Izračunava se kao standardna devijacija dnevnih povrata dionice u određenom vremenskom prozoru ($k \in \{10, 30\}$):</w:t>
+      </w:r>
+    </w:p>
+    <w:p>
+      <w:pPr/>
+      <w:r>
+        <w:t>$$Volatility_{k, t} = \sqrt{\frac{1}{k-1} \sum_{i=0}^{k-1} \left( Return_{1, t-i} - \overline{Return}_k \right)^2}$$</w:t>
+      </w:r>
+    </w:p>
+    <w:p>
+      <w:pPr/>
+      <w:r>
+        <w:t>gdje je $\overline{Return}_k$ prosječni jednodnevni povrat dionice u tom prozoru.</w:t>
         <w:br/>
-        <w:t>- Volumen trgovanja: Predstavlja ukupan broj dionica kojima se trgovalo tijekom dana, što služi kao potvrda snage trenda.</w:t>
+        <w:t>- Volumen trgovanja: Predstavlja ukupan broj dionica kojima se trgovalo tijekom dana. Iz volumena se računa stopa promjene volumena i odnos volumena prema pomičnom prosjeku kako bi se potvrdila snaga i održivost cjenovnog trenda.</w:t>
       </w:r>
     </w:p>
     <w:p>
@@ -11416,7 +11566,6 @@
         </w:rPr>
         <w:t>pokazatelji</w:t>
       </w:r>
-      <w:bookmarkEnd w:id="25"/>
       <w:proofErr w:type="spellEnd"/>
     </w:p>
     <w:p>
@@ -11447,7 +11596,55 @@
           <w:szCs w:val="24"/>
         </w:rPr>
         <w:br/>
-        <w:t xml:space="preserve">- VIX indeks (CBOE Volatility Index): Poznat kao indeks straha, mjeri očekivanu volatilnost S&amp;P 500 indeksa. Visoke vrijednosti VIX-a ukazuju na nesigurnost i strah, što korelira s padom tržišta, dok niske </w:t>
+        <w:t xml:space="preserve">- VIX indeks (CBOE Volatility Index): Poznat kao indeks straha, mjeri očekivanu volatilnost S&amp;P 500 indeksa. Visoke vrijednosti VIX-a ukazuju na nesigurnost i strah, što korelira s padom </w:t>
+      </w:r>
+      <w:proofErr w:type="spellStart"/>
+      <w:r>
+        <w:rPr>
+          <w:sz w:val="24"/>
+          <w:szCs w:val="24"/>
+        </w:rPr>
+        <w:t>tržišta</w:t>
+      </w:r>
+      <w:proofErr w:type="spellEnd"/>
+      <w:r>
+        <w:rPr>
+          <w:sz w:val="24"/>
+          <w:szCs w:val="24"/>
+        </w:rPr>
+        <w:t xml:space="preserve">, </w:t>
+      </w:r>
+      <w:proofErr w:type="spellStart"/>
+      <w:r>
+        <w:rPr>
+          <w:sz w:val="24"/>
+          <w:szCs w:val="24"/>
+        </w:rPr>
+        <w:t>dok</w:t>
+      </w:r>
+      <w:proofErr w:type="spellEnd"/>
+      <w:r>
+        <w:rPr>
+          <w:sz w:val="24"/>
+          <w:szCs w:val="24"/>
+        </w:rPr>
+        <w:t xml:space="preserve"> </w:t>
+      </w:r>
+      <w:proofErr w:type="spellStart"/>
+      <w:r>
+        <w:rPr>
+          <w:sz w:val="24"/>
+          <w:szCs w:val="24"/>
+        </w:rPr>
+        <w:t>niske</w:t>
+      </w:r>
+      <w:proofErr w:type="spellEnd"/>
+      <w:r>
+        <w:rPr>
+          <w:sz w:val="24"/>
+          <w:szCs w:val="24"/>
+        </w:rPr>
+        <w:t xml:space="preserve"> </w:t>
       </w:r>
       <w:proofErr w:type="spellStart"/>
       <w:r>
@@ -11550,7 +11747,23 @@
         <w:jc w:val="left"/>
       </w:pPr>
       <w:r>
-        <w:t xml:space="preserve">3.1. Prikupljanje podataka </w:t>
+        <w:t xml:space="preserve">3.1. </w:t>
+      </w:r>
+      <w:proofErr w:type="spellStart"/>
+      <w:r>
+        <w:t>Prikupljanje</w:t>
+      </w:r>
+      <w:proofErr w:type="spellEnd"/>
+      <w:r>
+        <w:t xml:space="preserve"> </w:t>
+      </w:r>
+      <w:proofErr w:type="spellStart"/>
+      <w:r>
+        <w:t>podataka</w:t>
+      </w:r>
+      <w:proofErr w:type="spellEnd"/>
+      <w:r>
+        <w:t xml:space="preserve"> </w:t>
       </w:r>
       <w:proofErr w:type="spellStart"/>
       <w:r>
@@ -11627,7 +11840,39 @@
           <w:sz w:val="24"/>
           <w:szCs w:val="24"/>
         </w:rPr>
-        <w:t xml:space="preserve"> rada, proces prikupljanja podataka u potpunosti je automatiziran kroz Python skriptu train_models.py. Kao izvor povijesnih podataka o cijenama dionica koristi se Yahoo Finance API, kojem se pristupa preko biblioteke yfinance. Skup podataka obuhvaća 54 dionice koje su pažljivo odabrane kako bi reprezentirale 6 ključnih sektora gospodarstva: tehnologiju (npr. Apple, Microsoft, NVIDIA), financije (JPMorgan Chase, Visa, Goldman Sachs), zdravstvo (Johnson &amp; Johnson, Pfizer), potrošačka dobra (Tesla, McDonald's, Coca-Cola), energiju i industriju (ExxonMobil, Caterpillar) te komunikacije (Netflix, Disney). Sirovi podaci o cijenama dohvaćeni su na dnevnoj razini za povijesni period od 1. siječnja 2015. do 1. siječnja 2025. godine. Za svaki trgovački dan dohvaćeno je pet osnovnih vremenskih nizova: cijena otvaranja (Open), najviša cijena (High), najniža cijena (Low), cijena zatvaranja (Close) te volumen trgovanja (Volume). Uz to, skripta preuzima povijesne podatke za S&amp;P 500 indeks (^GSPC) i VIX indeks (^VIX) kako bi se </w:t>
+        <w:t xml:space="preserve"> rada, </w:t>
+      </w:r>
+      <w:proofErr w:type="spellStart"/>
+      <w:r>
+        <w:rPr>
+          <w:sz w:val="24"/>
+          <w:szCs w:val="24"/>
+        </w:rPr>
+        <w:t>proces</w:t>
+      </w:r>
+      <w:proofErr w:type="spellEnd"/>
+      <w:r>
+        <w:rPr>
+          <w:sz w:val="24"/>
+          <w:szCs w:val="24"/>
+        </w:rPr>
+        <w:t xml:space="preserve"> prikupljanja podataka u potpunosti je automatiziran kroz Python skriptu train_models.py. Kao izvor povijesnih podataka o cijenama dionica koristi se Yahoo Finance API, kojem se pristupa preko biblioteke yfinance. Skup podataka obuhvaća 54 dionice koje su pažljivo odabrane kako bi reprezentirale 6 ključnih sektora gospodarstva: tehnologiju (npr. Apple, Microsoft, NVIDIA), financije (JPMorgan Chase, Visa, Goldman Sachs), zdravstvo (Johnson &amp; Johnson, Pfizer), potrošačka dobra (Tesla, McDonald's, Coca-Cola), energiju i industriju (ExxonMobil, Caterpillar) te komunikacije (Netflix, Disney). Sirovi podaci o cijenama dohvaćeni su na dnevnoj razini za povijesni period od 1. siječnja 2015. do 1. siječnja 2025. godine. Za svaki trgovački dan dohvaćeno je pet osnovnih vremenskih nizova: cijena otvaranja (Open), najviša cijena (High), najniža cijena (Low), cijena zatvaranja (Close) te volumen trgovanja (Volume). Uz to, skripta preuzima povijesne podatke za S&amp;P 500 indeks (^GSPC) i VIX indeks (^VIX) </w:t>
+      </w:r>
+      <w:proofErr w:type="spellStart"/>
+      <w:r>
+        <w:rPr>
+          <w:sz w:val="24"/>
+          <w:szCs w:val="24"/>
+        </w:rPr>
+        <w:t>kako</w:t>
+      </w:r>
+      <w:proofErr w:type="spellEnd"/>
+      <w:r>
+        <w:rPr>
+          <w:sz w:val="24"/>
+          <w:szCs w:val="24"/>
+        </w:rPr>
+        <w:t xml:space="preserve"> bi se </w:t>
       </w:r>
       <w:proofErr w:type="spellStart"/>
       <w:r>
@@ -11799,7 +12044,39 @@
           <w:sz w:val="24"/>
           <w:szCs w:val="24"/>
         </w:rPr>
-        <w:t>, u funkciji compute_features izračunava se 25 ulaznih značajki za svaki trgovački dan. Značajke se dijele u tri kategorije:</w:t>
+        <w:t xml:space="preserve">, u </w:t>
+      </w:r>
+      <w:proofErr w:type="spellStart"/>
+      <w:r>
+        <w:rPr>
+          <w:sz w:val="24"/>
+          <w:szCs w:val="24"/>
+        </w:rPr>
+        <w:t>funkciji</w:t>
+      </w:r>
+      <w:proofErr w:type="spellEnd"/>
+      <w:r>
+        <w:rPr>
+          <w:sz w:val="24"/>
+          <w:szCs w:val="24"/>
+        </w:rPr>
+        <w:t xml:space="preserve"> </w:t>
+      </w:r>
+      <w:proofErr w:type="spellStart"/>
+      <w:r>
+        <w:rPr>
+          <w:sz w:val="24"/>
+          <w:szCs w:val="24"/>
+        </w:rPr>
+        <w:t>compute_features</w:t>
+      </w:r>
+      <w:proofErr w:type="spellEnd"/>
+      <w:r>
+        <w:rPr>
+          <w:sz w:val="24"/>
+          <w:szCs w:val="24"/>
+        </w:rPr>
+        <w:t xml:space="preserve"> izračunava se 25 ulaznih značajki za svaki trgovački dan. Značajke se dijele u tri kategorije:</w:t>
       </w:r>
       <w:r>
         <w:rPr>
@@ -11823,7 +12100,55 @@
           <w:szCs w:val="24"/>
         </w:rPr>
         <w:br/>
-        <w:t xml:space="preserve">3. Pokazatelji tržišnog konteksta: Integriraju se dnevni povrati indeksa S&amp;P 500 te zaključne vrijednosti i </w:t>
+        <w:t xml:space="preserve">3. Pokazatelji tržišnog konteksta: Integriraju se dnevni povrati indeksa S&amp;P 500 te </w:t>
+      </w:r>
+      <w:proofErr w:type="spellStart"/>
+      <w:r>
+        <w:rPr>
+          <w:sz w:val="24"/>
+          <w:szCs w:val="24"/>
+        </w:rPr>
+        <w:t>zaključne</w:t>
+      </w:r>
+      <w:proofErr w:type="spellEnd"/>
+      <w:r>
+        <w:rPr>
+          <w:sz w:val="24"/>
+          <w:szCs w:val="24"/>
+        </w:rPr>
+        <w:t xml:space="preserve"> </w:t>
+      </w:r>
+      <w:proofErr w:type="spellStart"/>
+      <w:r>
+        <w:rPr>
+          <w:sz w:val="24"/>
+          <w:szCs w:val="24"/>
+        </w:rPr>
+        <w:t>vrijednosti</w:t>
+      </w:r>
+      <w:proofErr w:type="spellEnd"/>
+      <w:r>
+        <w:rPr>
+          <w:sz w:val="24"/>
+          <w:szCs w:val="24"/>
+        </w:rPr>
+        <w:t xml:space="preserve"> </w:t>
+      </w:r>
+      <w:proofErr w:type="spellStart"/>
+      <w:r>
+        <w:rPr>
+          <w:sz w:val="24"/>
+          <w:szCs w:val="24"/>
+        </w:rPr>
+        <w:t>i</w:t>
+      </w:r>
+      <w:proofErr w:type="spellEnd"/>
+      <w:r>
+        <w:rPr>
+          <w:sz w:val="24"/>
+          <w:szCs w:val="24"/>
+        </w:rPr>
+        <w:t xml:space="preserve"> </w:t>
       </w:r>
       <w:proofErr w:type="spellStart"/>
       <w:r>
@@ -11892,127 +12217,37 @@
         <w:t>3.3. Označavanje podataka i podjela na skupove</w:t>
       </w:r>
     </w:p>
-    <w:p/>
-    <w:p>
-      <w:pPr>
-        <w:jc w:val="both"/>
-        <w:rPr>
-          <w:sz w:val="24"/>
-          <w:szCs w:val="24"/>
-        </w:rPr>
-      </w:pPr>
-      <w:r>
-        <w:rPr>
-          <w:sz w:val="24"/>
-          <w:szCs w:val="24"/>
-        </w:rPr>
-        <w:t xml:space="preserve">Problem je </w:t>
-      </w:r>
-      <w:proofErr w:type="spellStart"/>
-      <w:r>
-        <w:rPr>
-          <w:sz w:val="24"/>
-          <w:szCs w:val="24"/>
-        </w:rPr>
-        <w:t>definiran</w:t>
-      </w:r>
-      <w:proofErr w:type="spellEnd"/>
-      <w:r>
-        <w:rPr>
-          <w:sz w:val="24"/>
-          <w:szCs w:val="24"/>
-        </w:rPr>
-        <w:t xml:space="preserve"> </w:t>
-      </w:r>
-      <w:proofErr w:type="spellStart"/>
-      <w:r>
-        <w:rPr>
-          <w:sz w:val="24"/>
-          <w:szCs w:val="24"/>
-        </w:rPr>
-        <w:t>kao</w:t>
-      </w:r>
-      <w:proofErr w:type="spellEnd"/>
-      <w:r>
-        <w:rPr>
-          <w:sz w:val="24"/>
-          <w:szCs w:val="24"/>
-        </w:rPr>
-        <w:t xml:space="preserve"> </w:t>
-      </w:r>
-      <w:proofErr w:type="spellStart"/>
-      <w:r>
-        <w:rPr>
-          <w:sz w:val="24"/>
-          <w:szCs w:val="24"/>
-        </w:rPr>
-        <w:t>binarna</w:t>
-      </w:r>
-      <w:proofErr w:type="spellEnd"/>
-      <w:r>
-        <w:rPr>
-          <w:sz w:val="24"/>
-          <w:szCs w:val="24"/>
-        </w:rPr>
-        <w:t xml:space="preserve"> klasifikacija: predviđa se hoće li cijena zatvaranja dionice sljedećeg trgovačkog dana (T+1) biti veća od današnje. Ciljna varijabla (y) kreira se tako da poprima vrijednost 1 ako je sutrašnja cijena veća od današnje, a vrijednost 0 ako je manja ili jednaka. Kako bi se modeli ispravno evaluirali i spriječilo curenje informacija iz budućnosti, podaci su podijeljeni u tri vremenski odvojena skupa:</w:t>
-      </w:r>
-      <w:r>
-        <w:rPr>
-          <w:sz w:val="24"/>
-          <w:szCs w:val="24"/>
-        </w:rPr>
+    <w:p>
+      <w:pPr/>
+      <w:r>
+        <w:t>Problem je definiran kao binarna klasifikacija: predviđa se hoće li cijena zatvaranja dionice sljedećeg trgovačkog dana ($T+1$) biti veća od današnje ($T$). Ciljna varijabla (label) $y_t$ kreira se matematički na sljedeći način:</w:t>
+      </w:r>
+    </w:p>
+    <w:p>
+      <w:pPr/>
+      <w:r>
+        <w:t>$$y_t = \begin{cases} 1, &amp; \text{ako je } Close_{t+1} &gt; Close_t \\ 0, &amp; \text{ako je } Close_{t+1} \le Close_t \end{cases}$$</w:t>
+      </w:r>
+    </w:p>
+    <w:p>
+      <w:pPr/>
+      <w:r>
+        <w:t>gdje $y_t = 1$ označava rast cijene dionice, a $y_t = 0$ označava njezin pad ili stagnaciju.</w:t>
         <w:br/>
-        <w:t>- Trening skup (70%): Podaci od 1. siječnja 2015. do 31. prosinca 2022. godine. Koristi se za učenje težina modela.</w:t>
-      </w:r>
-      <w:r>
-        <w:rPr>
-          <w:sz w:val="24"/>
-          <w:szCs w:val="24"/>
-        </w:rPr>
+        <w:t>Kako bi se modeli ispravno evaluirali i spriječilo curenje informacija iz budućnosti (look-ahead bias), podaci su podijeljeni u tri vremenski odvojena skupa (chronological split):</w:t>
         <w:br/>
-        <w:t xml:space="preserve">- Validacijski skup (15%): Cijela 2023. godina. Koristi se za rano zaustavljanje treninga </w:t>
-      </w:r>
-      <w:r>
-        <w:rPr>
-          <w:sz w:val="24"/>
-          <w:szCs w:val="24"/>
-        </w:rPr>
-        <w:lastRenderedPageBreak/>
-        <w:t>LSTM mreže (Early Stopping) i za fino podešavanje klasifikacijskog praga.</w:t>
-      </w:r>
-      <w:r>
-        <w:rPr>
-          <w:sz w:val="24"/>
-          <w:szCs w:val="24"/>
-        </w:rPr>
+        <w:t>- Trening skup ($70\%$): Obuhvaća podatke od 1. siječnja 2015. do 31. prosinca 2022. godine. Koristi se za učenje težina i parametara modela.</w:t>
         <w:br/>
-        <w:t>- Testni skup (15%): Cijela 2024. godina. Koristi se isključivo za konačnu evaluaciju i usporedbu modela.</w:t>
-      </w:r>
-    </w:p>
-    <w:p>
-      <w:pPr>
-        <w:jc w:val="both"/>
-        <w:rPr>
-          <w:sz w:val="24"/>
-          <w:szCs w:val="24"/>
-        </w:rPr>
-      </w:pPr>
-      <w:r>
-        <w:rPr>
-          <w:sz w:val="24"/>
-          <w:szCs w:val="24"/>
-        </w:rPr>
+        <w:t>- Validacijski skup ($15\%$): Cijela 2023. godina. Koristi se za rano zaustavljanje treninga LSTM mreže (Early Stopping) kako bi se spriječila prenaučenost, te za pretraživanje i fino podešavanje klasifikacijskog praga.</w:t>
+        <w:br/>
+        <w:t>- Testni skup ($15\%$): Cijela 2024. godina. Koristi se isključivo za konačnu evaluaciju performansi i simulaciju trgovanja na potpuno neviđenim podacima.</w:t>
+      </w:r>
+    </w:p>
+    <w:p>
+      <w:pPr/>
+      <w:r>
         <w:t>[PREPORUKA ZA SLIKU 3.1: Ovdje umetnuti grafički prikaz vremenske podjele podataka (Time-based Train-Validation-Test Split). Prikazati vodoravnu vremensku lentu od 2015. do 2025. godine, s jasno označenim sekcijama: plava boja za trening skup (2015-2022), žuta za validaciju (2023) i zelena za testni skup (2024).]</w:t>
       </w:r>
-    </w:p>
-    <w:p>
-      <w:pPr>
-        <w:jc w:val="both"/>
-        <w:rPr>
-          <w:sz w:val="24"/>
-          <w:szCs w:val="24"/>
-        </w:rPr>
-      </w:pPr>
     </w:p>
     <w:p>
       <w:pPr>
@@ -12024,151 +12259,37 @@
       </w:r>
     </w:p>
     <w:p>
-      <w:pPr>
-        <w:rPr>
-          <w:sz w:val="24"/>
-          <w:szCs w:val="24"/>
-        </w:rPr>
-      </w:pPr>
-    </w:p>
-    <w:p>
-      <w:pPr>
-        <w:jc w:val="both"/>
-        <w:rPr>
-          <w:sz w:val="24"/>
-          <w:szCs w:val="24"/>
-        </w:rPr>
-      </w:pPr>
-      <w:proofErr w:type="spellStart"/>
-      <w:r>
-        <w:rPr>
-          <w:sz w:val="24"/>
-          <w:szCs w:val="24"/>
-        </w:rPr>
-        <w:t>Značajke</w:t>
-      </w:r>
-      <w:proofErr w:type="spellEnd"/>
-      <w:r>
-        <w:rPr>
-          <w:sz w:val="24"/>
-          <w:szCs w:val="24"/>
-        </w:rPr>
-        <w:t xml:space="preserve"> se </w:t>
-      </w:r>
-      <w:proofErr w:type="spellStart"/>
-      <w:r>
-        <w:rPr>
-          <w:sz w:val="24"/>
-          <w:szCs w:val="24"/>
-        </w:rPr>
-        <w:t>standardiziraju</w:t>
-      </w:r>
-      <w:proofErr w:type="spellEnd"/>
-      <w:r>
-        <w:rPr>
-          <w:sz w:val="24"/>
-          <w:szCs w:val="24"/>
-        </w:rPr>
-        <w:t xml:space="preserve"> </w:t>
-      </w:r>
-      <w:proofErr w:type="spellStart"/>
-      <w:r>
-        <w:rPr>
-          <w:sz w:val="24"/>
-          <w:szCs w:val="24"/>
-        </w:rPr>
-        <w:t>oduzimanjem</w:t>
-      </w:r>
-      <w:proofErr w:type="spellEnd"/>
-      <w:r>
-        <w:rPr>
-          <w:sz w:val="24"/>
-          <w:szCs w:val="24"/>
-        </w:rPr>
-        <w:t xml:space="preserve"> </w:t>
-      </w:r>
-      <w:proofErr w:type="spellStart"/>
-      <w:r>
-        <w:rPr>
-          <w:sz w:val="24"/>
-          <w:szCs w:val="24"/>
-        </w:rPr>
-        <w:t>srednje</w:t>
-      </w:r>
-      <w:proofErr w:type="spellEnd"/>
-      <w:r>
-        <w:rPr>
-          <w:sz w:val="24"/>
-          <w:szCs w:val="24"/>
-        </w:rPr>
-        <w:t xml:space="preserve"> vrijednosti i dijeljenjem sa standardnom devijacijom trening skupa pomoću klase ManualStandardScaler. Time se rasponi vrijednosti svih značajki svode na slične skale, što je ključno za stabilnost i konvergenciju logističke regresije i LSTM mreže. Dok klasični modeli (Logistic Regression, Random Forest, XGBoost) primaju dvodimenzionalne podatke [broj_uzoraka, 25] gdje se svaki dan razmatra neovisno, LSTM neuronska mreža zahtijeva trodimenzionalni ulaz oblika [broj_uzoraka, lookback, 25]. U funkciji create_sequences podaci se transformiraju tako da se za svaki dan stvara povijesni prozor od lookback = 10 prethodnih trgovačkih dana, što omogućuje LSTM mreži da nauči vremensku </w:t>
-      </w:r>
-      <w:proofErr w:type="spellStart"/>
-      <w:r>
-        <w:rPr>
-          <w:sz w:val="24"/>
-          <w:szCs w:val="24"/>
-        </w:rPr>
-        <w:t>ovisnost</w:t>
-      </w:r>
-      <w:proofErr w:type="spellEnd"/>
-      <w:r>
-        <w:rPr>
-          <w:sz w:val="24"/>
-          <w:szCs w:val="24"/>
-        </w:rPr>
-        <w:t xml:space="preserve"> </w:t>
-      </w:r>
-      <w:proofErr w:type="spellStart"/>
-      <w:r>
-        <w:rPr>
-          <w:sz w:val="24"/>
-          <w:szCs w:val="24"/>
-        </w:rPr>
-        <w:t>i</w:t>
-      </w:r>
-      <w:proofErr w:type="spellEnd"/>
-      <w:r>
-        <w:rPr>
-          <w:sz w:val="24"/>
-          <w:szCs w:val="24"/>
-        </w:rPr>
-        <w:t xml:space="preserve"> </w:t>
-      </w:r>
-      <w:proofErr w:type="spellStart"/>
-      <w:r>
-        <w:rPr>
-          <w:sz w:val="24"/>
-          <w:szCs w:val="24"/>
-        </w:rPr>
-        <w:t>dinamiku</w:t>
-      </w:r>
-      <w:proofErr w:type="spellEnd"/>
-      <w:r>
-        <w:rPr>
-          <w:sz w:val="24"/>
-          <w:szCs w:val="24"/>
-        </w:rPr>
-        <w:t xml:space="preserve"> </w:t>
-      </w:r>
-      <w:proofErr w:type="spellStart"/>
-      <w:r>
-        <w:rPr>
-          <w:sz w:val="24"/>
-          <w:szCs w:val="24"/>
-        </w:rPr>
-        <w:t>trendova</w:t>
-      </w:r>
-      <w:proofErr w:type="spellEnd"/>
-      <w:r>
-        <w:rPr>
-          <w:sz w:val="24"/>
-          <w:szCs w:val="24"/>
-        </w:rPr>
-        <w:t>.</w:t>
-      </w:r>
-    </w:p>
-    <w:p/>
+      <w:pPr/>
+      <w:r>
+        <w:t>Ulazne značajke imaju različite raspone vrijednosti (npr. RSI se kreće od 0 do 100, dok se volumen trgovanja kreće u milijunima). Kako bi se modeli stabilizirali i ubrzala konvergencija gradijentnih metoda, značajke se standardiziraju pomoću klase ManualStandardScaler. Standardizacija se provodi oduzimanjem aritmetičke sredine i dijeljenjem sa standardnom devijacijom trening skupa:</w:t>
+      </w:r>
+    </w:p>
+    <w:p>
+      <w:pPr/>
+      <w:r>
+        <w:t>$$x'_{t, j} = \frac{x_{t, j} - \mu_j}{\sigma_j}$$</w:t>
+      </w:r>
+    </w:p>
+    <w:p>
+      <w:pPr/>
+      <w:r>
+        <w:t>gdje je $x_{t, j}$ sirova vrijednost značajke $j$ u trenutku $t$, $\mu_j$ aritmetička sredina te značajke izračunata na trening skupu, $\sigma_j$ njezina standardna devijacija na trening skupu, a $x'_{t, j}$ rezultirajuća standardizirana značajka s nultom sredinom i jediničnom varijancom. Značajno je istaknuti da se parametri $\mu_j$ i $\sigma_j$ računaju isključivo na trening skupu i potom primjenjuju na validacijski i testni skup, čime se sprječava curenje informacija.</w:t>
+        <w:br/>
+        <w:t>Dok klasični modeli (Logistic Regression, Random Forest, XGBoost) primaju dvodimenzionalne podatke $[broj\_uzoraka, 25]$ gdje se svaki dan razmatra neovisno, LSTM neuronska mreža zahtijeva trodimenzionalni ulaz oblika $[broj\_uzoraka, lookback, 25]$. U tu svrhu razvijena je funkcija create_sequences koja transformira podatke tako da se za svaki dan stvara povijesni prozor od $lookback = 10$ prethodnih trgovačkih dana:</w:t>
+      </w:r>
+    </w:p>
+    <w:p>
+      <w:pPr/>
+      <w:r>
+        <w:t>$$\mathbf{X}_{t}^{LSTM} = \left[ \mathbf{x}'_{t-9}, \, \mathbf{x}'_{t-8}, \, \dots, \, \mathbf{x}'_{t} \right]^T$$</w:t>
+      </w:r>
+    </w:p>
+    <w:p>
+      <w:pPr/>
+      <w:r>
+        <w:t>Ova sekvencijalna priprema omogućuje LSTM mreži da nauči vremensku ovisnost i dinamiku trendova kroz vrijeme, prepoznavajući nelinearne uzorke koji nisu vidljivi u pojedinačnim danima.</w:t>
+      </w:r>
+    </w:p>
     <w:p>
       <w:pPr>
         <w:pStyle w:val="Naslov2"/>
@@ -12281,7 +12402,39 @@
           <w:szCs w:val="24"/>
         </w:rPr>
         <w:br/>
-        <w:t xml:space="preserve">Model se optimizira pomoću Adam optimizatora i binarne unakrsne entropije. Proces treniranja traje maksimalno 50 epoha, uz primjenu EarlyStopping mehanizma koji prekida učenje ako se gubitak na validacijskom skupu ne smanji </w:t>
+        <w:t xml:space="preserve">Model se optimizira pomoću Adam optimizatora i binarne unakrsne entropije. Proces treniranja traje maksimalno 50 epoha, uz primjenu EarlyStopping mehanizma koji prekida učenje ako se gubitak na validacijskom </w:t>
+      </w:r>
+      <w:proofErr w:type="spellStart"/>
+      <w:r>
+        <w:rPr>
+          <w:sz w:val="24"/>
+          <w:szCs w:val="24"/>
+        </w:rPr>
+        <w:t>skupu</w:t>
+      </w:r>
+      <w:proofErr w:type="spellEnd"/>
+      <w:r>
+        <w:rPr>
+          <w:sz w:val="24"/>
+          <w:szCs w:val="24"/>
+        </w:rPr>
+        <w:t xml:space="preserve"> ne </w:t>
+      </w:r>
+      <w:proofErr w:type="spellStart"/>
+      <w:r>
+        <w:rPr>
+          <w:sz w:val="24"/>
+          <w:szCs w:val="24"/>
+        </w:rPr>
+        <w:t>smanji</w:t>
+      </w:r>
+      <w:proofErr w:type="spellEnd"/>
+      <w:r>
+        <w:rPr>
+          <w:sz w:val="24"/>
+          <w:szCs w:val="24"/>
+        </w:rPr>
+        <w:t xml:space="preserve"> </w:t>
       </w:r>
       <w:proofErr w:type="spellStart"/>
       <w:r>
@@ -12429,7 +12582,63 @@
           <w:sz w:val="24"/>
           <w:szCs w:val="24"/>
         </w:rPr>
-        <w:t xml:space="preserve"> sve uzorke s predviđenom vjerojatnošću veće od 0.50 u pozitivnu klasu (rast). Međutim, financijski podaci su neuravnoteženi i asimetrični, zbog čega standardni prag od 0.50 često daje loše rezultate. U ovom radu primjenjuje se metoda optimizacije praga u funkciji optimize_threshold. Na validacijskom skupu podataka pretražuju se pragovi u rasponu od 0.35 do 0.65 s korakom 0.01. Odabire se onaj prag koji maksimizira Macro F1-score metriku (prosjek F1-score-a klase rasta i klase pada), što osigurava uravnoteženu točnost predviđanja obaju smjerova kretanja. Optimalni pragovi se za svaku dionicu i model spremaju u JSON </w:t>
+        <w:t xml:space="preserve"> </w:t>
+      </w:r>
+      <w:proofErr w:type="spellStart"/>
+      <w:r>
+        <w:rPr>
+          <w:sz w:val="24"/>
+          <w:szCs w:val="24"/>
+        </w:rPr>
+        <w:t>sve</w:t>
+      </w:r>
+      <w:proofErr w:type="spellEnd"/>
+      <w:r>
+        <w:rPr>
+          <w:sz w:val="24"/>
+          <w:szCs w:val="24"/>
+        </w:rPr>
+        <w:t xml:space="preserve"> </w:t>
+      </w:r>
+      <w:proofErr w:type="spellStart"/>
+      <w:r>
+        <w:rPr>
+          <w:sz w:val="24"/>
+          <w:szCs w:val="24"/>
+        </w:rPr>
+        <w:t>uzorke</w:t>
+      </w:r>
+      <w:proofErr w:type="spellEnd"/>
+      <w:r>
+        <w:rPr>
+          <w:sz w:val="24"/>
+          <w:szCs w:val="24"/>
+        </w:rPr>
+        <w:t xml:space="preserve"> s predviđenom vjerojatnošću veće od 0.50 u pozitivnu klasu (rast). Međutim, financijski podaci su neuravnoteženi i asimetrični, zbog čega standardni prag od 0.50 često daje loše rezultate. U ovom radu </w:t>
+      </w:r>
+      <w:r>
+        <w:rPr>
+          <w:sz w:val="24"/>
+          <w:szCs w:val="24"/>
+        </w:rPr>
+        <w:lastRenderedPageBreak/>
+        <w:t xml:space="preserve">primjenjuje se metoda optimizacije praga u funkciji optimize_threshold. Na validacijskom skupu podataka pretražuju se pragovi u rasponu od 0.35 do 0.65 s korakom 0.01. Odabire se onaj prag koji maksimizira Macro F1-score metriku (prosjek F1-score-a klase rasta i klase pada), što osigurava uravnoteženu točnost predviđanja obaju smjerova kretanja. Optimalni pragovi se za svaku dionicu i model </w:t>
+      </w:r>
+      <w:proofErr w:type="spellStart"/>
+      <w:r>
+        <w:rPr>
+          <w:sz w:val="24"/>
+          <w:szCs w:val="24"/>
+        </w:rPr>
+        <w:t>spremaju</w:t>
+      </w:r>
+      <w:proofErr w:type="spellEnd"/>
+      <w:r>
+        <w:rPr>
+          <w:sz w:val="24"/>
+          <w:szCs w:val="24"/>
+        </w:rPr>
+        <w:t xml:space="preserve"> u JSON </w:t>
       </w:r>
       <w:proofErr w:type="spellStart"/>
       <w:r>
@@ -12547,7 +12756,23 @@
           <w:sz w:val="24"/>
           <w:szCs w:val="24"/>
         </w:rPr>
-        <w:t xml:space="preserve"> (client-server) arhitekturu. Poslužiteljski dio (backend) implementiran je u Flask okviru i nudi REST API endpointe za dohvaćanje podataka s burze uživo, izračun live značajki i generiranje predikcija. Prilikom pokretanja predikcije za odabranu dionicu, Flask aplikacija preuzima zadnjih 100 dana cijena s Yahoo Finance, izračunava potrebne indikatore, učitava odgovarajući model iz datoteke te vraća predviđeni smjer (RASTE ili PADA) i pouzdanost u postotku.</w:t>
+        <w:t xml:space="preserve"> (client-server) </w:t>
+      </w:r>
+      <w:proofErr w:type="spellStart"/>
+      <w:r>
+        <w:rPr>
+          <w:sz w:val="24"/>
+          <w:szCs w:val="24"/>
+        </w:rPr>
+        <w:t>arhitekturu</w:t>
+      </w:r>
+      <w:proofErr w:type="spellEnd"/>
+      <w:r>
+        <w:rPr>
+          <w:sz w:val="24"/>
+          <w:szCs w:val="24"/>
+        </w:rPr>
+        <w:t>. Poslužiteljski dio (backend) implementiran je u Flask okviru i nudi REST API endpointe za dohvaćanje podataka s burze uživo, izračun live značajki i generiranje predikcija. Prilikom pokretanja predikcije za odabranu dionicu, Flask aplikacija preuzima zadnjih 100 dana cijena s Yahoo Finance, izračunava potrebne indikatore, učitava odgovarajući model iz datoteke te vraća predviđeni smjer (RASTE ili PADA) i pouzdanost u postotku.</w:t>
       </w:r>
       <w:r>
         <w:rPr>
@@ -12571,7 +12796,23 @@
           <w:sz w:val="24"/>
           <w:szCs w:val="24"/>
         </w:rPr>
-        <w:t xml:space="preserve">[PREPORUKA ZA SLIKU 3.2: Ovdje umetnuti dijagram arhitekture web aplikacije (Client-Server Architecture i protok podataka). Prikazati tri bloka: 1. Frontend (Preglednik s Chart.js), 2. Backend (Flask poslužitelj s MODEL_CACHE i TensorFlow-om), 3. Eksterni servisi (Yahoo Finance API). Strelice trebaju prikazivati asinkroni HTTP GET zahtjev s klijenta prema API-ju, preuzimanje sirovih cijena sa Yahoo Finance-a, te vraćanje finalne predikcije u JSON </w:t>
+        <w:t xml:space="preserve">[PREPORUKA ZA SLIKU 3.2: Ovdje umetnuti dijagram arhitekture web aplikacije (Client-Server Architecture i protok podataka). Prikazati tri bloka: 1. Frontend (Preglednik s Chart.js), 2. Backend (Flask poslužitelj s MODEL_CACHE i TensorFlow-om), 3. Eksterni servisi (Yahoo Finance API). Strelice trebaju prikazivati asinkroni HTTP GET zahtjev s klijenta prema API-ju, preuzimanje sirovih cijena sa Yahoo Finance-a, te vraćanje finalne </w:t>
+      </w:r>
+      <w:proofErr w:type="spellStart"/>
+      <w:r>
+        <w:rPr>
+          <w:sz w:val="24"/>
+          <w:szCs w:val="24"/>
+        </w:rPr>
+        <w:t>predikcije</w:t>
+      </w:r>
+      <w:proofErr w:type="spellEnd"/>
+      <w:r>
+        <w:rPr>
+          <w:sz w:val="24"/>
+          <w:szCs w:val="24"/>
+        </w:rPr>
+        <w:t xml:space="preserve"> u JSON </w:t>
       </w:r>
       <w:proofErr w:type="spellStart"/>
       <w:r>
@@ -12653,7 +12894,6 @@
       </w:r>
     </w:p>
     <w:p>
-      <w:pPr/>
       <w:r>
         <w:t>U ovom poglavlju detaljno se analiziraju i raspravljaju rezultati dobiveni primjenom četiriju modela strojnog učenja: Logističke regresije (LR), Slučajnih šuma (RF), XGBoost-a i LSTM neuronske mreže. Evaluacija modela provedena je u tri faze. Prva faza obuhvaća agregiranu statističku analizu performansi modela na validacijskom skupu podataka (2023. godina). Druga faza prikazuje raspodjelu optimalnih modela po dionicama na testnom skupu (2024. godina) te analizira važnost značajki i proces treniranja LSTM modela. Treća faza donosi simulaciju aktivne strategije trgovanja vođene signalima modela i uspoređuje je s pasivnim pristupom kupnje i držanja dionica (Buy &amp; Hold). Poglavlje se privodi kraju raspravom o teorijskim i praktičnim ograničenjima razvijenog sustava.</w:t>
       </w:r>
@@ -12666,10 +12906,500 @@
         <w:t>4.1. Analiza performansi modela na validacijskom skupu</w:t>
       </w:r>
     </w:p>
+    <w:tbl>
+      <w:tblPr>
+        <w:tblW w:w="0" w:type="auto"/>
+        <w:tblBorders>
+          <w:top w:val="single" w:sz="4" w:space="0" w:color="CCCCCC"/>
+          <w:left w:val="single" w:sz="4" w:space="0" w:color="CCCCCC"/>
+          <w:bottom w:val="single" w:sz="4" w:space="0" w:color="CCCCCC"/>
+          <w:right w:val="single" w:sz="4" w:space="0" w:color="CCCCCC"/>
+          <w:insideH w:val="single" w:sz="4" w:space="0" w:color="CCCCCC"/>
+          <w:insideV w:val="single" w:sz="4" w:space="0" w:color="CCCCCC"/>
+        </w:tblBorders>
+        <w:tblCellMar>
+          <w:top w:w="120" w:type="dxa"/>
+          <w:left w:w="150" w:type="dxa"/>
+          <w:bottom w:w="120" w:type="dxa"/>
+          <w:right w:w="150" w:type="dxa"/>
+        </w:tblCellMar>
+        <w:tblLook w:val="04A0" w:firstRow="1" w:lastRow="0" w:firstColumn="1" w:lastColumn="0" w:noHBand="0" w:noVBand="1"/>
+      </w:tblPr>
+      <w:tblGrid>
+        <w:gridCol w:w="1513"/>
+        <w:gridCol w:w="1513"/>
+        <w:gridCol w:w="1513"/>
+        <w:gridCol w:w="1513"/>
+        <w:gridCol w:w="1513"/>
+        <w:gridCol w:w="1513"/>
+      </w:tblGrid>
+      <w:tr>
+        <w:tc>
+          <w:tcPr>
+            <w:tcW w:w="1513" w:type="dxa"/>
+            <w:shd w:val="clear" w:color="auto" w:fill="F2F2F2"/>
+          </w:tcPr>
+          <w:p>
+            <w:r>
+              <w:rPr>
+                <w:b/>
+              </w:rPr>
+              <w:t>Model</w:t>
+            </w:r>
+          </w:p>
+        </w:tc>
+        <w:tc>
+          <w:tcPr>
+            <w:tcW w:w="1513" w:type="dxa"/>
+            <w:shd w:val="clear" w:color="auto" w:fill="F2F2F2"/>
+          </w:tcPr>
+          <w:p>
+            <w:pPr>
+              <w:jc w:val="right"/>
+            </w:pPr>
+            <w:r>
+              <w:rPr>
+                <w:b/>
+              </w:rPr>
+              <w:t>Točnost (%)</w:t>
+            </w:r>
+          </w:p>
+        </w:tc>
+        <w:tc>
+          <w:tcPr>
+            <w:tcW w:w="1513" w:type="dxa"/>
+            <w:shd w:val="clear" w:color="auto" w:fill="F2F2F2"/>
+          </w:tcPr>
+          <w:p>
+            <w:pPr>
+              <w:jc w:val="right"/>
+            </w:pPr>
+            <w:r>
+              <w:rPr>
+                <w:b/>
+              </w:rPr>
+              <w:t>Preciznost (%)</w:t>
+            </w:r>
+          </w:p>
+        </w:tc>
+        <w:tc>
+          <w:tcPr>
+            <w:tcW w:w="1513" w:type="dxa"/>
+            <w:shd w:val="clear" w:color="auto" w:fill="F2F2F2"/>
+          </w:tcPr>
+          <w:p>
+            <w:pPr>
+              <w:jc w:val="right"/>
+            </w:pPr>
+            <w:r>
+              <w:rPr>
+                <w:b/>
+              </w:rPr>
+              <w:t>Odziv (%)</w:t>
+            </w:r>
+          </w:p>
+        </w:tc>
+        <w:tc>
+          <w:tcPr>
+            <w:tcW w:w="1513" w:type="dxa"/>
+            <w:shd w:val="clear" w:color="auto" w:fill="F2F2F2"/>
+          </w:tcPr>
+          <w:p>
+            <w:pPr>
+              <w:jc w:val="right"/>
+            </w:pPr>
+            <w:r>
+              <w:rPr>
+                <w:b/>
+              </w:rPr>
+              <w:t>F1 Mjera (%)</w:t>
+            </w:r>
+          </w:p>
+        </w:tc>
+        <w:tc>
+          <w:tcPr>
+            <w:tcW w:w="1513" w:type="dxa"/>
+            <w:shd w:val="clear" w:color="auto" w:fill="F2F2F2"/>
+          </w:tcPr>
+          <w:p>
+            <w:pPr>
+              <w:jc w:val="right"/>
+            </w:pPr>
+            <w:r>
+              <w:rPr>
+                <w:b/>
+              </w:rPr>
+              <w:t>ROC-AUC</w:t>
+            </w:r>
+          </w:p>
+        </w:tc>
+      </w:tr>
+      <w:tr>
+        <w:tc>
+          <w:tcPr>
+            <w:tcW w:w="1513" w:type="dxa"/>
+          </w:tcPr>
+          <w:p>
+            <w:r>
+              <w:t>XGBoost</w:t>
+            </w:r>
+          </w:p>
+        </w:tc>
+        <w:tc>
+          <w:tcPr>
+            <w:tcW w:w="1513" w:type="dxa"/>
+          </w:tcPr>
+          <w:p>
+            <w:pPr>
+              <w:jc w:val="right"/>
+            </w:pPr>
+            <w:r>
+              <w:t>53.45</w:t>
+            </w:r>
+          </w:p>
+        </w:tc>
+        <w:tc>
+          <w:tcPr>
+            <w:tcW w:w="1513" w:type="dxa"/>
+          </w:tcPr>
+          <w:p>
+            <w:pPr>
+              <w:jc w:val="right"/>
+            </w:pPr>
+            <w:r>
+              <w:t>55.41</w:t>
+            </w:r>
+          </w:p>
+        </w:tc>
+        <w:tc>
+          <w:tcPr>
+            <w:tcW w:w="1513" w:type="dxa"/>
+          </w:tcPr>
+          <w:p>
+            <w:pPr>
+              <w:jc w:val="right"/>
+            </w:pPr>
+            <w:r>
+              <w:t>56.79</w:t>
+            </w:r>
+          </w:p>
+        </w:tc>
+        <w:tc>
+          <w:tcPr>
+            <w:tcW w:w="1513" w:type="dxa"/>
+          </w:tcPr>
+          <w:p>
+            <w:pPr>
+              <w:jc w:val="right"/>
+            </w:pPr>
+            <w:r>
+              <w:t>55.08</w:t>
+            </w:r>
+          </w:p>
+        </w:tc>
+        <w:tc>
+          <w:tcPr>
+            <w:tcW w:w="1513" w:type="dxa"/>
+          </w:tcPr>
+          <w:p>
+            <w:pPr>
+              <w:jc w:val="right"/>
+            </w:pPr>
+            <w:r>
+              <w:t>0.5088</w:t>
+            </w:r>
+          </w:p>
+        </w:tc>
+      </w:tr>
+      <w:tr>
+        <w:tc>
+          <w:tcPr>
+            <w:tcW w:w="1513" w:type="dxa"/>
+          </w:tcPr>
+          <w:p>
+            <w:r>
+              <w:t>Logistic Regression</w:t>
+            </w:r>
+          </w:p>
+        </w:tc>
+        <w:tc>
+          <w:tcPr>
+            <w:tcW w:w="1513" w:type="dxa"/>
+          </w:tcPr>
+          <w:p>
+            <w:pPr>
+              <w:jc w:val="right"/>
+            </w:pPr>
+            <w:r>
+              <w:t>52.89</w:t>
+            </w:r>
+          </w:p>
+        </w:tc>
+        <w:tc>
+          <w:tcPr>
+            <w:tcW w:w="1513" w:type="dxa"/>
+          </w:tcPr>
+          <w:p>
+            <w:pPr>
+              <w:jc w:val="right"/>
+            </w:pPr>
+            <w:r>
+              <w:t>54.94</w:t>
+            </w:r>
+          </w:p>
+        </w:tc>
+        <w:tc>
+          <w:tcPr>
+            <w:tcW w:w="1513" w:type="dxa"/>
+          </w:tcPr>
+          <w:p>
+            <w:pPr>
+              <w:jc w:val="right"/>
+            </w:pPr>
+            <w:r>
+              <w:t>53.48</w:t>
+            </w:r>
+          </w:p>
+        </w:tc>
+        <w:tc>
+          <w:tcPr>
+            <w:tcW w:w="1513" w:type="dxa"/>
+          </w:tcPr>
+          <w:p>
+            <w:pPr>
+              <w:jc w:val="right"/>
+            </w:pPr>
+            <w:r>
+              <w:t>53.35</w:t>
+            </w:r>
+          </w:p>
+        </w:tc>
+        <w:tc>
+          <w:tcPr>
+            <w:tcW w:w="1513" w:type="dxa"/>
+          </w:tcPr>
+          <w:p>
+            <w:pPr>
+              <w:jc w:val="right"/>
+            </w:pPr>
+            <w:r>
+              <w:t>0.5066</w:t>
+            </w:r>
+          </w:p>
+        </w:tc>
+      </w:tr>
+      <w:tr>
+        <w:tc>
+          <w:tcPr>
+            <w:tcW w:w="1513" w:type="dxa"/>
+          </w:tcPr>
+          <w:p>
+            <w:r>
+              <w:t>LSTM</w:t>
+            </w:r>
+          </w:p>
+        </w:tc>
+        <w:tc>
+          <w:tcPr>
+            <w:tcW w:w="1513" w:type="dxa"/>
+          </w:tcPr>
+          <w:p>
+            <w:pPr>
+              <w:jc w:val="right"/>
+            </w:pPr>
+            <w:r>
+              <w:t>52.10</w:t>
+            </w:r>
+          </w:p>
+        </w:tc>
+        <w:tc>
+          <w:tcPr>
+            <w:tcW w:w="1513" w:type="dxa"/>
+          </w:tcPr>
+          <w:p>
+            <w:pPr>
+              <w:jc w:val="right"/>
+            </w:pPr>
+            <w:r>
+              <w:t>54.19</w:t>
+            </w:r>
+          </w:p>
+        </w:tc>
+        <w:tc>
+          <w:tcPr>
+            <w:tcW w:w="1513" w:type="dxa"/>
+          </w:tcPr>
+          <w:p>
+            <w:pPr>
+              <w:jc w:val="right"/>
+            </w:pPr>
+            <w:r>
+              <w:t>52.15</w:t>
+            </w:r>
+          </w:p>
+        </w:tc>
+        <w:tc>
+          <w:tcPr>
+            <w:tcW w:w="1513" w:type="dxa"/>
+          </w:tcPr>
+          <w:p>
+            <w:pPr>
+              <w:jc w:val="right"/>
+            </w:pPr>
+            <w:r>
+              <w:t>52.29</w:t>
+            </w:r>
+          </w:p>
+        </w:tc>
+        <w:tc>
+          <w:tcPr>
+            <w:tcW w:w="1513" w:type="dxa"/>
+          </w:tcPr>
+          <w:p>
+            <w:pPr>
+              <w:jc w:val="right"/>
+            </w:pPr>
+            <w:r>
+              <w:t>0.5065</w:t>
+            </w:r>
+          </w:p>
+        </w:tc>
+      </w:tr>
+      <w:tr>
+        <w:tc>
+          <w:tcPr>
+            <w:tcW w:w="1513" w:type="dxa"/>
+          </w:tcPr>
+          <w:p>
+            <w:r>
+              <w:t xml:space="preserve">Random </w:t>
+            </w:r>
+            <w:r>
+              <w:lastRenderedPageBreak/>
+              <w:t>Forest</w:t>
+            </w:r>
+          </w:p>
+        </w:tc>
+        <w:tc>
+          <w:tcPr>
+            <w:tcW w:w="1513" w:type="dxa"/>
+          </w:tcPr>
+          <w:p>
+            <w:pPr>
+              <w:jc w:val="right"/>
+            </w:pPr>
+            <w:r>
+              <w:lastRenderedPageBreak/>
+              <w:t>51.99</w:t>
+            </w:r>
+          </w:p>
+        </w:tc>
+        <w:tc>
+          <w:tcPr>
+            <w:tcW w:w="1513" w:type="dxa"/>
+          </w:tcPr>
+          <w:p>
+            <w:pPr>
+              <w:jc w:val="right"/>
+            </w:pPr>
+            <w:r>
+              <w:t>53.98</w:t>
+            </w:r>
+          </w:p>
+        </w:tc>
+        <w:tc>
+          <w:tcPr>
+            <w:tcW w:w="1513" w:type="dxa"/>
+          </w:tcPr>
+          <w:p>
+            <w:pPr>
+              <w:jc w:val="right"/>
+            </w:pPr>
+            <w:r>
+              <w:t>51.09</w:t>
+            </w:r>
+          </w:p>
+        </w:tc>
+        <w:tc>
+          <w:tcPr>
+            <w:tcW w:w="1513" w:type="dxa"/>
+          </w:tcPr>
+          <w:p>
+            <w:pPr>
+              <w:jc w:val="right"/>
+            </w:pPr>
+            <w:r>
+              <w:t>51.70</w:t>
+            </w:r>
+          </w:p>
+        </w:tc>
+        <w:tc>
+          <w:tcPr>
+            <w:tcW w:w="1513" w:type="dxa"/>
+          </w:tcPr>
+          <w:p>
+            <w:pPr>
+              <w:jc w:val="right"/>
+            </w:pPr>
+            <w:r>
+              <w:t>0.5037</w:t>
+            </w:r>
+          </w:p>
+        </w:tc>
+      </w:tr>
+    </w:tbl>
     <w:p>
       <w:pPr/>
       <w:r>
         <w:t>Tijekom faze validacije, modeli su evaluirani na podacima iz 2023. godine za svih 54 dionice. Za svaku dionicu izračunate su vrijednosti pet ključnih metrika: točnost (Accuracy), preciznost (Precision), odziv (Recall), F1-mjera (F1-score) i površina ispod ROC krivulje (ROC-AUC). U Tablici 4.1 prikazane su prosječne vrijednosti tih metrika izračunate na svim dionicama kako bi se dobio agregirani uvid u performanse modela.</w:t>
+        <w:br/>
+        <w:t>Matematički, ove se klasifikacijske metrika temelje na broju stvarno pozitivnih ($TP$), stvarno negativnih ($TN$), lažno pozitivnih ($FP$) i lažno negativnih ($FN$) predviđanja na sljedeći način:</w:t>
+      </w:r>
+    </w:p>
+    <w:p>
+      <w:pPr/>
+      <w:r>
+        <w:t>1. Točnost (Accuracy) predstavlja omjer ispravno klasificiranih dana i ukupnog broja dana:</w:t>
+        <w:br/>
+        <w:t>$$Accuracy = \frac{TP + TN}{TP + TN + FP + FN}$$</w:t>
+      </w:r>
+    </w:p>
+    <w:p>
+      <w:pPr/>
+      <w:r>
+        <w:t>2. Preciznost (Precision) mjeri vjerojatnost da je cijena dionice stvarno porasla kada je model predvidio rast:</w:t>
+        <w:br/>
+        <w:t>$$Precision = \frac{TP}{TP + FP}$$</w:t>
+      </w:r>
+    </w:p>
+    <w:p>
+      <w:pPr/>
+      <w:r>
+        <w:t>3. Odziv (Recall) mjeri udio stvarnih dana rasta koje je model uspješno prepoznao:</w:t>
+        <w:br/>
+        <w:t>$$Recall = \frac{TP}{TP + FN}$$</w:t>
+      </w:r>
+    </w:p>
+    <w:p>
+      <w:pPr/>
+      <w:r>
+        <w:t>4. F1-mjera predstavlja harmonijsku sredinu preciznosti i odziva, pružajući stabilnu ocjenu na neuravnoteženim klasama:</w:t>
+        <w:br/>
+        <w:t>$$F1 = 2 \cdot \frac{Precision \cdot Recall}{Precision + Recall}$$</w:t>
+      </w:r>
+    </w:p>
+    <w:p>
+      <w:pPr/>
+      <w:r>
+        <w:t>5. Budući da previđanje rasta i pada dionica nosi različite težine, u radu se koristi Macro F1-mjera koja predstavlja aritmetičku sredinu F1-mjera za obje klase, osiguravajući da model podjednako dobro prepoznaje i dane rasta (klasa 1) i dane pada (klasa 0):</w:t>
+        <w:br/>
+        <w:t>$$Macro\ F1 = \frac{F1_{klasa\ 0} + F1_{klasa\ 1}}{2}$$</w:t>
+      </w:r>
+    </w:p>
+    <w:p>
+      <w:pPr/>
+      <w:r>
+        <w:t>Prosječne ostvarene vrijednosti na validacijskom skupu prikazane su u Tablici 4.1.</w:t>
       </w:r>
     </w:p>
     <w:tbl>
@@ -13163,7 +13893,7 @@
     <w:p>
       <w:pPr/>
       <w:r>
-        <w:t>Iz Tablice 4.1 vidljivo je da model XGBoost ostvaruje najbolje prosječne rezultate na validacijskom skupu, s prosječnom točnošću od 53.45% i F1-mjerom od 55.08%. XGBoost-ova stabilnost proizlazi iz njegove prirode sekvencijalnog učenja, gdje svako sljedeće stablo odluke ispravlja pogreške prethodnih stabala, uz ugrađenu L1 i L2 regularizaciju koja sprječava prenaučenost na šumovitim podacima dionica.</w:t>
+        <w:t>Iz Tablice 4.1 vidljivo je da model XGBoost ostvaruje najbolje prosječne rezultate na validacijskom skupu, s prosječnom točnošću od 53.45% i F1-mjerom od 55.08%. XGBoost-ova stabilnost proizlazi iz njegove prirode sekvencijalnog učenja, gdje svako sljedeće stablo odluke ispravlja pogreške prethodnih stabala, uz ugrađenu L1 i L2 regularizaciju koja sprječava prenaučenost na šumovitim podacima dionica. Ova sposobnost je od ključne važnosti u financijskim predviđanjima gdje je razina tržišnog šuma izuzetno visoka, a sirovi podaci skloni brzim promjenama trenda.</w:t>
         <w:br/>
         <w:t>Logistička regresija se pokazala kao iznenađujuće konkurentan bazni model, ostvarivši točnost od 52.89% i F1-mjerom od 53.35%. Visoka stabilnost ovog linearnog modela izravna je posljedica primjene L2 regularizacije i manualne standardizacije podataka (ManualStandardScaler), što je neutraliziralo utjecaj ekstremnih vrijednosti u tehničkim indikatorima. LSTM neuronska mreža ostvaruje prosječnu F1-mjeru od 52.29%, pokazujući sposobnost učenja sekvencijalnih obrazaca iz desetodnevnog povijesnog prozora, ali je pokazala i visoku osjetljivost na šum u usporedbi s XGBoost-om. Slučajne šume bilježe najniže prosječne performanse (51.70% F1-score) jer bagging algoritam teže pronalazi stabilne granice odluke na financijskim podacima koji imaju izrazito nizak omjer signala i šuma.</w:t>
       </w:r>
@@ -13183,15 +13913,13 @@
       </w:r>
     </w:p>
     <w:p>
-      <w:pPr/>
       <w:r>
         <w:t>Nakon validacije, modeli su evaluirani na testnom skupu podataka koji obuhvaća cijelu 2024. godinu. Budući da su se dinamike tržišta u 2024. značajno promijenile (visoka volatilnost i makroekonomska tranzicija), rezultati pokazuju da niti jedan pojedinačni model nije optimalan za sve financijske instrumente. Iz tog je razloga za svaku od 54 dionice izabran model koji je ostvario najveću F1-mjeru na testu. Distribucija optimalnih modela po dionicama prikazana je u Tablici 4.2.</w:t>
       </w:r>
     </w:p>
     <w:tbl>
       <w:tblPr>
-        <w:tblW w:type="auto" w:w="0"/>
-        <w:tblLook w:firstColumn="1" w:firstRow="1" w:lastColumn="0" w:lastRow="0" w:noHBand="0" w:noVBand="1" w:val="04A0"/>
+        <w:tblW w:w="0" w:type="auto"/>
         <w:tblBorders>
           <w:top w:val="single" w:sz="4" w:space="0" w:color="CCCCCC"/>
           <w:left w:val="single" w:sz="4" w:space="0" w:color="CCCCCC"/>
@@ -13202,10 +13930,11 @@
         </w:tblBorders>
         <w:tblCellMar>
           <w:top w:w="120" w:type="dxa"/>
+          <w:left w:w="150" w:type="dxa"/>
           <w:bottom w:w="120" w:type="dxa"/>
-          <w:left w:w="150" w:type="dxa"/>
           <w:right w:w="150" w:type="dxa"/>
         </w:tblCellMar>
+        <w:tblLook w:val="04A0" w:firstRow="1" w:lastRow="0" w:firstColumn="1" w:lastColumn="0" w:noHBand="0" w:noVBand="1"/>
       </w:tblPr>
       <w:tblGrid>
         <w:gridCol w:w="3025"/>
@@ -13215,14 +13944,10 @@
       <w:tr>
         <w:tc>
           <w:tcPr>
-            <w:tcW w:type="dxa" w:w="3025"/>
+            <w:tcW w:w="3025" w:type="dxa"/>
             <w:shd w:val="clear" w:color="auto" w:fill="F2F2F2"/>
           </w:tcPr>
           <w:p>
-            <w:pPr>
-              <w:jc w:val="left"/>
-            </w:pPr>
-            <w:r/>
             <w:r>
               <w:rPr>
                 <w:b/>
@@ -13233,14 +13958,13 @@
         </w:tc>
         <w:tc>
           <w:tcPr>
-            <w:tcW w:type="dxa" w:w="3025"/>
+            <w:tcW w:w="3025" w:type="dxa"/>
             <w:shd w:val="clear" w:color="auto" w:fill="F2F2F2"/>
           </w:tcPr>
           <w:p>
             <w:pPr>
               <w:jc w:val="right"/>
             </w:pPr>
-            <w:r/>
             <w:r>
               <w:rPr>
                 <w:b/>
@@ -13251,14 +13975,13 @@
         </w:tc>
         <w:tc>
           <w:tcPr>
-            <w:tcW w:type="dxa" w:w="3025"/>
+            <w:tcW w:w="3025" w:type="dxa"/>
             <w:shd w:val="clear" w:color="auto" w:fill="F2F2F2"/>
           </w:tcPr>
           <w:p>
             <w:pPr>
               <w:jc w:val="right"/>
             </w:pPr>
-            <w:r/>
             <w:r>
               <w:rPr>
                 <w:b/>
@@ -13271,13 +13994,9 @@
       <w:tr>
         <w:tc>
           <w:tcPr>
-            <w:tcW w:type="dxa" w:w="3025"/>
-          </w:tcPr>
-          <w:p>
-            <w:pPr>
-              <w:jc w:val="left"/>
-            </w:pPr>
-            <w:r/>
+            <w:tcW w:w="3025" w:type="dxa"/>
+          </w:tcPr>
+          <w:p>
             <w:r>
               <w:t>XGBoost</w:t>
             </w:r>
@@ -13285,13 +14004,12 @@
         </w:tc>
         <w:tc>
           <w:tcPr>
-            <w:tcW w:type="dxa" w:w="3025"/>
+            <w:tcW w:w="3025" w:type="dxa"/>
           </w:tcPr>
           <w:p>
             <w:pPr>
               <w:jc w:val="right"/>
             </w:pPr>
-            <w:r/>
             <w:r>
               <w:t>17</w:t>
             </w:r>
@@ -13299,13 +14017,12 @@
         </w:tc>
         <w:tc>
           <w:tcPr>
-            <w:tcW w:type="dxa" w:w="3025"/>
+            <w:tcW w:w="3025" w:type="dxa"/>
           </w:tcPr>
           <w:p>
             <w:pPr>
               <w:jc w:val="right"/>
             </w:pPr>
-            <w:r/>
             <w:r>
               <w:t>31.48</w:t>
             </w:r>
@@ -13315,13 +14032,9 @@
       <w:tr>
         <w:tc>
           <w:tcPr>
-            <w:tcW w:type="dxa" w:w="3025"/>
-          </w:tcPr>
-          <w:p>
-            <w:pPr>
-              <w:jc w:val="left"/>
-            </w:pPr>
-            <w:r/>
+            <w:tcW w:w="3025" w:type="dxa"/>
+          </w:tcPr>
+          <w:p>
             <w:r>
               <w:t>Logistic Regression</w:t>
             </w:r>
@@ -13329,13 +14042,12 @@
         </w:tc>
         <w:tc>
           <w:tcPr>
-            <w:tcW w:type="dxa" w:w="3025"/>
+            <w:tcW w:w="3025" w:type="dxa"/>
           </w:tcPr>
           <w:p>
             <w:pPr>
               <w:jc w:val="right"/>
             </w:pPr>
-            <w:r/>
             <w:r>
               <w:t>15</w:t>
             </w:r>
@@ -13343,13 +14055,12 @@
         </w:tc>
         <w:tc>
           <w:tcPr>
-            <w:tcW w:type="dxa" w:w="3025"/>
+            <w:tcW w:w="3025" w:type="dxa"/>
           </w:tcPr>
           <w:p>
             <w:pPr>
               <w:jc w:val="right"/>
             </w:pPr>
-            <w:r/>
             <w:r>
               <w:t>27.78</w:t>
             </w:r>
@@ -13359,13 +14070,9 @@
       <w:tr>
         <w:tc>
           <w:tcPr>
-            <w:tcW w:type="dxa" w:w="3025"/>
-          </w:tcPr>
-          <w:p>
-            <w:pPr>
-              <w:jc w:val="left"/>
-            </w:pPr>
-            <w:r/>
+            <w:tcW w:w="3025" w:type="dxa"/>
+          </w:tcPr>
+          <w:p>
             <w:r>
               <w:t>LSTM</w:t>
             </w:r>
@@ -13373,13 +14080,12 @@
         </w:tc>
         <w:tc>
           <w:tcPr>
-            <w:tcW w:type="dxa" w:w="3025"/>
+            <w:tcW w:w="3025" w:type="dxa"/>
           </w:tcPr>
           <w:p>
             <w:pPr>
               <w:jc w:val="right"/>
             </w:pPr>
-            <w:r/>
             <w:r>
               <w:t>14</w:t>
             </w:r>
@@ -13387,13 +14093,12 @@
         </w:tc>
         <w:tc>
           <w:tcPr>
-            <w:tcW w:type="dxa" w:w="3025"/>
+            <w:tcW w:w="3025" w:type="dxa"/>
           </w:tcPr>
           <w:p>
             <w:pPr>
               <w:jc w:val="right"/>
             </w:pPr>
-            <w:r/>
             <w:r>
               <w:t>25.93</w:t>
             </w:r>
@@ -13403,13 +14108,9 @@
       <w:tr>
         <w:tc>
           <w:tcPr>
-            <w:tcW w:type="dxa" w:w="3025"/>
-          </w:tcPr>
-          <w:p>
-            <w:pPr>
-              <w:jc w:val="left"/>
-            </w:pPr>
-            <w:r/>
+            <w:tcW w:w="3025" w:type="dxa"/>
+          </w:tcPr>
+          <w:p>
             <w:r>
               <w:t>Random Forest</w:t>
             </w:r>
@@ -13417,13 +14118,12 @@
         </w:tc>
         <w:tc>
           <w:tcPr>
-            <w:tcW w:type="dxa" w:w="3025"/>
+            <w:tcW w:w="3025" w:type="dxa"/>
           </w:tcPr>
           <w:p>
             <w:pPr>
               <w:jc w:val="right"/>
             </w:pPr>
-            <w:r/>
             <w:r>
               <w:t>8</w:t>
             </w:r>
@@ -13431,13 +14131,12 @@
         </w:tc>
         <w:tc>
           <w:tcPr>
-            <w:tcW w:type="dxa" w:w="3025"/>
+            <w:tcW w:w="3025" w:type="dxa"/>
           </w:tcPr>
           <w:p>
             <w:pPr>
               <w:jc w:val="right"/>
             </w:pPr>
-            <w:r/>
             <w:r>
               <w:t>14.81</w:t>
             </w:r>
@@ -13447,13 +14146,9 @@
       <w:tr>
         <w:tc>
           <w:tcPr>
-            <w:tcW w:type="dxa" w:w="3025"/>
-          </w:tcPr>
-          <w:p>
-            <w:pPr>
-              <w:jc w:val="left"/>
-            </w:pPr>
-            <w:r/>
+            <w:tcW w:w="3025" w:type="dxa"/>
+          </w:tcPr>
+          <w:p>
             <w:r>
               <w:t>Ukupno</w:t>
             </w:r>
@@ -13461,13 +14156,12 @@
         </w:tc>
         <w:tc>
           <w:tcPr>
-            <w:tcW w:type="dxa" w:w="3025"/>
+            <w:tcW w:w="3025" w:type="dxa"/>
           </w:tcPr>
           <w:p>
             <w:pPr>
               <w:jc w:val="right"/>
             </w:pPr>
-            <w:r/>
             <w:r>
               <w:t>54</w:t>
             </w:r>
@@ -13475,13 +14169,12 @@
         </w:tc>
         <w:tc>
           <w:tcPr>
-            <w:tcW w:type="dxa" w:w="3025"/>
+            <w:tcW w:w="3025" w:type="dxa"/>
           </w:tcPr>
           <w:p>
             <w:pPr>
               <w:jc w:val="right"/>
             </w:pPr>
-            <w:r/>
             <w:r>
               <w:t>100.00</w:t>
             </w:r>
@@ -13490,13 +14183,11 @@
       </w:tr>
     </w:tbl>
     <w:p>
-      <w:pPr/>
       <w:r>
         <w:t>Tablica 4.2: Broj dionica za koje je pojedini model ostvario najbolje performanse na testnom skupu (2024. godina)</w:t>
       </w:r>
     </w:p>
     <w:p>
-      <w:pPr/>
       <w:r>
         <w:t>Podaci iz Tablice 4.2 pokazuju da je XGBoost optimalan model za najveći broj dionica (17 dionica, odnosno 31.48%), prvenstveno na dionicama s jasnim i jakim trendovima rasta, poput tehnoloških dionica MSFT, AMD i INTC. Logistička regresija je bila optimalna za 15 dionica (27.78%), uglavnom iz tradicionalnijih i stabilnijih sektora (poput energetike i potrošačkih dobara, npr. XOM i KO). U takvim sektorima jednostavnija, linearna granica odluke štiti model od prebrzog reagiranja na kratkoročni šum. LSTM neuronska mreža ostvarila je najbolji rezultat na 14 dionica (25.93%), pokazujući izvrsne rezultate na dionicama s izraženom sekvencijalnom ovisnošću (npr. GOOGL, AVGO, CSCO), gdje povijest od 10 dana pruža snažan prediktivni signal. Random Forest je ostvario najbolji rezultat na 8 dionica (14.81%), npr. AAPL i META, što ukazuje na to da bagging pruža stabilnost na određenim volatilnim dionicama.</w:t>
       </w:r>
@@ -13506,17 +14197,19 @@
         <w:pStyle w:val="Naslov2"/>
       </w:pPr>
       <w:r>
-        <w:t>4.3. Utjecaj optimizacije klasifikacijskog praga (Threshold Tuning)</w:t>
-      </w:r>
-    </w:p>
-    <w:p>
-      <w:pPr/>
+        <w:t xml:space="preserve">4.3. Utjecaj optimizacije klasifikacijskog praga (Threshold </w:t>
+      </w:r>
+      <w:r>
+        <w:lastRenderedPageBreak/>
+        <w:t>Tuning)</w:t>
+      </w:r>
+    </w:p>
+    <w:p>
       <w:r>
         <w:t>Fino podešavanje klasifikacijskog praga pokazalo se kao jedan od najvažnijih koraka u implementaciji. Zbog asimetrije financijskih tržišta, vjerojatnosti koje modeli predviđaju rijetko su savršeno centrirane oko standardne vrijednosti 0.50. Pretraživanjem pragova od 0.35 do 0.65 na validacijskom skupu i odabirom praga koji maksimizira Macro F1-score, modeli su se prilagodili specifičnoj dinamici svake pojedine dionice. Na primjer, za dionicu AAPL model Random Forest ostvario je najbolje rezultate s pragom od 0.49, dok je za dionicu NVIDIA (NVDA) model LSTM zahtijevao stroži prag od 0.54 kako bi se minimizirali lažno pozitivni signali. Primjena optimiziranih pragova iz thresholds.json dovela je do prosječnog povećanja Macro F1-mjere za 2.3 postotna boda na testnom skupu u odnosu na standardni prag od 0.50.</w:t>
       </w:r>
     </w:p>
     <w:p>
-      <w:pPr/>
       <w:r>
         <w:t>[PREPORUKA ZA GRAFIKON 4.2: Ovdje umetnuti grafikon iz Jupyter bilježnice koji prikazuje utjecaj promjene praga klasifikacije (x-os od 0.35 do 0.65) na vrijednost Macro F1-score metrike (y-os) na validacijskom skupu za odabranu dionicu (npr. AAPL za Random Forest). Grafikon treba jasno prikazati krivulju s vrhom (maksimumom) na optimalnom pragu, zorno ilustrirajući postupak Threshold Tuninga opisanog u poglavlju 3.6.]</w:t>
       </w:r>
@@ -13532,7 +14225,19 @@
     <w:p>
       <w:pPr/>
       <w:r>
-        <w:t>LSTM neuronska mreža predstavlja najkompleksniji model korišten u radu, s trodimenzionalnim ulazom dimenzija [batch_size, 10, 25]. Mreža analizira povijesni prozor od 10 dana (lookback) s 25 tehničkih i makroekonomskih značajki. Korištenjem validacijskog skupa podataka i mehanizma rane obustave (Early Stopping) s parametrom strpljenja (patience) od 5 epoha, uspješno je spriječena prenaučenost (overfitting). Za većinu dionica proces treniranja se obustavio između 12. i 20. epohe, budući da je gubitak na validacijskom skupu dosegnuo svoj minimum i počeo blago stagnirati ili rasti, dok je gubitak na trening skupu nastavio opadati. Ovaj mehanizam osigurao je da LSTM mreža zadrži sposobnost generalizacije i uspješno predviđa smjer kretanja na testnim podacima.</w:t>
+        <w:t>LSTM neuronska mreža predstavlja najkompleksniji model korišten u radu, s trodimenzionalnim ulazom dimenzija [batch_size, 10, 25]. Mreža analizira povijesni prozor od 10 dana (lookback) s 25 tehničkih i makroekonomskih značajki. Korištenjem validacijskog skupa podataka i mehanizma rane obustave (Early Stopping) s parametrom strpljenja (patience) od 5 epoha, uspješno je spriječena prenaučenost (overfitting). Tijekom treniranja, model optimizira funkciju gubitka binarne unakrsne entropije (Binary Cross-Entropy Loss):</w:t>
+      </w:r>
+    </w:p>
+    <w:p>
+      <w:pPr/>
+      <w:r>
+        <w:t>$$\mathcal{L}_{BCE} = -\frac{1}{N} \sum_{i=1}^{N} \left[ y_i \log(\hat{y}_i) + (1 - y_i) \log(1 - \hat{y}_i) \right]$$</w:t>
+      </w:r>
+    </w:p>
+    <w:p>
+      <w:pPr/>
+      <w:r>
+        <w:t>gdje je $y_i$ stvarna klasa ($y_i \in \{0, 1\}$), $\hat{y}_i$ vjerojatnost rasta predviđena od strane LSTM mreže, a $N$ broj uzoraka u trenutačnoj grupi (batch). Praćenjem kretanja $\mathcal{L}_{BCE}$ kroz epohe, uočava se stabilna konvergencija. Za većinu dionica proces treniranja se obustavio između 12. i 20. epohe, budući da je gubitak na validacijskom skupu dosegnuo svoj minimum i počeo blago stagnirati ili rasti, dok je gubitak na trening skupu nastavio linearno opadati. Ovaj mehanizam osigurao je da LSTM mreža zadrži sposobnost generalizacije i uspješno predviđa smjer kretanja na testnim podacima.</w:t>
       </w:r>
     </w:p>
     <w:p>
@@ -13556,15 +14261,13 @@
       </w:r>
     </w:p>
     <w:p>
-      <w:pPr/>
       <w:r>
         <w:t>Razumijevanje čimbenika koji najviše utječu na predviđanja modela ključno je za financijsko tumačenje. Na temelju modela XGBoost, izračunata je prosječna važnost značajki na svim dionicama kroz mjeru smanjenja nečistoće (Gini važnost). Rezultati za top 10 najvažnijih značajki spremljeni su u top_features.csv i prikazani u Tablici 4.3.</w:t>
       </w:r>
     </w:p>
     <w:tbl>
       <w:tblPr>
-        <w:tblW w:type="auto" w:w="0"/>
-        <w:tblLook w:firstColumn="1" w:firstRow="1" w:lastColumn="0" w:lastRow="0" w:noHBand="0" w:noVBand="1" w:val="04A0"/>
+        <w:tblW w:w="0" w:type="auto"/>
         <w:tblBorders>
           <w:top w:val="single" w:sz="4" w:space="0" w:color="CCCCCC"/>
           <w:left w:val="single" w:sz="4" w:space="0" w:color="CCCCCC"/>
@@ -13575,10 +14278,11 @@
         </w:tblBorders>
         <w:tblCellMar>
           <w:top w:w="120" w:type="dxa"/>
+          <w:left w:w="150" w:type="dxa"/>
           <w:bottom w:w="120" w:type="dxa"/>
-          <w:left w:w="150" w:type="dxa"/>
           <w:right w:w="150" w:type="dxa"/>
         </w:tblCellMar>
+        <w:tblLook w:val="04A0" w:firstRow="1" w:lastRow="0" w:firstColumn="1" w:lastColumn="0" w:noHBand="0" w:noVBand="1"/>
       </w:tblPr>
       <w:tblGrid>
         <w:gridCol w:w="3025"/>
@@ -13588,14 +14292,10 @@
       <w:tr>
         <w:tc>
           <w:tcPr>
-            <w:tcW w:type="dxa" w:w="3025"/>
+            <w:tcW w:w="3025" w:type="dxa"/>
             <w:shd w:val="clear" w:color="auto" w:fill="F2F2F2"/>
           </w:tcPr>
           <w:p>
-            <w:pPr>
-              <w:jc w:val="left"/>
-            </w:pPr>
-            <w:r/>
             <w:r>
               <w:rPr>
                 <w:b/>
@@ -13606,14 +14306,10 @@
         </w:tc>
         <w:tc>
           <w:tcPr>
-            <w:tcW w:type="dxa" w:w="3025"/>
+            <w:tcW w:w="3025" w:type="dxa"/>
             <w:shd w:val="clear" w:color="auto" w:fill="F2F2F2"/>
           </w:tcPr>
           <w:p>
-            <w:pPr>
-              <w:jc w:val="left"/>
-            </w:pPr>
-            <w:r/>
             <w:r>
               <w:rPr>
                 <w:b/>
@@ -13624,14 +14320,13 @@
         </w:tc>
         <w:tc>
           <w:tcPr>
-            <w:tcW w:type="dxa" w:w="3025"/>
+            <w:tcW w:w="3025" w:type="dxa"/>
             <w:shd w:val="clear" w:color="auto" w:fill="F2F2F2"/>
           </w:tcPr>
           <w:p>
             <w:pPr>
               <w:jc w:val="right"/>
             </w:pPr>
-            <w:r/>
             <w:r>
               <w:rPr>
                 <w:b/>
@@ -13644,13 +14339,9 @@
       <w:tr>
         <w:tc>
           <w:tcPr>
-            <w:tcW w:type="dxa" w:w="3025"/>
-          </w:tcPr>
-          <w:p>
-            <w:pPr>
-              <w:jc w:val="left"/>
-            </w:pPr>
-            <w:r/>
+            <w:tcW w:w="3025" w:type="dxa"/>
+          </w:tcPr>
+          <w:p>
             <w:r>
               <w:t>close_to_sma_20</w:t>
             </w:r>
@@ -13658,13 +14349,9 @@
         </w:tc>
         <w:tc>
           <w:tcPr>
-            <w:tcW w:type="dxa" w:w="3025"/>
-          </w:tcPr>
-          <w:p>
-            <w:pPr>
-              <w:jc w:val="left"/>
-            </w:pPr>
-            <w:r/>
+            <w:tcW w:w="3025" w:type="dxa"/>
+          </w:tcPr>
+          <w:p>
             <w:r>
               <w:t>Udaljenost cijene od 20-dnevnog pomičnog prosjeka</w:t>
             </w:r>
@@ -13672,13 +14359,12 @@
         </w:tc>
         <w:tc>
           <w:tcPr>
-            <w:tcW w:type="dxa" w:w="3025"/>
+            <w:tcW w:w="3025" w:type="dxa"/>
           </w:tcPr>
           <w:p>
             <w:pPr>
               <w:jc w:val="right"/>
             </w:pPr>
-            <w:r/>
             <w:r>
               <w:t>4.42</w:t>
             </w:r>
@@ -13688,13 +14374,9 @@
       <w:tr>
         <w:tc>
           <w:tcPr>
-            <w:tcW w:type="dxa" w:w="3025"/>
-          </w:tcPr>
-          <w:p>
-            <w:pPr>
-              <w:jc w:val="left"/>
-            </w:pPr>
-            <w:r/>
+            <w:tcW w:w="3025" w:type="dxa"/>
+          </w:tcPr>
+          <w:p>
             <w:r>
               <w:t>return_10d</w:t>
             </w:r>
@@ -13702,13 +14384,9 @@
         </w:tc>
         <w:tc>
           <w:tcPr>
-            <w:tcW w:type="dxa" w:w="3025"/>
-          </w:tcPr>
-          <w:p>
-            <w:pPr>
-              <w:jc w:val="left"/>
-            </w:pPr>
-            <w:r/>
+            <w:tcW w:w="3025" w:type="dxa"/>
+          </w:tcPr>
+          <w:p>
             <w:r>
               <w:t>10-dnevni povijesni povrat dionice</w:t>
             </w:r>
@@ -13716,13 +14394,12 @@
         </w:tc>
         <w:tc>
           <w:tcPr>
-            <w:tcW w:type="dxa" w:w="3025"/>
+            <w:tcW w:w="3025" w:type="dxa"/>
           </w:tcPr>
           <w:p>
             <w:pPr>
               <w:jc w:val="right"/>
             </w:pPr>
-            <w:r/>
             <w:r>
               <w:t>4.40</w:t>
             </w:r>
@@ -13732,13 +14409,9 @@
       <w:tr>
         <w:tc>
           <w:tcPr>
-            <w:tcW w:type="dxa" w:w="3025"/>
-          </w:tcPr>
-          <w:p>
-            <w:pPr>
-              <w:jc w:val="left"/>
-            </w:pPr>
-            <w:r/>
+            <w:tcW w:w="3025" w:type="dxa"/>
+          </w:tcPr>
+          <w:p>
             <w:r>
               <w:t>close_to_sma_10</w:t>
             </w:r>
@@ -13746,13 +14419,9 @@
         </w:tc>
         <w:tc>
           <w:tcPr>
-            <w:tcW w:type="dxa" w:w="3025"/>
-          </w:tcPr>
-          <w:p>
-            <w:pPr>
-              <w:jc w:val="left"/>
-            </w:pPr>
-            <w:r/>
+            <w:tcW w:w="3025" w:type="dxa"/>
+          </w:tcPr>
+          <w:p>
             <w:r>
               <w:t>Udaljenost cijene od 10-dnevnog pomičnog prosjeka</w:t>
             </w:r>
@@ -13760,13 +14429,12 @@
         </w:tc>
         <w:tc>
           <w:tcPr>
-            <w:tcW w:type="dxa" w:w="3025"/>
+            <w:tcW w:w="3025" w:type="dxa"/>
           </w:tcPr>
           <w:p>
             <w:pPr>
               <w:jc w:val="right"/>
             </w:pPr>
-            <w:r/>
             <w:r>
               <w:t>4.36</w:t>
             </w:r>
@@ -13776,13 +14444,9 @@
       <w:tr>
         <w:tc>
           <w:tcPr>
-            <w:tcW w:type="dxa" w:w="3025"/>
-          </w:tcPr>
-          <w:p>
-            <w:pPr>
-              <w:jc w:val="left"/>
-            </w:pPr>
-            <w:r/>
+            <w:tcW w:w="3025" w:type="dxa"/>
+          </w:tcPr>
+          <w:p>
             <w:r>
               <w:t>close_to_sma_50</w:t>
             </w:r>
@@ -13790,13 +14454,9 @@
         </w:tc>
         <w:tc>
           <w:tcPr>
-            <w:tcW w:type="dxa" w:w="3025"/>
-          </w:tcPr>
-          <w:p>
-            <w:pPr>
-              <w:jc w:val="left"/>
-            </w:pPr>
-            <w:r/>
+            <w:tcW w:w="3025" w:type="dxa"/>
+          </w:tcPr>
+          <w:p>
             <w:r>
               <w:t>Udaljenost cijene od 50-dnevnog pomičnog prosjeka</w:t>
             </w:r>
@@ -13804,13 +14464,12 @@
         </w:tc>
         <w:tc>
           <w:tcPr>
-            <w:tcW w:type="dxa" w:w="3025"/>
+            <w:tcW w:w="3025" w:type="dxa"/>
           </w:tcPr>
           <w:p>
             <w:pPr>
               <w:jc w:val="right"/>
             </w:pPr>
-            <w:r/>
             <w:r>
               <w:t>4.33</w:t>
             </w:r>
@@ -13820,27 +14479,20 @@
       <w:tr>
         <w:tc>
           <w:tcPr>
-            <w:tcW w:type="dxa" w:w="3025"/>
-          </w:tcPr>
-          <w:p>
-            <w:pPr>
-              <w:jc w:val="left"/>
-            </w:pPr>
-            <w:r/>
-            <w:r>
+            <w:tcW w:w="3025" w:type="dxa"/>
+          </w:tcPr>
+          <w:p>
+            <w:r>
+              <w:lastRenderedPageBreak/>
               <w:t>bb_position</w:t>
             </w:r>
           </w:p>
         </w:tc>
         <w:tc>
           <w:tcPr>
-            <w:tcW w:type="dxa" w:w="3025"/>
-          </w:tcPr>
-          <w:p>
-            <w:pPr>
-              <w:jc w:val="left"/>
-            </w:pPr>
-            <w:r/>
+            <w:tcW w:w="3025" w:type="dxa"/>
+          </w:tcPr>
+          <w:p>
             <w:r>
               <w:t>Pozicija cijene unutar Bollingerovih traka</w:t>
             </w:r>
@@ -13848,13 +14500,12 @@
         </w:tc>
         <w:tc>
           <w:tcPr>
-            <w:tcW w:type="dxa" w:w="3025"/>
+            <w:tcW w:w="3025" w:type="dxa"/>
           </w:tcPr>
           <w:p>
             <w:pPr>
               <w:jc w:val="right"/>
             </w:pPr>
-            <w:r/>
             <w:r>
               <w:t>4.29</w:t>
             </w:r>
@@ -13864,13 +14515,9 @@
       <w:tr>
         <w:tc>
           <w:tcPr>
-            <w:tcW w:type="dxa" w:w="3025"/>
-          </w:tcPr>
-          <w:p>
-            <w:pPr>
-              <w:jc w:val="left"/>
-            </w:pPr>
-            <w:r/>
+            <w:tcW w:w="3025" w:type="dxa"/>
+          </w:tcPr>
+          <w:p>
             <w:r>
               <w:t>return_5d</w:t>
             </w:r>
@@ -13878,13 +14525,9 @@
         </w:tc>
         <w:tc>
           <w:tcPr>
-            <w:tcW w:type="dxa" w:w="3025"/>
-          </w:tcPr>
-          <w:p>
-            <w:pPr>
-              <w:jc w:val="left"/>
-            </w:pPr>
-            <w:r/>
+            <w:tcW w:w="3025" w:type="dxa"/>
+          </w:tcPr>
+          <w:p>
             <w:r>
               <w:t>5-dnevni povijesni povrat dionice</w:t>
             </w:r>
@@ -13892,13 +14535,12 @@
         </w:tc>
         <w:tc>
           <w:tcPr>
-            <w:tcW w:type="dxa" w:w="3025"/>
+            <w:tcW w:w="3025" w:type="dxa"/>
           </w:tcPr>
           <w:p>
             <w:pPr>
               <w:jc w:val="right"/>
             </w:pPr>
-            <w:r/>
             <w:r>
               <w:t>4.27</w:t>
             </w:r>
@@ -13908,13 +14550,9 @@
       <w:tr>
         <w:tc>
           <w:tcPr>
-            <w:tcW w:type="dxa" w:w="3025"/>
-          </w:tcPr>
-          <w:p>
-            <w:pPr>
-              <w:jc w:val="left"/>
-            </w:pPr>
-            <w:r/>
+            <w:tcW w:w="3025" w:type="dxa"/>
+          </w:tcPr>
+          <w:p>
             <w:r>
               <w:t>close_to_sma_5</w:t>
             </w:r>
@@ -13922,13 +14560,9 @@
         </w:tc>
         <w:tc>
           <w:tcPr>
-            <w:tcW w:type="dxa" w:w="3025"/>
-          </w:tcPr>
-          <w:p>
-            <w:pPr>
-              <w:jc w:val="left"/>
-            </w:pPr>
-            <w:r/>
+            <w:tcW w:w="3025" w:type="dxa"/>
+          </w:tcPr>
+          <w:p>
             <w:r>
               <w:t>Udaljenost cijene od 5-dnevnog pomičnog prosjeka</w:t>
             </w:r>
@@ -13936,13 +14570,12 @@
         </w:tc>
         <w:tc>
           <w:tcPr>
-            <w:tcW w:type="dxa" w:w="3025"/>
+            <w:tcW w:w="3025" w:type="dxa"/>
           </w:tcPr>
           <w:p>
             <w:pPr>
               <w:jc w:val="right"/>
             </w:pPr>
-            <w:r/>
             <w:r>
               <w:t>4.25</w:t>
             </w:r>
@@ -13952,13 +14585,9 @@
       <w:tr>
         <w:tc>
           <w:tcPr>
-            <w:tcW w:type="dxa" w:w="3025"/>
-          </w:tcPr>
-          <w:p>
-            <w:pPr>
-              <w:jc w:val="left"/>
-            </w:pPr>
-            <w:r/>
+            <w:tcW w:w="3025" w:type="dxa"/>
+          </w:tcPr>
+          <w:p>
             <w:r>
               <w:t>vix_close</w:t>
             </w:r>
@@ -13966,13 +14595,9 @@
         </w:tc>
         <w:tc>
           <w:tcPr>
-            <w:tcW w:type="dxa" w:w="3025"/>
-          </w:tcPr>
-          <w:p>
-            <w:pPr>
-              <w:jc w:val="left"/>
-            </w:pPr>
-            <w:r/>
+            <w:tcW w:w="3025" w:type="dxa"/>
+          </w:tcPr>
+          <w:p>
             <w:r>
               <w:t>Vrijednost VIX indeksa volatilnosti</w:t>
             </w:r>
@@ -13980,13 +14605,12 @@
         </w:tc>
         <w:tc>
           <w:tcPr>
-            <w:tcW w:type="dxa" w:w="3025"/>
+            <w:tcW w:w="3025" w:type="dxa"/>
           </w:tcPr>
           <w:p>
             <w:pPr>
               <w:jc w:val="right"/>
             </w:pPr>
-            <w:r/>
             <w:r>
               <w:t>4.23</w:t>
             </w:r>
@@ -13996,13 +14620,9 @@
       <w:tr>
         <w:tc>
           <w:tcPr>
-            <w:tcW w:type="dxa" w:w="3025"/>
-          </w:tcPr>
-          <w:p>
-            <w:pPr>
-              <w:jc w:val="left"/>
-            </w:pPr>
-            <w:r/>
+            <w:tcW w:w="3025" w:type="dxa"/>
+          </w:tcPr>
+          <w:p>
             <w:r>
               <w:t>atr_pct</w:t>
             </w:r>
@@ -14010,13 +14630,9 @@
         </w:tc>
         <w:tc>
           <w:tcPr>
-            <w:tcW w:type="dxa" w:w="3025"/>
-          </w:tcPr>
-          <w:p>
-            <w:pPr>
-              <w:jc w:val="left"/>
-            </w:pPr>
-            <w:r/>
+            <w:tcW w:w="3025" w:type="dxa"/>
+          </w:tcPr>
+          <w:p>
             <w:r>
               <w:t>Average True Range u postotku cijene</w:t>
             </w:r>
@@ -14024,13 +14640,12 @@
         </w:tc>
         <w:tc>
           <w:tcPr>
-            <w:tcW w:type="dxa" w:w="3025"/>
+            <w:tcW w:w="3025" w:type="dxa"/>
           </w:tcPr>
           <w:p>
             <w:pPr>
               <w:jc w:val="right"/>
             </w:pPr>
-            <w:r/>
             <w:r>
               <w:t>4.22</w:t>
             </w:r>
@@ -14040,13 +14655,9 @@
       <w:tr>
         <w:tc>
           <w:tcPr>
-            <w:tcW w:type="dxa" w:w="3025"/>
-          </w:tcPr>
-          <w:p>
-            <w:pPr>
-              <w:jc w:val="left"/>
-            </w:pPr>
-            <w:r/>
+            <w:tcW w:w="3025" w:type="dxa"/>
+          </w:tcPr>
+          <w:p>
             <w:r>
               <w:t>volatility_30d</w:t>
             </w:r>
@@ -14054,13 +14665,9 @@
         </w:tc>
         <w:tc>
           <w:tcPr>
-            <w:tcW w:type="dxa" w:w="3025"/>
-          </w:tcPr>
-          <w:p>
-            <w:pPr>
-              <w:jc w:val="left"/>
-            </w:pPr>
-            <w:r/>
+            <w:tcW w:w="3025" w:type="dxa"/>
+          </w:tcPr>
+          <w:p>
             <w:r>
               <w:t>30-dnevna povijesna volatilnost dionice</w:t>
             </w:r>
@@ -14068,13 +14675,12 @@
         </w:tc>
         <w:tc>
           <w:tcPr>
-            <w:tcW w:type="dxa" w:w="3025"/>
+            <w:tcW w:w="3025" w:type="dxa"/>
           </w:tcPr>
           <w:p>
             <w:pPr>
               <w:jc w:val="right"/>
             </w:pPr>
-            <w:r/>
             <w:r>
               <w:t>4.21</w:t>
             </w:r>
@@ -14083,21 +14689,20 @@
       </w:tr>
     </w:tbl>
     <w:p>
-      <w:pPr/>
       <w:r>
         <w:t>Tablica 4.3: Prikaz top 10 najvažnijih ulaznih značajki za predviđanje kretanja cijene na temelju XGBoost modela</w:t>
       </w:r>
     </w:p>
     <w:p>
-      <w:pPr/>
       <w:r>
         <w:t>Rezultati iz Tablice 4.3 pokazuju da su najvažniji prediktori relativna udaljenost cijene od njezinih pomičnih prosjeka (SMA). Konkretno, close_to_sma_20 ima najveću prosječnu važnost (4.42%), prate ga povijesni povrat u zadnjih 10 dana (return_10d, 4.40%) te udaljenost od 10-dnevnog i 50-dnevnog prosjeka. Ovi indikatori odražavaju srednjoročni trend i moment dionice, što su ključni signali za kratkoročne predikcije. Položaj cijene unutar Bollingerovih traka (bb_position) na 5. mjestu (4.29%) ukazuje na razinu prenaglašenosti trenda, odnosno na potencijalne točke preokreta.</w:t>
+      </w:r>
+      <w:r>
         <w:br/>
         <w:t>Značajka vix_close (VIX indeks volatilnosti) nalazi se na 8. mjestu (4.23%), što potvrđuje hipotezu da opća tržišna nesigurnost i volatilnost na razini cijelog tržišta izravno utječu na kretanje pojedinačnih dionica. Značajka sp500_return (povrat indeksa S&amp;P 500) također ima visoku važnost (4.19%), što ukazuje na to da model uzima u obzir sustavni tržišni rizik.</w:t>
       </w:r>
     </w:p>
     <w:p>
-      <w:pPr/>
       <w:r>
         <w:t>[PREPORUKA ZA GRAFIKON 4.5: Ovdje umetnuti SHAP summary (beeswarm) grafikon doprinosa značajki za XGBoost model na dionici AAPL. Grafikon se preuzima iz Jupyter bilježnice iz poglavlja 13 (ćelija 32). Prikazuje top 20 značajki poredanih po važnosti na y-osi te njihove SHAP vrijednosti na x-osi (utjecaj na predviđanje rasta). Svaka točka predstavlja jedan dan u validacijskom skupu, obojana od plave (niska vrijednost značajke) do crvene (visoka vrijednost). Grafikon detaljno objašnjava kako npr. niska vrijednost close_to_sma_20 (plavo) ili visoka vrijednost return_10d (crveno) pozitivno utječu na predviđanje rasta.]</w:t>
       </w:r>
@@ -14110,10 +14715,1094 @@
         <w:t>4.6. Rezultati simulacije trgovanja (Trading Simulation)</w:t>
       </w:r>
     </w:p>
+    <w:tbl>
+      <w:tblPr>
+        <w:tblW w:w="0" w:type="auto"/>
+        <w:tblBorders>
+          <w:top w:val="single" w:sz="4" w:space="0" w:color="CCCCCC"/>
+          <w:left w:val="single" w:sz="4" w:space="0" w:color="CCCCCC"/>
+          <w:bottom w:val="single" w:sz="4" w:space="0" w:color="CCCCCC"/>
+          <w:right w:val="single" w:sz="4" w:space="0" w:color="CCCCCC"/>
+          <w:insideH w:val="single" w:sz="4" w:space="0" w:color="CCCCCC"/>
+          <w:insideV w:val="single" w:sz="4" w:space="0" w:color="CCCCCC"/>
+        </w:tblBorders>
+        <w:tblCellMar>
+          <w:top w:w="120" w:type="dxa"/>
+          <w:left w:w="150" w:type="dxa"/>
+          <w:bottom w:w="120" w:type="dxa"/>
+          <w:right w:w="150" w:type="dxa"/>
+        </w:tblCellMar>
+        <w:tblLook w:val="04A0" w:firstRow="1" w:lastRow="0" w:firstColumn="1" w:lastColumn="0" w:noHBand="0" w:noVBand="1"/>
+      </w:tblPr>
+      <w:tblGrid>
+        <w:gridCol w:w="1815"/>
+        <w:gridCol w:w="1815"/>
+        <w:gridCol w:w="1815"/>
+        <w:gridCol w:w="1815"/>
+        <w:gridCol w:w="1815"/>
+      </w:tblGrid>
+      <w:tr>
+        <w:tc>
+          <w:tcPr>
+            <w:tcW w:w="1815" w:type="dxa"/>
+            <w:shd w:val="clear" w:color="auto" w:fill="F2F2F2"/>
+          </w:tcPr>
+          <w:p>
+            <w:r>
+              <w:rPr>
+                <w:b/>
+              </w:rPr>
+              <w:t>Ticker</w:t>
+            </w:r>
+          </w:p>
+        </w:tc>
+        <w:tc>
+          <w:tcPr>
+            <w:tcW w:w="1815" w:type="dxa"/>
+            <w:shd w:val="clear" w:color="auto" w:fill="F2F2F2"/>
+          </w:tcPr>
+          <w:p>
+            <w:r>
+              <w:rPr>
+                <w:b/>
+              </w:rPr>
+              <w:t>Najbolji model na testu</w:t>
+            </w:r>
+          </w:p>
+        </w:tc>
+        <w:tc>
+          <w:tcPr>
+            <w:tcW w:w="1815" w:type="dxa"/>
+            <w:shd w:val="clear" w:color="auto" w:fill="F2F2F2"/>
+          </w:tcPr>
+          <w:p>
+            <w:pPr>
+              <w:jc w:val="right"/>
+            </w:pPr>
+            <w:r>
+              <w:rPr>
+                <w:b/>
+              </w:rPr>
+              <w:t>Buy &amp; Hold povrat (%)</w:t>
+            </w:r>
+          </w:p>
+        </w:tc>
+        <w:tc>
+          <w:tcPr>
+            <w:tcW w:w="1815" w:type="dxa"/>
+            <w:shd w:val="clear" w:color="auto" w:fill="F2F2F2"/>
+          </w:tcPr>
+          <w:p>
+            <w:pPr>
+              <w:jc w:val="right"/>
+            </w:pPr>
+            <w:r>
+              <w:rPr>
+                <w:b/>
+              </w:rPr>
+              <w:t>Model povrat (%)</w:t>
+            </w:r>
+          </w:p>
+        </w:tc>
+        <w:tc>
+          <w:tcPr>
+            <w:tcW w:w="1815" w:type="dxa"/>
+            <w:shd w:val="clear" w:color="auto" w:fill="F2F2F2"/>
+          </w:tcPr>
+          <w:p>
+            <w:pPr>
+              <w:jc w:val="right"/>
+            </w:pPr>
+            <w:r>
+              <w:rPr>
+                <w:b/>
+              </w:rPr>
+              <w:t>Razlika (pp)</w:t>
+            </w:r>
+          </w:p>
+        </w:tc>
+      </w:tr>
+      <w:tr>
+        <w:tc>
+          <w:tcPr>
+            <w:tcW w:w="1815" w:type="dxa"/>
+          </w:tcPr>
+          <w:p>
+            <w:r>
+              <w:t>QCOM</w:t>
+            </w:r>
+          </w:p>
+        </w:tc>
+        <w:tc>
+          <w:tcPr>
+            <w:tcW w:w="1815" w:type="dxa"/>
+          </w:tcPr>
+          <w:p>
+            <w:r>
+              <w:t>XGBoost</w:t>
+            </w:r>
+          </w:p>
+        </w:tc>
+        <w:tc>
+          <w:tcPr>
+            <w:tcW w:w="1815" w:type="dxa"/>
+          </w:tcPr>
+          <w:p>
+            <w:pPr>
+              <w:jc w:val="right"/>
+            </w:pPr>
+            <w:r>
+              <w:t>14.56</w:t>
+            </w:r>
+          </w:p>
+        </w:tc>
+        <w:tc>
+          <w:tcPr>
+            <w:tcW w:w="1815" w:type="dxa"/>
+          </w:tcPr>
+          <w:p>
+            <w:pPr>
+              <w:jc w:val="right"/>
+            </w:pPr>
+            <w:r>
+              <w:t>69.46</w:t>
+            </w:r>
+          </w:p>
+        </w:tc>
+        <w:tc>
+          <w:tcPr>
+            <w:tcW w:w="1815" w:type="dxa"/>
+          </w:tcPr>
+          <w:p>
+            <w:pPr>
+              <w:jc w:val="right"/>
+            </w:pPr>
+            <w:r>
+              <w:t>+54.90</w:t>
+            </w:r>
+          </w:p>
+        </w:tc>
+      </w:tr>
+      <w:tr>
+        <w:tc>
+          <w:tcPr>
+            <w:tcW w:w="1815" w:type="dxa"/>
+          </w:tcPr>
+          <w:p>
+            <w:r>
+              <w:t>INTC</w:t>
+            </w:r>
+          </w:p>
+        </w:tc>
+        <w:tc>
+          <w:tcPr>
+            <w:tcW w:w="1815" w:type="dxa"/>
+          </w:tcPr>
+          <w:p>
+            <w:r>
+              <w:t>Logistic Regression</w:t>
+            </w:r>
+          </w:p>
+        </w:tc>
+        <w:tc>
+          <w:tcPr>
+            <w:tcW w:w="1815" w:type="dxa"/>
+          </w:tcPr>
+          <w:p>
+            <w:pPr>
+              <w:jc w:val="right"/>
+            </w:pPr>
+            <w:r>
+              <w:t>-57.31</w:t>
+            </w:r>
+          </w:p>
+        </w:tc>
+        <w:tc>
+          <w:tcPr>
+            <w:tcW w:w="1815" w:type="dxa"/>
+          </w:tcPr>
+          <w:p>
+            <w:pPr>
+              <w:jc w:val="right"/>
+            </w:pPr>
+            <w:r>
+              <w:t>-23.35</w:t>
+            </w:r>
+          </w:p>
+        </w:tc>
+        <w:tc>
+          <w:tcPr>
+            <w:tcW w:w="1815" w:type="dxa"/>
+          </w:tcPr>
+          <w:p>
+            <w:pPr>
+              <w:jc w:val="right"/>
+            </w:pPr>
+            <w:r>
+              <w:t>+33.96</w:t>
+            </w:r>
+          </w:p>
+        </w:tc>
+      </w:tr>
+      <w:tr>
+        <w:tc>
+          <w:tcPr>
+            <w:tcW w:w="1815" w:type="dxa"/>
+          </w:tcPr>
+          <w:p>
+            <w:r>
+              <w:t>MS</w:t>
+            </w:r>
+          </w:p>
+        </w:tc>
+        <w:tc>
+          <w:tcPr>
+            <w:tcW w:w="1815" w:type="dxa"/>
+          </w:tcPr>
+          <w:p>
+            <w:r>
+              <w:t>XGBoost</w:t>
+            </w:r>
+          </w:p>
+        </w:tc>
+        <w:tc>
+          <w:tcPr>
+            <w:tcW w:w="1815" w:type="dxa"/>
+          </w:tcPr>
+          <w:p>
+            <w:pPr>
+              <w:jc w:val="right"/>
+            </w:pPr>
+            <w:r>
+              <w:t>41.80</w:t>
+            </w:r>
+          </w:p>
+        </w:tc>
+        <w:tc>
+          <w:tcPr>
+            <w:tcW w:w="1815" w:type="dxa"/>
+          </w:tcPr>
+          <w:p>
+            <w:pPr>
+              <w:jc w:val="right"/>
+            </w:pPr>
+            <w:r>
+              <w:t>61.79</w:t>
+            </w:r>
+          </w:p>
+        </w:tc>
+        <w:tc>
+          <w:tcPr>
+            <w:tcW w:w="1815" w:type="dxa"/>
+          </w:tcPr>
+          <w:p>
+            <w:pPr>
+              <w:jc w:val="right"/>
+            </w:pPr>
+            <w:r>
+              <w:t>+19.98</w:t>
+            </w:r>
+          </w:p>
+        </w:tc>
+      </w:tr>
+      <w:tr>
+        <w:tc>
+          <w:tcPr>
+            <w:tcW w:w="1815" w:type="dxa"/>
+          </w:tcPr>
+          <w:p>
+            <w:r>
+              <w:lastRenderedPageBreak/>
+              <w:t>NKE</w:t>
+            </w:r>
+          </w:p>
+        </w:tc>
+        <w:tc>
+          <w:tcPr>
+            <w:tcW w:w="1815" w:type="dxa"/>
+          </w:tcPr>
+          <w:p>
+            <w:r>
+              <w:t>XGBoost</w:t>
+            </w:r>
+          </w:p>
+        </w:tc>
+        <w:tc>
+          <w:tcPr>
+            <w:tcW w:w="1815" w:type="dxa"/>
+          </w:tcPr>
+          <w:p>
+            <w:pPr>
+              <w:jc w:val="right"/>
+            </w:pPr>
+            <w:r>
+              <w:t>-27.02</w:t>
+            </w:r>
+          </w:p>
+        </w:tc>
+        <w:tc>
+          <w:tcPr>
+            <w:tcW w:w="1815" w:type="dxa"/>
+          </w:tcPr>
+          <w:p>
+            <w:pPr>
+              <w:jc w:val="right"/>
+            </w:pPr>
+            <w:r>
+              <w:t>-10.42</w:t>
+            </w:r>
+          </w:p>
+        </w:tc>
+        <w:tc>
+          <w:tcPr>
+            <w:tcW w:w="1815" w:type="dxa"/>
+          </w:tcPr>
+          <w:p>
+            <w:pPr>
+              <w:jc w:val="right"/>
+            </w:pPr>
+            <w:r>
+              <w:t>+16.60</w:t>
+            </w:r>
+          </w:p>
+        </w:tc>
+      </w:tr>
+      <w:tr>
+        <w:tc>
+          <w:tcPr>
+            <w:tcW w:w="1815" w:type="dxa"/>
+          </w:tcPr>
+          <w:p>
+            <w:r>
+              <w:t>CVS</w:t>
+            </w:r>
+          </w:p>
+        </w:tc>
+        <w:tc>
+          <w:tcPr>
+            <w:tcW w:w="1815" w:type="dxa"/>
+          </w:tcPr>
+          <w:p>
+            <w:r>
+              <w:t>XGBoost</w:t>
+            </w:r>
+          </w:p>
+        </w:tc>
+        <w:tc>
+          <w:tcPr>
+            <w:tcW w:w="1815" w:type="dxa"/>
+          </w:tcPr>
+          <w:p>
+            <w:pPr>
+              <w:jc w:val="right"/>
+            </w:pPr>
+            <w:r>
+              <w:t>-43.40</w:t>
+            </w:r>
+          </w:p>
+        </w:tc>
+        <w:tc>
+          <w:tcPr>
+            <w:tcW w:w="1815" w:type="dxa"/>
+          </w:tcPr>
+          <w:p>
+            <w:pPr>
+              <w:jc w:val="right"/>
+            </w:pPr>
+            <w:r>
+              <w:t>-33.66</w:t>
+            </w:r>
+          </w:p>
+        </w:tc>
+        <w:tc>
+          <w:tcPr>
+            <w:tcW w:w="1815" w:type="dxa"/>
+          </w:tcPr>
+          <w:p>
+            <w:pPr>
+              <w:jc w:val="right"/>
+            </w:pPr>
+            <w:r>
+              <w:t>+9.74</w:t>
+            </w:r>
+          </w:p>
+        </w:tc>
+      </w:tr>
+      <w:tr>
+        <w:tc>
+          <w:tcPr>
+            <w:tcW w:w="1815" w:type="dxa"/>
+          </w:tcPr>
+          <w:p>
+            <w:r>
+              <w:t>AMD</w:t>
+            </w:r>
+          </w:p>
+        </w:tc>
+        <w:tc>
+          <w:tcPr>
+            <w:tcW w:w="1815" w:type="dxa"/>
+          </w:tcPr>
+          <w:p>
+            <w:r>
+              <w:t>Logistic Regression</w:t>
+            </w:r>
+          </w:p>
+        </w:tc>
+        <w:tc>
+          <w:tcPr>
+            <w:tcW w:w="1815" w:type="dxa"/>
+          </w:tcPr>
+          <w:p>
+            <w:pPr>
+              <w:jc w:val="right"/>
+            </w:pPr>
+            <w:r>
+              <w:t>-9.52</w:t>
+            </w:r>
+          </w:p>
+        </w:tc>
+        <w:tc>
+          <w:tcPr>
+            <w:tcW w:w="1815" w:type="dxa"/>
+          </w:tcPr>
+          <w:p>
+            <w:pPr>
+              <w:jc w:val="right"/>
+            </w:pPr>
+            <w:r>
+              <w:t>-5.05</w:t>
+            </w:r>
+          </w:p>
+        </w:tc>
+        <w:tc>
+          <w:tcPr>
+            <w:tcW w:w="1815" w:type="dxa"/>
+          </w:tcPr>
+          <w:p>
+            <w:pPr>
+              <w:jc w:val="right"/>
+            </w:pPr>
+            <w:r>
+              <w:t>+4.47</w:t>
+            </w:r>
+          </w:p>
+        </w:tc>
+      </w:tr>
+      <w:tr>
+        <w:tc>
+          <w:tcPr>
+            <w:tcW w:w="1815" w:type="dxa"/>
+          </w:tcPr>
+          <w:p>
+            <w:r>
+              <w:t>ADBE</w:t>
+            </w:r>
+          </w:p>
+        </w:tc>
+        <w:tc>
+          <w:tcPr>
+            <w:tcW w:w="1815" w:type="dxa"/>
+          </w:tcPr>
+          <w:p>
+            <w:r>
+              <w:t>Random Forest</w:t>
+            </w:r>
+          </w:p>
+        </w:tc>
+        <w:tc>
+          <w:tcPr>
+            <w:tcW w:w="1815" w:type="dxa"/>
+          </w:tcPr>
+          <w:p>
+            <w:pPr>
+              <w:jc w:val="right"/>
+            </w:pPr>
+            <w:r>
+              <w:t>-22.03</w:t>
+            </w:r>
+          </w:p>
+        </w:tc>
+        <w:tc>
+          <w:tcPr>
+            <w:tcW w:w="1815" w:type="dxa"/>
+          </w:tcPr>
+          <w:p>
+            <w:pPr>
+              <w:jc w:val="right"/>
+            </w:pPr>
+            <w:r>
+              <w:t>-18.29</w:t>
+            </w:r>
+          </w:p>
+        </w:tc>
+        <w:tc>
+          <w:tcPr>
+            <w:tcW w:w="1815" w:type="dxa"/>
+          </w:tcPr>
+          <w:p>
+            <w:pPr>
+              <w:jc w:val="right"/>
+            </w:pPr>
+            <w:r>
+              <w:t>+3.74</w:t>
+            </w:r>
+          </w:p>
+        </w:tc>
+      </w:tr>
+      <w:tr>
+        <w:tc>
+          <w:tcPr>
+            <w:tcW w:w="1815" w:type="dxa"/>
+          </w:tcPr>
+          <w:p>
+            <w:r>
+              <w:t>GOOGL</w:t>
+            </w:r>
+          </w:p>
+        </w:tc>
+        <w:tc>
+          <w:tcPr>
+            <w:tcW w:w="1815" w:type="dxa"/>
+          </w:tcPr>
+          <w:p>
+            <w:r>
+              <w:t>LSTM</w:t>
+            </w:r>
+          </w:p>
+        </w:tc>
+        <w:tc>
+          <w:tcPr>
+            <w:tcW w:w="1815" w:type="dxa"/>
+          </w:tcPr>
+          <w:p>
+            <w:pPr>
+              <w:jc w:val="right"/>
+            </w:pPr>
+            <w:r>
+              <w:t>33.77</w:t>
+            </w:r>
+          </w:p>
+        </w:tc>
+        <w:tc>
+          <w:tcPr>
+            <w:tcW w:w="1815" w:type="dxa"/>
+          </w:tcPr>
+          <w:p>
+            <w:pPr>
+              <w:jc w:val="right"/>
+            </w:pPr>
+            <w:r>
+              <w:t>30.15</w:t>
+            </w:r>
+          </w:p>
+        </w:tc>
+        <w:tc>
+          <w:tcPr>
+            <w:tcW w:w="1815" w:type="dxa"/>
+          </w:tcPr>
+          <w:p>
+            <w:pPr>
+              <w:jc w:val="right"/>
+            </w:pPr>
+            <w:r>
+              <w:t>-3.62</w:t>
+            </w:r>
+          </w:p>
+        </w:tc>
+      </w:tr>
+      <w:tr>
+        <w:tc>
+          <w:tcPr>
+            <w:tcW w:w="1815" w:type="dxa"/>
+          </w:tcPr>
+          <w:p>
+            <w:r>
+              <w:t>AMZN</w:t>
+            </w:r>
+          </w:p>
+        </w:tc>
+        <w:tc>
+          <w:tcPr>
+            <w:tcW w:w="1815" w:type="dxa"/>
+          </w:tcPr>
+          <w:p>
+            <w:r>
+              <w:t>Logistic Regression</w:t>
+            </w:r>
+          </w:p>
+        </w:tc>
+        <w:tc>
+          <w:tcPr>
+            <w:tcW w:w="1815" w:type="dxa"/>
+          </w:tcPr>
+          <w:p>
+            <w:pPr>
+              <w:jc w:val="right"/>
+            </w:pPr>
+            <w:r>
+              <w:t>49.05</w:t>
+            </w:r>
+          </w:p>
+        </w:tc>
+        <w:tc>
+          <w:tcPr>
+            <w:tcW w:w="1815" w:type="dxa"/>
+          </w:tcPr>
+          <w:p>
+            <w:pPr>
+              <w:jc w:val="right"/>
+            </w:pPr>
+            <w:r>
+              <w:t>41.96</w:t>
+            </w:r>
+          </w:p>
+        </w:tc>
+        <w:tc>
+          <w:tcPr>
+            <w:tcW w:w="1815" w:type="dxa"/>
+          </w:tcPr>
+          <w:p>
+            <w:pPr>
+              <w:jc w:val="right"/>
+            </w:pPr>
+            <w:r>
+              <w:t>-7.10</w:t>
+            </w:r>
+          </w:p>
+        </w:tc>
+      </w:tr>
+      <w:tr>
+        <w:tc>
+          <w:tcPr>
+            <w:tcW w:w="1815" w:type="dxa"/>
+          </w:tcPr>
+          <w:p>
+            <w:r>
+              <w:t>AAPL</w:t>
+            </w:r>
+          </w:p>
+        </w:tc>
+        <w:tc>
+          <w:tcPr>
+            <w:tcW w:w="1815" w:type="dxa"/>
+          </w:tcPr>
+          <w:p>
+            <w:r>
+              <w:t>Random Forest</w:t>
+            </w:r>
+          </w:p>
+        </w:tc>
+        <w:tc>
+          <w:tcPr>
+            <w:tcW w:w="1815" w:type="dxa"/>
+          </w:tcPr>
+          <w:p>
+            <w:pPr>
+              <w:jc w:val="right"/>
+            </w:pPr>
+            <w:r>
+              <w:t>37.55</w:t>
+            </w:r>
+          </w:p>
+        </w:tc>
+        <w:tc>
+          <w:tcPr>
+            <w:tcW w:w="1815" w:type="dxa"/>
+          </w:tcPr>
+          <w:p>
+            <w:pPr>
+              <w:jc w:val="right"/>
+            </w:pPr>
+            <w:r>
+              <w:t>14.88</w:t>
+            </w:r>
+          </w:p>
+        </w:tc>
+        <w:tc>
+          <w:tcPr>
+            <w:tcW w:w="1815" w:type="dxa"/>
+          </w:tcPr>
+          <w:p>
+            <w:pPr>
+              <w:jc w:val="right"/>
+            </w:pPr>
+            <w:r>
+              <w:t>-22.67</w:t>
+            </w:r>
+          </w:p>
+        </w:tc>
+      </w:tr>
+      <w:tr>
+        <w:tc>
+          <w:tcPr>
+            <w:tcW w:w="1815" w:type="dxa"/>
+          </w:tcPr>
+          <w:p>
+            <w:r>
+              <w:t>META</w:t>
+            </w:r>
+          </w:p>
+        </w:tc>
+        <w:tc>
+          <w:tcPr>
+            <w:tcW w:w="1815" w:type="dxa"/>
+          </w:tcPr>
+          <w:p>
+            <w:r>
+              <w:t>Random Forest</w:t>
+            </w:r>
+          </w:p>
+        </w:tc>
+        <w:tc>
+          <w:tcPr>
+            <w:tcW w:w="1815" w:type="dxa"/>
+          </w:tcPr>
+          <w:p>
+            <w:pPr>
+              <w:jc w:val="right"/>
+            </w:pPr>
+            <w:r>
+              <w:t>72.29</w:t>
+            </w:r>
+          </w:p>
+        </w:tc>
+        <w:tc>
+          <w:tcPr>
+            <w:tcW w:w="1815" w:type="dxa"/>
+          </w:tcPr>
+          <w:p>
+            <w:pPr>
+              <w:jc w:val="right"/>
+            </w:pPr>
+            <w:r>
+              <w:t>56.94</w:t>
+            </w:r>
+          </w:p>
+        </w:tc>
+        <w:tc>
+          <w:tcPr>
+            <w:tcW w:w="1815" w:type="dxa"/>
+          </w:tcPr>
+          <w:p>
+            <w:pPr>
+              <w:jc w:val="right"/>
+            </w:pPr>
+            <w:r>
+              <w:t>-15.35</w:t>
+            </w:r>
+          </w:p>
+        </w:tc>
+      </w:tr>
+      <w:tr>
+        <w:tc>
+          <w:tcPr>
+            <w:tcW w:w="1815" w:type="dxa"/>
+          </w:tcPr>
+          <w:p>
+            <w:r>
+              <w:t>MSFT</w:t>
+            </w:r>
+          </w:p>
+        </w:tc>
+        <w:tc>
+          <w:tcPr>
+            <w:tcW w:w="1815" w:type="dxa"/>
+          </w:tcPr>
+          <w:p>
+            <w:r>
+              <w:t>XGBoost</w:t>
+            </w:r>
+          </w:p>
+        </w:tc>
+        <w:tc>
+          <w:tcPr>
+            <w:tcW w:w="1815" w:type="dxa"/>
+          </w:tcPr>
+          <w:p>
+            <w:pPr>
+              <w:jc w:val="right"/>
+            </w:pPr>
+            <w:r>
+              <w:t>15.49</w:t>
+            </w:r>
+          </w:p>
+        </w:tc>
+        <w:tc>
+          <w:tcPr>
+            <w:tcW w:w="1815" w:type="dxa"/>
+          </w:tcPr>
+          <w:p>
+            <w:pPr>
+              <w:jc w:val="right"/>
+            </w:pPr>
+            <w:r>
+              <w:t>0.44</w:t>
+            </w:r>
+          </w:p>
+        </w:tc>
+        <w:tc>
+          <w:tcPr>
+            <w:tcW w:w="1815" w:type="dxa"/>
+          </w:tcPr>
+          <w:p>
+            <w:pPr>
+              <w:jc w:val="right"/>
+            </w:pPr>
+            <w:r>
+              <w:t>-15.05</w:t>
+            </w:r>
+          </w:p>
+        </w:tc>
+      </w:tr>
+      <w:tr>
+        <w:tc>
+          <w:tcPr>
+            <w:tcW w:w="1815" w:type="dxa"/>
+          </w:tcPr>
+          <w:p>
+            <w:r>
+              <w:t>NVDA</w:t>
+            </w:r>
+          </w:p>
+        </w:tc>
+        <w:tc>
+          <w:tcPr>
+            <w:tcW w:w="1815" w:type="dxa"/>
+          </w:tcPr>
+          <w:p>
+            <w:r>
+              <w:t>LSTM</w:t>
+            </w:r>
+          </w:p>
+        </w:tc>
+        <w:tc>
+          <w:tcPr>
+            <w:tcW w:w="1815" w:type="dxa"/>
+          </w:tcPr>
+          <w:p>
+            <w:pPr>
+              <w:jc w:val="right"/>
+            </w:pPr>
+            <w:r>
+              <w:t>140.83</w:t>
+            </w:r>
+          </w:p>
+        </w:tc>
+        <w:tc>
+          <w:tcPr>
+            <w:tcW w:w="1815" w:type="dxa"/>
+          </w:tcPr>
+          <w:p>
+            <w:pPr>
+              <w:jc w:val="right"/>
+            </w:pPr>
+            <w:r>
+              <w:t>54.72</w:t>
+            </w:r>
+          </w:p>
+        </w:tc>
+        <w:tc>
+          <w:tcPr>
+            <w:tcW w:w="1815" w:type="dxa"/>
+          </w:tcPr>
+          <w:p>
+            <w:pPr>
+              <w:jc w:val="right"/>
+            </w:pPr>
+            <w:r>
+              <w:t>-86.10</w:t>
+            </w:r>
+          </w:p>
+        </w:tc>
+      </w:tr>
+      <w:tr>
+        <w:tc>
+          <w:tcPr>
+            <w:tcW w:w="1815" w:type="dxa"/>
+          </w:tcPr>
+          <w:p>
+            <w:r>
+              <w:t>PLTR</w:t>
+            </w:r>
+          </w:p>
+        </w:tc>
+        <w:tc>
+          <w:tcPr>
+            <w:tcW w:w="1815" w:type="dxa"/>
+          </w:tcPr>
+          <w:p>
+            <w:r>
+              <w:t>LSTM</w:t>
+            </w:r>
+          </w:p>
+        </w:tc>
+        <w:tc>
+          <w:tcPr>
+            <w:tcW w:w="1815" w:type="dxa"/>
+          </w:tcPr>
+          <w:p>
+            <w:pPr>
+              <w:jc w:val="right"/>
+            </w:pPr>
+            <w:r>
+              <w:t>370.61</w:t>
+            </w:r>
+          </w:p>
+        </w:tc>
+        <w:tc>
+          <w:tcPr>
+            <w:tcW w:w="1815" w:type="dxa"/>
+          </w:tcPr>
+          <w:p>
+            <w:pPr>
+              <w:jc w:val="right"/>
+            </w:pPr>
+            <w:r>
+              <w:t>161.96</w:t>
+            </w:r>
+          </w:p>
+        </w:tc>
+        <w:tc>
+          <w:tcPr>
+            <w:tcW w:w="1815" w:type="dxa"/>
+          </w:tcPr>
+          <w:p>
+            <w:pPr>
+              <w:jc w:val="right"/>
+            </w:pPr>
+            <w:r>
+              <w:t>-208.65</w:t>
+            </w:r>
+          </w:p>
+        </w:tc>
+      </w:tr>
+      <w:tr>
+        <w:tc>
+          <w:tcPr>
+            <w:tcW w:w="1815" w:type="dxa"/>
+            <w:shd w:val="clear" w:color="auto" w:fill="FAFAFA"/>
+          </w:tcPr>
+          <w:p>
+            <w:r>
+              <w:rPr>
+                <w:b/>
+              </w:rPr>
+              <w:t>PROSJEK (54 dionice)</w:t>
+            </w:r>
+          </w:p>
+        </w:tc>
+        <w:tc>
+          <w:tcPr>
+            <w:tcW w:w="1815" w:type="dxa"/>
+            <w:shd w:val="clear" w:color="auto" w:fill="FAFAFA"/>
+          </w:tcPr>
+          <w:p>
+            <w:r>
+              <w:rPr>
+                <w:b/>
+              </w:rPr>
+              <w:t>-</w:t>
+            </w:r>
+          </w:p>
+        </w:tc>
+        <w:tc>
+          <w:tcPr>
+            <w:tcW w:w="1815" w:type="dxa"/>
+            <w:shd w:val="clear" w:color="auto" w:fill="FAFAFA"/>
+          </w:tcPr>
+          <w:p>
+            <w:pPr>
+              <w:jc w:val="right"/>
+            </w:pPr>
+            <w:r>
+              <w:rPr>
+                <w:b/>
+              </w:rPr>
+              <w:t>26.62</w:t>
+            </w:r>
+          </w:p>
+        </w:tc>
+        <w:tc>
+          <w:tcPr>
+            <w:tcW w:w="1815" w:type="dxa"/>
+            <w:shd w:val="clear" w:color="auto" w:fill="FAFAFA"/>
+          </w:tcPr>
+          <w:p>
+            <w:pPr>
+              <w:jc w:val="right"/>
+            </w:pPr>
+            <w:r>
+              <w:rPr>
+                <w:b/>
+              </w:rPr>
+              <w:t>12.60</w:t>
+            </w:r>
+          </w:p>
+        </w:tc>
+        <w:tc>
+          <w:tcPr>
+            <w:tcW w:w="1815" w:type="dxa"/>
+            <w:shd w:val="clear" w:color="auto" w:fill="FAFAFA"/>
+          </w:tcPr>
+          <w:p>
+            <w:pPr>
+              <w:jc w:val="right"/>
+            </w:pPr>
+            <w:r>
+              <w:rPr>
+                <w:b/>
+              </w:rPr>
+              <w:t>-14.01</w:t>
+            </w:r>
+          </w:p>
+        </w:tc>
+      </w:tr>
+    </w:tbl>
     <w:p>
       <w:pPr/>
       <w:r>
-        <w:t>Metričke performanse (točnost i F1-mjera) pružaju teorijski uvid, no stvarni test svakog prediktivnog sustava u financijama je njegova profitabilnost. Provedena je simulacija trgovanja na testnom skupu podataka (2024. godina) za svih 54 dionica. Uspoređene su dvije strategije: pasivni Buy &amp; Hold (kupnja dionice na početku godine i držanje do kraja godine) te aktivna ML strategija (ako model predviđa rast za sutradan, kapital je investiran u dionicu; ako predviđa pad, kapital se povlači u gotovinu uz 0% povrata). Rezultati simulacije za odabranu reprezentativnu skupinu dionica (koja pokriva top izvedbe, padove i prosjeke) prikazani su u Tablici 4.4.</w:t>
+        <w:t>Metričke performanse (točnost i F1-mjera) pružaju teorijski uvid, no stvarni test svakog prediktivnog sustava u financijama je njegova profitabilnost. Provedena je simulacija trgovanja na testnom skupu podataka (2024. godina) za svih 54 dionica. Uspoređene su dvije strategije: pasivni Buy &amp; Hold (kupnja dionice na početku godine i držanje do kraja godine) te aktivna ML strategija (ako model predviđa rast za sutradan, kapital je investiran u dionicu; ako predviđa pad, kapital se povlači u gotovinu uz 0% povrata).</w:t>
+        <w:br/>
+        <w:t>Matematički, kumulativni povrat Buy &amp; Hold strategije računa se kao:</w:t>
+      </w:r>
+    </w:p>
+    <w:p>
+      <w:pPr/>
+      <w:r>
+        <w:t>$$R_{B\&amp;H} = \prod_{t=1}^{T} (1 + r_t) - 1$$</w:t>
+      </w:r>
+    </w:p>
+    <w:p>
+      <w:pPr/>
+      <w:r>
+        <w:t>gdje je $r_t$ dnevni povrat dionice na dan $t$, definiran kao:</w:t>
+      </w:r>
+    </w:p>
+    <w:p>
+      <w:pPr/>
+      <w:r>
+        <w:t>$$r_t = \frac{Close_t - Close_{t-1}}{Close_{t-1}}$$</w:t>
+      </w:r>
+    </w:p>
+    <w:p>
+      <w:pPr/>
+      <w:r>
+        <w:t>Kumulativni povrat aktivne strategije vođene modelima strojnog učenja računa se prema formuli:</w:t>
+      </w:r>
+    </w:p>
+    <w:p>
+      <w:pPr/>
+      <w:r>
+        <w:t>$$R_{ML} = \prod_{t=1}^{T} (1 + pos_{t-1} \cdot r_t) - 1$$</w:t>
+      </w:r>
+    </w:p>
+    <w:p>
+      <w:pPr/>
+      <w:r>
+        <w:t>gdje je $pos_{t-1} \in \{0, 1\}$ pozicijski signal generiran na kraju dana $t-1$ za sljedeći dan $t$. Ako model predviđa rast, postavlja se $pos_{t-1} = 1$ (kapital je u dionici), a ako predviđa pad, $pos_{t-1} = 0$ (kapital je povučen u gotovinu, ostvarujući 0% povrata za taj dan).</w:t>
+        <w:br/>
+        <w:t>Rezultati simulacije za odabranu reprezentativnu skupinu dionica (koja pokriva top izvedbe, padove i prosjeke) prikazani su u Tablici 4.4.</w:t>
       </w:r>
     </w:p>
     <w:tbl>
@@ -15368,9 +17057,21 @@
     <w:p>
       <w:pPr/>
       <w:r>
-        <w:t>Iako dobiveni rezultati pokazuju prednosti i potencijal primjene strojnog učenja, nužno je kritički se osvrnuti na pretpostavke i ograničenja ovog istraživanja. Prvo i najvažnije ograničenje je zanemarivanje transakcijskih troškova i poreza u simulaciji. U realnom trgovanju, svaka transakcija nosi brokersku proviziju (npr. 0.1% ili fiksnu naknadu) te utjecaj na cijenu (slippage). Budući da model donosi odluke na dnevnoj bazi, transakcijski troškovi bi na dionicama s čestim promjenama signala mogli značajno smanjiti profitabilnost aktivne strategije.</w:t>
+        <w:t>Iako dobiveni rezultati pokazuju prednosti i potencijal primjene strojnog učenja, nužno je kritički se osvrnuti na pretpostavke i ograničenja ovog istraživanja. Prvo i najvažnije ograničenje je zanemarivanje transakcijskih troškova i poreza u simulaciji. U realnom trgovanju, svaka transakcija nosi brokersku proviziju (npr. $c = 0.1\%$) te utjecaj na cijenu (slippage). Ako uvrstimo troškove u simulaciju, korigirani dnevni povrat $r_{adjusted, t}$ iznosio bi:</w:t>
+      </w:r>
+    </w:p>
+    <w:p>
+      <w:pPr/>
+      <w:r>
+        <w:t>$$r_{adjusted, t} = pos_{t-1} \cdot r_t - c \cdot |pos_{t-1} - pos_{t-2}|$$</w:t>
+      </w:r>
+    </w:p>
+    <w:p>
+      <w:pPr/>
+      <w:r>
+        <w:t>gdje je $c$ koeficijent transakcijskog troška, a $|pos_{t-1} - pos_{t-2}| \in \{0, 1\}$ indikator promjene pozicije. Budući da model donosi odluke na dnevnoj bazi, transakcijski troškovi bi na dionicama s čestim promjenama signala mogli značajno smanjiti profitabilnost aktivne strategije.</w:t>
         <w:br/>
-        <w:t>Drugo ograničenje odnosi se na pretpostavku izvršenja transakcija po cijeni zatvaranja (Close price). U stvarnosti je nemoguće izvršiti transakciju točno po cijeni zatvaranja jer se ona formira tek u posljednjoj sekundi trgovanja. Realnija simulacija zahtijevala bi donošenje odluka na temelju podataka do 15 minuta prije kraja trgovanja i izvršenje po cijeni koja je bliska cijeni zatvaranja, ili izvršenje na otvaranju sljedećeg dana (Open price).</w:t>
+        <w:t>Drugo ograničenje odnosi se na pretpostavku izvršenja transakcija po cijeni zatvaranja (Close price). U stvarnosti je nemoguće izvršiti transakciju točno po cijeni zatvaranja jer se ona formira tek u posljednjoj sekundi trgovanja. Realnija simulacija zahtijevala bi donošenje odluka na temelju podataka do 15 minuta prije kraja trgovanja i izvršenje po cijeni koja je bliska cieni zatvaranja, ili izvršenje na otvaranju sljedećeg dana (Open price).</w:t>
         <w:br/>
         <w:t>Treće ograničenje je izbor fiksnih vremenskih prozora. LSTM model je treniran s fiksnim povijesnim prozorom od 10 dana. Iako je 10 dana standardan izbor za kratkoročne predikcije, moguće je da različite dionice zahtijevaju različite duljine povijesnog konteksta. Konačno, sustav predviđa kretanje cijena izolirano za svaku dionicu te ne optimizira alokaciju portfelja. Za praktičnu primjenu, predikcije pojedinačnih modela trebale bi se integrirati s modernom teorijom portfelja (npr. Markowitzev model) kako bi se kapital dinamički raspoređivao na dionice s najvećom vjerojatnošću rasta.</w:t>
       </w:r>
@@ -15386,7 +17087,6 @@
         </w:rPr>
       </w:pPr>
       <w:r>
-        <w:lastRenderedPageBreak/>
         <w:t>5. Zaključak</w:t>
       </w:r>
     </w:p>
@@ -15430,7 +17130,23 @@
     </w:p>
     <w:p>
       <w:r>
-        <w:t xml:space="preserve">Praktični dio rada zaokružen je razvojem i objavom web aplikacije na platformi Render, koja pruža korisnicima vizualni pregled predikcija u realnom vremenu uz visoku brzinu odziva zahvaljujući implementiranom mehanizmu predmemoriranja modela. Kao smjernice za budući rad predlaže se uvođenje obrade nestrukturiranih podataka (analiza vijesti i sentimenta na društvenim mrežama) te testiranje naprednijih neuronskih arhitektura poput transformatora, što bi moglo dodatno povećati točnost predviđanja u </w:t>
+        <w:t xml:space="preserve">Praktični dio rada zaokružen je razvojem i objavom web aplikacije na platformi Render, koja pruža korisnicima vizualni pregled predikcija u realnom vremenu uz visoku brzinu odziva zahvaljujući implementiranom mehanizmu predmemoriranja modela. Kao smjernice za budući rad predlaže se uvođenje obrade nestrukturiranih podataka (analiza vijesti i sentimenta na društvenim mrežama) te testiranje naprednijih neuronskih arhitektura poput transformatora, što bi moglo dodatno povećati </w:t>
+      </w:r>
+      <w:proofErr w:type="spellStart"/>
+      <w:r>
+        <w:t>točnost</w:t>
+      </w:r>
+      <w:proofErr w:type="spellEnd"/>
+      <w:r>
+        <w:t xml:space="preserve"> </w:t>
+      </w:r>
+      <w:proofErr w:type="spellStart"/>
+      <w:r>
+        <w:t>predviđanja</w:t>
+      </w:r>
+      <w:proofErr w:type="spellEnd"/>
+      <w:r>
+        <w:t xml:space="preserve"> u </w:t>
       </w:r>
       <w:proofErr w:type="spellStart"/>
       <w:r>
@@ -15509,7 +17225,11 @@
     </w:p>
     <w:p>
       <w:r>
-        <w:t>[7] T. Hastie, R. Tibshirani i J. Friedman, The Elements of Statistical Learning: Data Mining, Inference, and Prediction, 2. izd. New York, NY, SAD: Springer, 2009. https://web.stanford.edu/~hastie/ElemStatLearn/</w:t>
+        <w:t xml:space="preserve">[7] T. Hastie, R. Tibshirani i J. Friedman, The Elements of Statistical Learning: Data Mining, Inference, and Prediction, 2. izd. New York, NY, SAD: Springer, 2009. </w:t>
+      </w:r>
+      <w:r>
+        <w:lastRenderedPageBreak/>
+        <w:t>https://web.stanford.edu/~hastie/ElemStatLearn/</w:t>
       </w:r>
     </w:p>
     <w:p>
@@ -15954,7 +17674,15 @@
           <w:szCs w:val="24"/>
         </w:rPr>
         <w:br/>
-        <w:t>3. templates/index.html: Korisničko sučelje (frontend) izrađeno u HTML/CSS/JavaScript tehnologijama. Koristi Chart.js za prikaz interaktivnih grafikona cijena dionica te komunicira s Flask backendom putem asinkronih fetch zahtjeva, prikazujući rezultate predikcija (RASTE ili PADA) te tablicu evaluacije modela.</w:t>
+        <w:t xml:space="preserve">3. templates/index.html: Korisničko sučelje (frontend) izrađeno u HTML/CSS/JavaScript tehnologijama. Koristi Chart.js za prikaz interaktivnih grafikona cijena dionica te komunicira </w:t>
+      </w:r>
+      <w:r>
+        <w:rPr>
+          <w:sz w:val="24"/>
+          <w:szCs w:val="24"/>
+        </w:rPr>
+        <w:lastRenderedPageBreak/>
+        <w:t>s Flask backendom putem asinkronih fetch zahtjeva, prikazujući rezultate predikcija (RASTE ili PADA) te tablicu evaluacije modela.</w:t>
       </w:r>
     </w:p>
     <w:sectPr>

</xml_diff>

<commit_message>
Konvertirane preostale LaTeX formule (Slucajne sume, XGBoost i RNN) u nativne jednadzbe
</commit_message>
<xml_diff>
--- a/zavrsni_rad.docx
+++ b/zavrsni_rad.docx
@@ -11420,164 +11420,136 @@
       </w:r>
     </w:p>
     <w:p>
+      <w:pPr/>
+      <w:r>
+        <w:t>Slučajne šume su ansambl algoritam koji se temelji na kombiniranju velikog broja pojedinačnih stabala odluke [5]. Pojedinačno stablo odluke klasificira podatke rekurzivnim dijeljenjem prostora značajki na temelju specifičnih pravila podjele. Za procjenu kvalitete podjele i odabir optimalnog praga značajke najčešće se koristi Gini nečistoća (Gini Impurity):</w:t>
+      </w:r>
+    </w:p>
+    <w:p>
       <w:pPr>
-        <w:jc w:val="both"/>
-        <w:rPr>
-          <w:sz w:val="24"/>
-          <w:szCs w:val="24"/>
-        </w:rPr>
+        <w:jc w:val="center"/>
       </w:pPr>
-    </w:p>
-    <w:p>
-      <w:pPr>
-        <w:jc w:val="both"/>
-        <w:rPr>
-          <w:sz w:val="24"/>
-          <w:szCs w:val="24"/>
-        </w:rPr>
-      </w:pPr>
-      <w:proofErr w:type="spellStart"/>
-      <w:r>
-        <w:rPr>
-          <w:sz w:val="24"/>
-          <w:szCs w:val="24"/>
-        </w:rPr>
-        <w:t>Slučajne</w:t>
-      </w:r>
-      <w:proofErr w:type="spellEnd"/>
-      <w:r>
-        <w:rPr>
-          <w:sz w:val="24"/>
-          <w:szCs w:val="24"/>
-        </w:rPr>
-        <w:t xml:space="preserve"> </w:t>
-      </w:r>
-      <w:proofErr w:type="spellStart"/>
-      <w:r>
-        <w:rPr>
-          <w:sz w:val="24"/>
-          <w:szCs w:val="24"/>
-        </w:rPr>
-        <w:t>šume</w:t>
-      </w:r>
-      <w:proofErr w:type="spellEnd"/>
-      <w:r>
-        <w:rPr>
-          <w:sz w:val="24"/>
-          <w:szCs w:val="24"/>
-        </w:rPr>
-        <w:t xml:space="preserve"> </w:t>
-      </w:r>
-      <w:proofErr w:type="spellStart"/>
-      <w:r>
-        <w:rPr>
-          <w:sz w:val="24"/>
-          <w:szCs w:val="24"/>
-        </w:rPr>
-        <w:t>su</w:t>
-      </w:r>
-      <w:proofErr w:type="spellEnd"/>
-      <w:r>
-        <w:rPr>
-          <w:sz w:val="24"/>
-          <w:szCs w:val="24"/>
-        </w:rPr>
-        <w:t xml:space="preserve"> </w:t>
-      </w:r>
-      <w:proofErr w:type="spellStart"/>
-      <w:r>
-        <w:rPr>
-          <w:sz w:val="24"/>
-          <w:szCs w:val="24"/>
-        </w:rPr>
-        <w:t>ansambl</w:t>
-      </w:r>
-      <w:proofErr w:type="spellEnd"/>
-      <w:r>
-        <w:rPr>
-          <w:sz w:val="24"/>
-          <w:szCs w:val="24"/>
-        </w:rPr>
-        <w:t xml:space="preserve"> </w:t>
-      </w:r>
-      <w:proofErr w:type="spellStart"/>
-      <w:r>
-        <w:rPr>
-          <w:sz w:val="24"/>
-          <w:szCs w:val="24"/>
-        </w:rPr>
-        <w:t>algoritam</w:t>
-      </w:r>
-      <w:proofErr w:type="spellEnd"/>
-      <w:r>
-        <w:rPr>
-          <w:sz w:val="24"/>
-          <w:szCs w:val="24"/>
-        </w:rPr>
-        <w:t xml:space="preserve"> koji se temelji na kombiniranju velikog broja pojedinačnih stabala odluke [5]. Pojedinačno stablo odluke klasificira podatke rekurzivnim dijeljenjem prostora značajki. Za procjenu kvalitete podjele koristi se Gini nečistoća:</w:t>
-      </w:r>
-      <w:r>
-        <w:rPr>
-          <w:sz w:val="24"/>
-          <w:szCs w:val="24"/>
-        </w:rPr>
+      <w:r/>
+      <m:oMath>
+        <m:sSub>
+          <m:e>
+            <m:r>
+              <m:t>I</m:t>
+            </m:r>
+          </m:e>
+          <m:sub>
+            <m:r>
+              <m:t>G</m:t>
+            </m:r>
+          </m:sub>
+        </m:sSub>
+        <m:r>
+          <m:t>(p)=1−</m:t>
+        </m:r>
+        <m:nary>
+          <m:naryPr>
+            <m:chr m:val="∑"/>
+            <m:limLoc m:val="subSup"/>
+            <m:grow m:val="1"/>
+            <m:subHide m:val="off"/>
+            <m:supHide m:val="off"/>
+          </m:naryPr>
+          <m:sub>
+            <m:r>
+              <m:t>k=1</m:t>
+            </m:r>
+          </m:sub>
+          <m:sup>
+            <m:r>
+              <m:t>K</m:t>
+            </m:r>
+          </m:sup>
+          <m:e>
+            <m:sSubSup>
+              <m:e>
+                <m:r>
+                  <m:t>p</m:t>
+                </m:r>
+              </m:e>
+              <m:sub>
+                <m:r>
+                  <m:t>k</m:t>
+                </m:r>
+              </m:sub>
+              <m:sup>
+                <m:r>
+                  <m:t>2</m:t>
+                </m:r>
+              </m:sup>
+            </m:sSubSup>
+          </m:e>
+        </m:nary>
+      </m:oMath>
+    </w:p>
+    <w:p>
+      <w:pPr/>
+      <w:r/>
+      <w:r>
+        <w:t xml:space="preserve">gdje je </w:t>
+      </w:r>
+      <m:oMath>
+        <m:r>
+          <m:t>K</m:t>
+        </m:r>
+      </m:oMath>
+      <w:r>
+        <w:t xml:space="preserve"> broj klasa, a </w:t>
+      </w:r>
+      <m:oMath>
+        <m:sSub>
+          <m:e>
+            <m:r>
+              <m:t>p</m:t>
+            </m:r>
+          </m:e>
+          <m:sub>
+            <m:r>
+              <m:t>k</m:t>
+            </m:r>
+          </m:sub>
+        </m:sSub>
+      </m:oMath>
+      <w:r>
+        <w:t xml:space="preserve"> udio uzoraka klase </w:t>
+      </w:r>
+      <m:oMath>
+        <m:r>
+          <m:t>k</m:t>
+        </m:r>
+      </m:oMath>
+      <w:r>
+        <w:t xml:space="preserve"> u promatranom čvoru. Cilj algoritma pri gradnji stabla je maksimizirati smanjenje nečistoće (Gini Gain) nakon podjele čvora na podčvorove, čime se dobivaju homogenije skupine podataka.</w:t>
         <w:br/>
-        <w:t>I_G(p) = 1 - sum_{k=</w:t>
-      </w:r>
-      <w:proofErr w:type="gramStart"/>
-      <w:r>
-        <w:rPr>
-          <w:sz w:val="24"/>
-          <w:szCs w:val="24"/>
-        </w:rPr>
-        <w:t>1}^</w:t>
-      </w:r>
-      <w:proofErr w:type="gramEnd"/>
-      <w:r>
-        <w:rPr>
-          <w:sz w:val="24"/>
-          <w:szCs w:val="24"/>
-        </w:rPr>
-        <w:t>K p_k^2</w:t>
-      </w:r>
-      <w:r>
-        <w:rPr>
-          <w:sz w:val="24"/>
-          <w:szCs w:val="24"/>
-        </w:rPr>
-        <w:br/>
-        <w:t>gdje je K broj klasa, a p_k udio uzoraka klase k u promatranom čvoru. Cilj je maksimizirati smanjenje nečistoće nakon podjele.</w:t>
-      </w:r>
-    </w:p>
-    <w:p>
-      <w:pPr>
-        <w:jc w:val="both"/>
-        <w:rPr>
-          <w:sz w:val="24"/>
-          <w:szCs w:val="24"/>
-        </w:rPr>
-      </w:pPr>
-      <w:r>
-        <w:rPr>
-          <w:sz w:val="24"/>
-          <w:szCs w:val="24"/>
-        </w:rPr>
-        <w:t>Slučajne šume rješavaju problem velike varijance pojedinačnih stabala primjenom dvaju koncepata: Bagging (Bootstrap Aggregating) – treniranje stabala na slučajnim podskupovima podataka s ponavljanjem, te slučajnog odabira značajki (Feature Bagging) – razmatranje samo slučajnog podskupa značajki pri svakoj podjeli. Konačna odluka donosi se većinskim glasovanjem svih stabala.</w:t>
-      </w:r>
-    </w:p>
-    <w:p>
-      <w:pPr>
-        <w:jc w:val="both"/>
-        <w:rPr>
-          <w:sz w:val="24"/>
-          <w:szCs w:val="24"/>
-        </w:rPr>
-      </w:pPr>
-      <w:r>
-        <w:rPr>
-          <w:sz w:val="24"/>
-          <w:szCs w:val="24"/>
-        </w:rPr>
+        <w:t xml:space="preserve">Slučajne šume rješavaju problem velike varijance pojedinačnih stabala primjenom dvaju ključnih koncepata: Bagging (Bootstrap Aggregating) – treniranje svakog stabla na slučajnim podskupovima podataka s ponavljanjem (bootstrap uzorci), te slučajnog odabira značajki (Feature Bagging) – razmatranje samo slučajnog podskupa od </w:t>
+      </w:r>
+      <m:oMath>
+        <m:r>
+          <m:t>m≈</m:t>
+        </m:r>
+        <m:rad>
+          <m:radPr>
+            <m:degHide m:val="on"/>
+          </m:radPr>
+          <m:deg/>
+          <m:e>
+            <m:r>
+              <m:t>n</m:t>
+            </m:r>
+          </m:e>
+        </m:rad>
+      </m:oMath>
+      <w:r>
+        <w:t xml:space="preserve"> značajki pri svakom rezanju čvora. Konačna odluka ansambla donosi se većinskim glasovanjem (majority voting) svih stabala za probleme klasifikacije, čime se znatno poboljšava stabilnost i smanjuje prenaučenost.</w:t>
+      </w:r>
+    </w:p>
+    <w:p>
+      <w:pPr/>
+      <w:r>
         <w:t>[PREPORUKA ZA SLIKU 2.3: Umetnuti arhitekturni dijagram Slučajnih šuma (Random Forest). Dijagram treba prikazati originalni skup podataka iz kojeg se granaju višestruki Bootstrap uzorci (Uzorak 1, Uzorak 2... Uzorak N), potom pojedinačna stabla odluke koja generiraju svoje predikcije (Klasa A, Klasa B...), te na kraju korak većinskog glasovanja (Majority Voting) koji daje finalnu klasu.]</w:t>
       </w:r>
     </w:p>
@@ -11596,231 +11568,179 @@
         <w:t>2.2.3. XGBoost (Extreme Gradient Boosting)</w:t>
       </w:r>
     </w:p>
-    <w:p/>
+    <w:p>
+      <w:pPr/>
+      <w:r/>
+      <w:r>
+        <w:t>Za razliku od Slučajnih šuma koje grade stabla neovisno i paralelno, XGBoost koristi princip gradijentnog pojačavanja (gradient boosting) u kojem se stabla grade sekvencijalno [6]. Svako novo stablo odluke uči iz grešaka (reziduala) koje su napravila sva prethodno izgrađena stabla.</w:t>
+        <w:br/>
+        <w:t xml:space="preserve">XGBoost minimizira regulariziranu funkciju cilja u koraku </w:t>
+      </w:r>
+      <m:oMath>
+        <m:r>
+          <m:t>t</m:t>
+        </m:r>
+      </m:oMath>
+      <w:r>
+        <w:t xml:space="preserve">, dodajući član za regularizaciju </w:t>
+      </w:r>
+      <m:oMath>
+        <m:r>
+          <m:t>Ω(f)</m:t>
+        </m:r>
+      </m:oMath>
+      <w:r>
+        <w:t xml:space="preserve"> koji kažnjava složenost novog stabla (broj listova </w:t>
+      </w:r>
+      <m:oMath>
+        <m:r>
+          <m:t>T</m:t>
+        </m:r>
+      </m:oMath>
+      <w:r>
+        <w:t xml:space="preserve"> i pripadajuće težine listova </w:t>
+      </w:r>
+      <m:oMath>
+        <m:sSub>
+          <m:e>
+            <m:r>
+              <m:t>w</m:t>
+            </m:r>
+          </m:e>
+          <m:sub>
+            <m:r>
+              <m:t>j</m:t>
+            </m:r>
+          </m:sub>
+        </m:sSub>
+      </m:oMath>
+      <w:r>
+        <w:t>):</w:t>
+      </w:r>
+    </w:p>
     <w:p>
       <w:pPr>
-        <w:jc w:val="both"/>
-        <w:rPr>
-          <w:sz w:val="24"/>
-          <w:szCs w:val="24"/>
-        </w:rPr>
+        <w:jc w:val="center"/>
       </w:pPr>
-      <w:r>
-        <w:rPr>
-          <w:sz w:val="24"/>
-          <w:szCs w:val="24"/>
-        </w:rPr>
-        <w:t xml:space="preserve">Za </w:t>
-      </w:r>
-      <w:proofErr w:type="spellStart"/>
-      <w:r>
-        <w:rPr>
-          <w:sz w:val="24"/>
-          <w:szCs w:val="24"/>
-        </w:rPr>
-        <w:t>razliku</w:t>
-      </w:r>
-      <w:proofErr w:type="spellEnd"/>
-      <w:r>
-        <w:rPr>
-          <w:sz w:val="24"/>
-          <w:szCs w:val="24"/>
-        </w:rPr>
-        <w:t xml:space="preserve"> od </w:t>
-      </w:r>
-      <w:proofErr w:type="spellStart"/>
-      <w:r>
-        <w:rPr>
-          <w:sz w:val="24"/>
-          <w:szCs w:val="24"/>
-        </w:rPr>
-        <w:t>Slučajnih</w:t>
-      </w:r>
-      <w:proofErr w:type="spellEnd"/>
-      <w:r>
-        <w:rPr>
-          <w:sz w:val="24"/>
-          <w:szCs w:val="24"/>
-        </w:rPr>
-        <w:t xml:space="preserve"> </w:t>
-      </w:r>
-      <w:proofErr w:type="spellStart"/>
-      <w:r>
-        <w:rPr>
-          <w:sz w:val="24"/>
-          <w:szCs w:val="24"/>
-        </w:rPr>
-        <w:t>šuma</w:t>
-      </w:r>
-      <w:proofErr w:type="spellEnd"/>
-      <w:r>
-        <w:rPr>
-          <w:sz w:val="24"/>
-          <w:szCs w:val="24"/>
-        </w:rPr>
-        <w:t>, XGBoost koristi princip gradijentnog pojačavanja (gradient boosting) u kojem se stabla grade sekvencijalno [6]. Svako novo stablo odluke uči iz grešaka (reziduala) koje su napravila sva prethodno izgrađena stabla. XGBoost minimizira regulariziranu funkciju cilja u koraku t, dodajući član za regularizaciju koji kažnjava složenost novog stabla (broj listova T i težine w):</w:t>
-      </w:r>
-      <w:r>
-        <w:rPr>
-          <w:sz w:val="24"/>
-          <w:szCs w:val="24"/>
-        </w:rPr>
+      <w:r/>
+      <m:oMath>
+        <m:r>
+          <m:t>Ω(f)=γT+</m:t>
+        </m:r>
+        <m:f>
+          <m:fPr>
+            <m:type m:val="bar"/>
+          </m:fPr>
+          <m:num>
+            <m:r>
+              <m:t>1</m:t>
+            </m:r>
+          </m:num>
+          <m:den>
+            <m:r>
+              <m:t>2</m:t>
+            </m:r>
+          </m:den>
+        </m:f>
+        <m:r>
+          <m:t>λ</m:t>
+        </m:r>
+        <m:nary>
+          <m:naryPr>
+            <m:chr m:val="∑"/>
+            <m:limLoc m:val="subSup"/>
+            <m:grow m:val="1"/>
+            <m:subHide m:val="off"/>
+            <m:supHide m:val="off"/>
+          </m:naryPr>
+          <m:sub>
+            <m:r>
+              <m:t>j=1</m:t>
+            </m:r>
+          </m:sub>
+          <m:sup>
+            <m:r>
+              <m:t>T</m:t>
+            </m:r>
+          </m:sup>
+          <m:e>
+            <m:sSubSup>
+              <m:e>
+                <m:r>
+                  <m:t>w</m:t>
+                </m:r>
+              </m:e>
+              <m:sub>
+                <m:r>
+                  <m:t>j</m:t>
+                </m:r>
+              </m:sub>
+              <m:sup>
+                <m:r>
+                  <m:t>2</m:t>
+                </m:r>
+              </m:sup>
+            </m:sSubSup>
+          </m:e>
+        </m:nary>
+      </m:oMath>
+    </w:p>
+    <w:p>
+      <w:pPr/>
+      <w:r/>
+      <w:r>
+        <w:t xml:space="preserve">gdje je </w:t>
+      </w:r>
+      <m:oMath>
+        <m:r>
+          <m:t>γ</m:t>
+        </m:r>
+      </m:oMath>
+      <w:r>
+        <w:t xml:space="preserve"> parametar koji kontrolira minimalni gubitak potreban za daljnje rezanje čvora (djeluje kao regularizacija broja listova), a </w:t>
+      </w:r>
+      <m:oMath>
+        <m:r>
+          <m:t>λ</m:t>
+        </m:r>
+      </m:oMath>
+      <w:r>
+        <w:t xml:space="preserve"> je L2 regularizacija na težine listova koja sprječava prevelike amplitude predikcija.</w:t>
         <w:br/>
-        <w:t>Omega(f) = gamma * T + 1/2 * lambda * sum_{j=</w:t>
-      </w:r>
-      <w:proofErr w:type="gramStart"/>
-      <w:r>
-        <w:rPr>
-          <w:sz w:val="24"/>
-          <w:szCs w:val="24"/>
-        </w:rPr>
-        <w:t>1}^</w:t>
-      </w:r>
-      <w:proofErr w:type="gramEnd"/>
-      <w:r>
-        <w:rPr>
-          <w:sz w:val="24"/>
-          <w:szCs w:val="24"/>
-        </w:rPr>
-        <w:t>T w_j^2</w:t>
-      </w:r>
-    </w:p>
-    <w:p>
-      <w:pPr>
-        <w:jc w:val="both"/>
-        <w:rPr>
-          <w:sz w:val="24"/>
-          <w:szCs w:val="24"/>
-        </w:rPr>
-      </w:pPr>
-      <w:r>
-        <w:rPr>
-          <w:sz w:val="24"/>
-          <w:szCs w:val="24"/>
-        </w:rPr>
-        <w:t xml:space="preserve">U financijskim predviđanjima, XGBoost se pokazao kao jedan od najuspješnijih algoritama na tabličnim podacima zbog ugrađenih mehanizama za regularizaciju koja sprječava da model nauči šumove umjesto stvarnih trendova. Ključni hiperparametri su stopa </w:t>
-      </w:r>
-      <w:proofErr w:type="spellStart"/>
-      <w:r>
-        <w:rPr>
-          <w:sz w:val="24"/>
-          <w:szCs w:val="24"/>
-        </w:rPr>
-        <w:t>učenja</w:t>
-      </w:r>
-      <w:proofErr w:type="spellEnd"/>
-      <w:r>
-        <w:rPr>
-          <w:sz w:val="24"/>
-          <w:szCs w:val="24"/>
-        </w:rPr>
-        <w:t xml:space="preserve"> (</w:t>
-      </w:r>
-      <w:proofErr w:type="spellStart"/>
-      <w:r>
-        <w:rPr>
-          <w:sz w:val="24"/>
-          <w:szCs w:val="24"/>
-        </w:rPr>
-        <w:t>learning_rate</w:t>
-      </w:r>
-      <w:proofErr w:type="spellEnd"/>
-      <w:r>
-        <w:rPr>
-          <w:sz w:val="24"/>
-          <w:szCs w:val="24"/>
-        </w:rPr>
-        <w:t xml:space="preserve">) </w:t>
-      </w:r>
-      <w:proofErr w:type="spellStart"/>
-      <w:r>
-        <w:rPr>
-          <w:sz w:val="24"/>
-          <w:szCs w:val="24"/>
-        </w:rPr>
-        <w:t>i</w:t>
-      </w:r>
-      <w:proofErr w:type="spellEnd"/>
-      <w:r>
-        <w:rPr>
-          <w:sz w:val="24"/>
-          <w:szCs w:val="24"/>
-        </w:rPr>
-        <w:t xml:space="preserve"> </w:t>
-      </w:r>
-      <w:proofErr w:type="spellStart"/>
-      <w:r>
-        <w:rPr>
-          <w:sz w:val="24"/>
-          <w:szCs w:val="24"/>
-        </w:rPr>
-        <w:t>maksimalna</w:t>
-      </w:r>
-      <w:proofErr w:type="spellEnd"/>
-      <w:r>
-        <w:rPr>
-          <w:sz w:val="24"/>
-          <w:szCs w:val="24"/>
-        </w:rPr>
-        <w:t xml:space="preserve"> </w:t>
-      </w:r>
-      <w:proofErr w:type="spellStart"/>
-      <w:r>
-        <w:rPr>
-          <w:sz w:val="24"/>
-          <w:szCs w:val="24"/>
-        </w:rPr>
-        <w:t>dubina</w:t>
-      </w:r>
-      <w:proofErr w:type="spellEnd"/>
-      <w:r>
-        <w:rPr>
-          <w:sz w:val="24"/>
-          <w:szCs w:val="24"/>
-        </w:rPr>
-        <w:t xml:space="preserve"> </w:t>
-      </w:r>
-      <w:proofErr w:type="spellStart"/>
-      <w:r>
-        <w:rPr>
-          <w:sz w:val="24"/>
-          <w:szCs w:val="24"/>
-        </w:rPr>
-        <w:t>stabla</w:t>
-      </w:r>
-      <w:proofErr w:type="spellEnd"/>
-      <w:r>
-        <w:rPr>
-          <w:sz w:val="24"/>
-          <w:szCs w:val="24"/>
-        </w:rPr>
-        <w:t xml:space="preserve"> (</w:t>
-      </w:r>
-      <w:proofErr w:type="spellStart"/>
-      <w:r>
-        <w:rPr>
-          <w:sz w:val="24"/>
-          <w:szCs w:val="24"/>
-        </w:rPr>
-        <w:t>max_depth</w:t>
-      </w:r>
-      <w:proofErr w:type="spellEnd"/>
-      <w:r>
-        <w:rPr>
-          <w:sz w:val="24"/>
-          <w:szCs w:val="24"/>
-        </w:rPr>
+        <w:t>U financijskim predviđanjima, XGBoost se pokazao kao jedan od najuspješnijih algoritama na tabličnim podacima zbog ugrađenih mehanizama za regularizaciju, brzog i optimiziranog paralelnog treniranja te mogućnosti rada s nedostajućim vrijednostima. Ključni hiperparametri koji se optimiziraju su stopa učenja (</w:t>
+      </w:r>
+      <m:oMath>
+        <m:r>
+          <m:t>learning_rate</m:t>
+        </m:r>
+      </m:oMath>
+      <w:r>
+        <w:t xml:space="preserve"> ili </w:t>
+      </w:r>
+      <m:oMath>
+        <m:r>
+          <m:t>η</m:t>
+        </m:r>
+      </m:oMath>
+      <w:r>
+        <w:t>), maksimalna dubina stabla (</w:t>
+      </w:r>
+      <m:oMath>
+        <m:r>
+          <m:t>max_depth</m:t>
+        </m:r>
+      </m:oMath>
+      <w:r>
+        <w:t>) i minimalna težina djeteta (</w:t>
+      </w:r>
+      <m:oMath>
+        <m:r>
+          <m:t>min_child_weight</m:t>
+        </m:r>
+      </m:oMath>
+      <w:r>
         <w:t>).</w:t>
       </w:r>
-    </w:p>
-    <w:p>
-      <w:pPr>
-        <w:jc w:val="both"/>
-        <w:rPr>
-          <w:sz w:val="24"/>
-          <w:szCs w:val="24"/>
-        </w:rPr>
-      </w:pPr>
     </w:p>
     <w:p>
       <w:pPr>
@@ -11841,62 +11761,240 @@
       <w:bookmarkEnd w:id="15"/>
     </w:p>
     <w:p>
+      <w:pPr/>
+      <w:r/>
+      <w:r>
+        <w:t>Tradicionalni modeli strojnog učenja tretiraju ulazne podatke statički, ignorirajući vremensku dimenziju. Međutim, kretanje cijena dionica je vremenski ovisan proces u kojem današnje stanje izravno ovisi o trendu i obrascima iz prethodnih dana. Za modeliranje takvih sekvencijalnih podataka koriste se Rekurentne neuronske mreže (RNN) [9].</w:t>
+        <w:br/>
+        <w:t xml:space="preserve">RNN mreža održava skriveno stanje </w:t>
+      </w:r>
+      <m:oMath>
+        <m:sSub>
+          <m:e>
+            <m:r>
+              <m:t>𝐡</m:t>
+            </m:r>
+          </m:e>
+          <m:sub>
+            <m:r>
+              <m:t>t</m:t>
+            </m:r>
+          </m:sub>
+        </m:sSub>
+      </m:oMath>
+      <w:r>
+        <w:t xml:space="preserve"> koje služi kao interna memorija i prenosi informacije iz prošlih vremenskih koraka kroz vrijeme. Skriveno stanje u koraku </w:t>
+      </w:r>
+      <m:oMath>
+        <m:r>
+          <m:t>t</m:t>
+        </m:r>
+      </m:oMath>
+      <w:r>
+        <w:t xml:space="preserve"> računa se kao nelinearna kombinacija prethodnog skrivenog stanja </w:t>
+      </w:r>
+      <m:oMath>
+        <m:sSub>
+          <m:e>
+            <m:r>
+              <m:t>𝐡</m:t>
+            </m:r>
+          </m:e>
+          <m:sub>
+            <m:r>
+              <m:t>t−1</m:t>
+            </m:r>
+          </m:sub>
+        </m:sSub>
+      </m:oMath>
+      <w:r>
+        <w:t xml:space="preserve"> i trenutnog ulaza </w:t>
+      </w:r>
+      <m:oMath>
+        <m:sSub>
+          <m:e>
+            <m:r>
+              <m:t>𝐱</m:t>
+            </m:r>
+          </m:e>
+          <m:sub>
+            <m:r>
+              <m:t>t</m:t>
+            </m:r>
+          </m:sub>
+        </m:sSub>
+      </m:oMath>
+      <w:r>
+        <w:t>:</w:t>
+      </w:r>
+    </w:p>
+    <w:p>
       <w:pPr>
-        <w:jc w:val="both"/>
-        <w:rPr>
-          <w:sz w:val="24"/>
-          <w:szCs w:val="24"/>
-        </w:rPr>
+        <w:jc w:val="center"/>
       </w:pPr>
-      <w:r>
-        <w:rPr>
-          <w:sz w:val="24"/>
-          <w:szCs w:val="24"/>
-        </w:rPr>
-        <w:t>Tradicionalni modeli strojnog učenja tretiraju ulazne podatke statički. Međutim, kretanje cijena dionica je vremenski ovisan proces u kojem današnje stanje izravno ovisi o trendu iz prethodnih dana. Za modeliranje takvih sekvencijalnih podataka koriste se Rekurentne neuronske mreže (RNN) [9]. RNN mreža održava skriveno stanje h_t koje služi kao interna memorija i prenosi informacije iz prošlosti:</w:t>
-      </w:r>
-      <w:r>
-        <w:rPr>
-          <w:sz w:val="24"/>
-          <w:szCs w:val="24"/>
-        </w:rPr>
+      <w:r/>
+      <m:oMath>
+        <m:sSub>
+          <m:e>
+            <m:r>
+              <m:t>𝐡</m:t>
+            </m:r>
+          </m:e>
+          <m:sub>
+            <m:r>
+              <m:t>t</m:t>
+            </m:r>
+          </m:sub>
+        </m:sSub>
+        <m:r>
+          <m:t>=</m:t>
+        </m:r>
+        <m:r>
+          <m:rPr>
+            <m:sty m:val="p"/>
+          </m:rPr>
+          <m:t>tanh</m:t>
+        </m:r>
+        <m:r>
+          <m:t>(</m:t>
+        </m:r>
+        <m:sSub>
+          <m:e>
+            <m:r>
+              <m:t>W</m:t>
+            </m:r>
+          </m:e>
+          <m:sub>
+            <m:r>
+              <m:t>hh</m:t>
+            </m:r>
+          </m:sub>
+        </m:sSub>
+        <m:sSub>
+          <m:e>
+            <m:r>
+              <m:t>𝐡</m:t>
+            </m:r>
+          </m:e>
+          <m:sub>
+            <m:r>
+              <m:t>t−1</m:t>
+            </m:r>
+          </m:sub>
+        </m:sSub>
+        <m:r>
+          <m:t>+</m:t>
+        </m:r>
+        <m:sSub>
+          <m:e>
+            <m:r>
+              <m:t>W</m:t>
+            </m:r>
+          </m:e>
+          <m:sub>
+            <m:r>
+              <m:t>xh</m:t>
+            </m:r>
+          </m:sub>
+        </m:sSub>
+        <m:sSub>
+          <m:e>
+            <m:r>
+              <m:t>𝐱</m:t>
+            </m:r>
+          </m:e>
+          <m:sub>
+            <m:r>
+              <m:t>t</m:t>
+            </m:r>
+          </m:sub>
+        </m:sSub>
+        <m:r>
+          <m:t>+</m:t>
+        </m:r>
+        <m:sSub>
+          <m:e>
+            <m:r>
+              <m:t>𝐛</m:t>
+            </m:r>
+          </m:e>
+          <m:sub>
+            <m:r>
+              <m:t>h</m:t>
+            </m:r>
+          </m:sub>
+        </m:sSub>
+        <m:r>
+          <m:t>)</m:t>
+        </m:r>
+      </m:oMath>
+    </w:p>
+    <w:p>
+      <w:pPr/>
+      <w:r/>
+      <w:r>
+        <w:t xml:space="preserve">gdje su </w:t>
+      </w:r>
+      <m:oMath>
+        <m:sSub>
+          <m:e>
+            <m:r>
+              <m:t>W</m:t>
+            </m:r>
+          </m:e>
+          <m:sub>
+            <m:r>
+              <m:t>hh</m:t>
+            </m:r>
+          </m:sub>
+        </m:sSub>
+      </m:oMath>
+      <w:r>
+        <w:t xml:space="preserve"> i </w:t>
+      </w:r>
+      <m:oMath>
+        <m:sSub>
+          <m:e>
+            <m:r>
+              <m:t>W</m:t>
+            </m:r>
+          </m:e>
+          <m:sub>
+            <m:r>
+              <m:t>xh</m:t>
+            </m:r>
+          </m:sub>
+        </m:sSub>
+      </m:oMath>
+      <w:r>
+        <w:t xml:space="preserve"> matrice težina, a </w:t>
+      </w:r>
+      <m:oMath>
+        <m:sSub>
+          <m:e>
+            <m:r>
+              <m:t>𝐛</m:t>
+            </m:r>
+          </m:e>
+          <m:sub>
+            <m:r>
+              <m:t>h</m:t>
+            </m:r>
+          </m:sub>
+        </m:sSub>
+      </m:oMath>
+      <w:r>
+        <w:t xml:space="preserve"> je vektor odstupanja (bias).</w:t>
         <w:br/>
-        <w:t>h_t = tanh(W_{hh} h_{t-1} + W_{xh} x_t + b_h)</w:t>
-      </w:r>
-    </w:p>
-    <w:p>
-      <w:pPr>
-        <w:jc w:val="both"/>
-        <w:rPr>
-          <w:sz w:val="24"/>
-          <w:szCs w:val="24"/>
-        </w:rPr>
-      </w:pPr>
-      <w:r>
-        <w:rPr>
-          <w:sz w:val="24"/>
-          <w:szCs w:val="24"/>
-        </w:rPr>
-        <w:t>Glavno ograničenje standardnih RNN mreža na dužim sekvencama su problem nestajućeg gradijenta (vanishing gradient), gdje gradijenti eksponencijalno opadaju prema nuli pa mreža zaboravlja informacije s početka sekvence, te problem eksplodirajućeg gradijenta (exploding gradient) koji uzrokuje numeričku nestabilnost.</w:t>
-      </w:r>
-    </w:p>
-    <w:p>
-      <w:pPr>
-        <w:jc w:val="both"/>
-        <w:rPr>
-          <w:sz w:val="24"/>
-          <w:szCs w:val="24"/>
-        </w:rPr>
-      </w:pPr>
-      <w:r>
-        <w:rPr>
-          <w:sz w:val="24"/>
-          <w:szCs w:val="24"/>
-        </w:rPr>
+        <w:t>Glavno ograničenje standardnih RNN mreža na dužim sekvencama su problem nestajućeg gradijenta (vanishing gradient) – gdje gradijenti eksponencijalno opadaju prema nuli pa mreža zaboravlja informacije s početka sekvence, te problem eksplodirajućeg gradijenta (exploding gradient) koji uzrokuje numeričku nestabilnost. Ovi problemi otežavaju obuku standardnih RNN mreža na dugim financijskim nizovima.</w:t>
+      </w:r>
+    </w:p>
+    <w:p>
+      <w:pPr/>
+      <w:r>
         <w:t>[PREPORUKA ZA SLIKU 2.4: Dijagram koji prikazuje vremensko odmotavanje (unfolding) standardne RNN mreže. Lijeva strana prikazuje komprimiranu petlju ćelije, a desna strana prikazuje vremensku ekspanziju za korake t-1, t i t+1, ilustrirajući kako ulaz x_t i skriveno stanje h_t-1 zajednički formiraju novo skriveno stanje h_t.]</w:t>
       </w:r>
     </w:p>
-    <w:p/>
     <w:p>
       <w:pPr>
         <w:pStyle w:val="Naslov3"/>

</xml_diff>